<commit_message>
The first commit of WaterChat version 26.
</commit_message>
<xml_diff>
--- a/asset/doc/waterchat_product_introduction_cn.docx
+++ b/asset/doc/waterchat_product_introduction_cn.docx
@@ -1,6 +1,6 @@
 
 <file path=word/document.xml><?xml version="1.0" encoding="utf-8"?>
-<w:document xmlns:o="urn:schemas-microsoft-com:office:office" xmlns:r="http://schemas.openxmlformats.org/officeDocument/2006/relationships" xmlns:v="urn:schemas-microsoft-com:vml" xmlns:w="http://schemas.openxmlformats.org/wordprocessingml/2006/main" xmlns:w10="urn:schemas-microsoft-com:office:word" xmlns:wp="http://schemas.openxmlformats.org/drawingml/2006/wordprocessingDrawing" xmlns:wps="http://schemas.microsoft.com/office/word/2010/wordprocessingShape" xmlns:wpg="http://schemas.microsoft.com/office/word/2010/wordprocessingGroup" xmlns:mc="http://schemas.openxmlformats.org/markup-compatibility/2006" xmlns:wp14="http://schemas.microsoft.com/office/word/2010/wordprocessingDrawing" xmlns:w14="http://schemas.microsoft.com/office/word/2010/wordml" mc:Ignorable="w14 wp14">
+<w:document xmlns:o="urn:schemas-microsoft-com:office:office" xmlns:r="http://schemas.openxmlformats.org/officeDocument/2006/relationships" xmlns:v="urn:schemas-microsoft-com:vml" xmlns:w="http://schemas.openxmlformats.org/wordprocessingml/2006/main" xmlns:w10="urn:schemas-microsoft-com:office:word" xmlns:wp="http://schemas.openxmlformats.org/drawingml/2006/wordprocessingDrawing" xmlns:wps="http://schemas.microsoft.com/office/word/2010/wordprocessingShape" xmlns:wpg="http://schemas.microsoft.com/office/word/2010/wordprocessingGroup" xmlns:mc="http://schemas.openxmlformats.org/markup-compatibility/2006" xmlns:wp14="http://schemas.microsoft.com/office/word/2010/wordprocessingDrawing" xmlns:w14="http://schemas.microsoft.com/office/word/2010/wordml" xmlns:w15="http://schemas.microsoft.com/office/word/2012/wordml" mc:Ignorable="w14 wp14 w15">
   <w:body>
     <w:p>
       <w:pPr>
@@ -9,21 +9,21 @@
         <w:spacing w:lineRule="auto" w:line="240" w:before="340" w:after="330"/>
         <w:jc w:val="center"/>
         <w:rPr>
-          <w:rFonts w:ascii="Times New Roman" w:hAnsi="Times New Roman" w:eastAsia="Times New Roman"/>
-        </w:rPr>
-      </w:pPr>
-      <w:r>
-        <w:rPr>
-          <w:rFonts w:eastAsia="Times New Roman" w:cs="等线" w:ascii="Times New Roman" w:hAnsi="Times New Roman"/>
+          <w:rFonts w:ascii="Noto Sans" w:hAnsi="Noto Sans" w:eastAsia="Noto Sans"/>
+        </w:rPr>
+      </w:pPr>
+      <w:r>
+        <w:rPr>
+          <w:rFonts w:eastAsia="Noto Sans" w:cs="等线" w:ascii="Noto Sans" w:hAnsi="Noto Sans"/>
           <w:sz w:val="32"/>
           <w:szCs w:val="32"/>
           <w:lang w:val="en-US" w:eastAsia="zh-CN"/>
         </w:rPr>
-        <w:t xml:space="preserve">Water chat </w:t>
-      </w:r>
-      <w:r>
-        <w:rPr>
-          <w:rFonts w:ascii="Times New Roman" w:hAnsi="Times New Roman" w:cs="等线" w:eastAsia="Times New Roman"/>
+        <w:t xml:space="preserve">WaterChat </w:t>
+      </w:r>
+      <w:r>
+        <w:rPr>
+          <w:rFonts w:ascii="Noto Sans" w:hAnsi="Noto Sans" w:cs="等线" w:eastAsia="Noto Sans"/>
           <w:sz w:val="32"/>
           <w:szCs w:val="32"/>
           <w:lang w:val="en-US" w:eastAsia="zh-CN"/>
@@ -40,14 +40,14 @@
         </w:numPr>
         <w:bidi w:val="0"/>
         <w:spacing w:lineRule="auto" w:line="240"/>
-        <w:ind w:left="0" w:hanging="0"/>
-        <w:rPr>
-          <w:rFonts w:ascii="Times New Roman" w:hAnsi="Times New Roman" w:eastAsia="Times New Roman"/>
-        </w:rPr>
-      </w:pPr>
-      <w:r>
-        <w:rPr>
-          <w:rFonts w:ascii="Times New Roman" w:hAnsi="Times New Roman" w:cs="等线" w:eastAsia="Times New Roman"/>
+        <w:ind w:hanging="0" w:left="0"/>
+        <w:rPr>
+          <w:rFonts w:ascii="Noto Sans" w:hAnsi="Noto Sans" w:eastAsia="Noto Sans"/>
+        </w:rPr>
+      </w:pPr>
+      <w:r>
+        <w:rPr>
+          <w:rFonts w:ascii="Noto Sans" w:hAnsi="Noto Sans" w:cs="等线" w:eastAsia="Noto Sans"/>
           <w:sz w:val="21"/>
           <w:szCs w:val="21"/>
           <w:lang w:val="en-US" w:eastAsia="zh-CN"/>
@@ -64,26 +64,34 @@
         </w:numPr>
         <w:bidi w:val="0"/>
         <w:spacing w:lineRule="auto" w:line="240"/>
-        <w:ind w:left="0" w:hanging="0"/>
-        <w:rPr>
-          <w:rFonts w:ascii="Times New Roman" w:hAnsi="Times New Roman" w:eastAsia="Times New Roman"/>
-        </w:rPr>
-      </w:pPr>
-      <w:r>
-        <w:rPr>
-          <w:rFonts w:ascii="Times New Roman" w:hAnsi="Times New Roman" w:eastAsia="Times New Roman"/>
+        <w:ind w:hanging="0" w:left="0"/>
+        <w:rPr>
+          <w:rFonts w:ascii="Noto Sans" w:hAnsi="Noto Sans" w:eastAsia="Noto Sans"/>
+          <w:b/>
+          <w:bCs/>
+        </w:rPr>
+      </w:pPr>
+      <w:r>
+        <w:rPr>
+          <w:rFonts w:ascii="Noto Sans" w:hAnsi="Noto Sans" w:eastAsia="Noto Sans"/>
+          <w:b/>
+          <w:bCs/>
         </w:rPr>
         <w:t xml:space="preserve">每一个人都可以简单地使用 </w:t>
       </w:r>
       <w:r>
         <w:rPr>
-          <w:rFonts w:eastAsia="Times New Roman" w:ascii="Times New Roman" w:hAnsi="Times New Roman"/>
+          <w:rFonts w:eastAsia="Noto Sans" w:ascii="Noto Sans" w:hAnsi="Noto Sans"/>
+          <w:b/>
+          <w:bCs/>
         </w:rPr>
         <w:t xml:space="preserve">AI </w:t>
       </w:r>
       <w:r>
         <w:rPr>
-          <w:rFonts w:ascii="Times New Roman" w:hAnsi="Times New Roman" w:eastAsia="Times New Roman"/>
+          <w:rFonts w:ascii="Noto Sans" w:hAnsi="Noto Sans" w:eastAsia="Noto Sans"/>
+          <w:b/>
+          <w:bCs/>
         </w:rPr>
         <w:t>大模型。</w:t>
       </w:r>
@@ -97,14 +105,14 @@
         </w:numPr>
         <w:bidi w:val="0"/>
         <w:spacing w:lineRule="auto" w:line="240"/>
-        <w:ind w:left="0" w:hanging="0"/>
-        <w:rPr>
-          <w:rFonts w:ascii="Times New Roman" w:hAnsi="Times New Roman" w:eastAsia="Times New Roman"/>
-        </w:rPr>
-      </w:pPr>
-      <w:r>
-        <w:rPr>
-          <w:rFonts w:eastAsia="Times New Roman" w:ascii="Times New Roman" w:hAnsi="Times New Roman"/>
+        <w:ind w:hanging="0" w:left="0"/>
+        <w:rPr>
+          <w:rFonts w:ascii="Noto Sans" w:hAnsi="Noto Sans" w:eastAsia="Noto Sans"/>
+        </w:rPr>
+      </w:pPr>
+      <w:r>
+        <w:rPr>
+          <w:rFonts w:eastAsia="Noto Sans" w:ascii="Noto Sans" w:hAnsi="Noto Sans"/>
         </w:rPr>
       </w:r>
     </w:p>
@@ -117,14 +125,14 @@
         </w:numPr>
         <w:bidi w:val="0"/>
         <w:spacing w:lineRule="auto" w:line="240"/>
-        <w:ind w:left="0" w:hanging="0"/>
-        <w:rPr>
-          <w:rFonts w:ascii="Times New Roman" w:hAnsi="Times New Roman" w:eastAsia="Times New Roman"/>
-        </w:rPr>
-      </w:pPr>
-      <w:r>
-        <w:rPr>
-          <w:rFonts w:ascii="Times New Roman" w:hAnsi="Times New Roman" w:cs="等线" w:eastAsia="Times New Roman"/>
+        <w:ind w:hanging="0" w:left="0"/>
+        <w:rPr>
+          <w:rFonts w:ascii="Noto Sans" w:hAnsi="Noto Sans" w:eastAsia="Noto Sans"/>
+        </w:rPr>
+      </w:pPr>
+      <w:r>
+        <w:rPr>
+          <w:rFonts w:ascii="Noto Sans" w:hAnsi="Noto Sans" w:cs="等线" w:eastAsia="Noto Sans"/>
           <w:b/>
           <w:bCs/>
           <w:sz w:val="21"/>
@@ -141,14 +149,12 @@
         <w:spacing w:lineRule="auto" w:line="240"/>
         <w:jc w:val="both"/>
         <w:rPr>
-          <w:rFonts w:ascii="Times New Roman" w:hAnsi="Times New Roman" w:eastAsia="Times New Roman"/>
-          <w:sz w:val="20"/>
-          <w:szCs w:val="20"/>
-        </w:rPr>
-      </w:pPr>
-      <w:r>
-        <w:rPr>
-          <w:rFonts w:eastAsia="Times New Roman" w:cs="等线" w:ascii="Times New Roman" w:hAnsi="Times New Roman"/>
+          <w:rFonts w:ascii="Noto Sans" w:hAnsi="Noto Sans" w:eastAsia="Noto Sans"/>
+        </w:rPr>
+      </w:pPr>
+      <w:r>
+        <w:rPr>
+          <w:rFonts w:eastAsia="Noto Sans" w:cs="等线" w:ascii="Noto Sans" w:hAnsi="Noto Sans"/>
           <w:sz w:val="20"/>
           <w:szCs w:val="20"/>
           <w:lang w:val="en-US" w:eastAsia="zh-CN"/>
@@ -157,7 +163,7 @@
       </w:r>
       <w:r>
         <w:rPr>
-          <w:rFonts w:ascii="Times New Roman" w:hAnsi="Times New Roman" w:cs="等线" w:eastAsia="Times New Roman"/>
+          <w:rFonts w:ascii="Noto Sans" w:hAnsi="Noto Sans" w:cs="等线" w:eastAsia="Noto Sans"/>
           <w:sz w:val="20"/>
           <w:szCs w:val="20"/>
           <w:lang w:val="en-US" w:eastAsia="zh-CN"/>
@@ -172,14 +178,12 @@
         <w:spacing w:lineRule="auto" w:line="240"/>
         <w:jc w:val="both"/>
         <w:rPr>
-          <w:rFonts w:ascii="Times New Roman" w:hAnsi="Times New Roman" w:eastAsia="Times New Roman"/>
-          <w:sz w:val="20"/>
-          <w:szCs w:val="20"/>
-        </w:rPr>
-      </w:pPr>
-      <w:r>
-        <w:rPr>
-          <w:rFonts w:eastAsia="Times New Roman" w:cs="等线" w:ascii="Times New Roman" w:hAnsi="Times New Roman"/>
+          <w:rFonts w:ascii="Noto Sans" w:hAnsi="Noto Sans" w:eastAsia="Noto Sans"/>
+        </w:rPr>
+      </w:pPr>
+      <w:r>
+        <w:rPr>
+          <w:rFonts w:eastAsia="Noto Sans" w:cs="等线" w:ascii="Noto Sans" w:hAnsi="Noto Sans"/>
           <w:sz w:val="20"/>
           <w:szCs w:val="20"/>
           <w:lang w:val="en-US" w:eastAsia="zh-CN"/>
@@ -188,7 +192,7 @@
       </w:r>
       <w:r>
         <w:rPr>
-          <w:rFonts w:ascii="Times New Roman" w:hAnsi="Times New Roman" w:cs="等线" w:eastAsia="Times New Roman"/>
+          <w:rFonts w:ascii="Noto Sans" w:hAnsi="Noto Sans" w:cs="等线" w:eastAsia="Noto Sans"/>
           <w:sz w:val="20"/>
           <w:szCs w:val="20"/>
           <w:lang w:val="en-US" w:eastAsia="zh-CN"/>
@@ -197,7 +201,7 @@
       </w:r>
       <w:r>
         <w:rPr>
-          <w:rFonts w:eastAsia="Times New Roman" w:cs="等线" w:ascii="Times New Roman" w:hAnsi="Times New Roman"/>
+          <w:rFonts w:eastAsia="Noto Sans" w:cs="等线" w:ascii="Noto Sans" w:hAnsi="Noto Sans"/>
           <w:sz w:val="20"/>
           <w:szCs w:val="20"/>
           <w:lang w:val="en-US" w:eastAsia="zh-CN"/>
@@ -206,7 +210,7 @@
       </w:r>
       <w:r>
         <w:rPr>
-          <w:rFonts w:ascii="Times New Roman" w:hAnsi="Times New Roman" w:cs="等线" w:eastAsia="Times New Roman"/>
+          <w:rFonts w:ascii="Noto Sans" w:hAnsi="Noto Sans" w:cs="等线" w:eastAsia="Noto Sans"/>
           <w:sz w:val="20"/>
           <w:szCs w:val="20"/>
           <w:lang w:val="en-US" w:eastAsia="zh-CN"/>
@@ -221,14 +225,12 @@
         <w:spacing w:lineRule="auto" w:line="240"/>
         <w:jc w:val="both"/>
         <w:rPr>
-          <w:rFonts w:ascii="Times New Roman" w:hAnsi="Times New Roman" w:eastAsia="Times New Roman"/>
-          <w:sz w:val="20"/>
-          <w:szCs w:val="20"/>
-        </w:rPr>
-      </w:pPr>
-      <w:r>
-        <w:rPr>
-          <w:rFonts w:eastAsia="Times New Roman" w:cs="等线" w:ascii="Times New Roman" w:hAnsi="Times New Roman"/>
+          <w:rFonts w:ascii="Noto Sans" w:hAnsi="Noto Sans" w:eastAsia="Noto Sans"/>
+        </w:rPr>
+      </w:pPr>
+      <w:r>
+        <w:rPr>
+          <w:rFonts w:eastAsia="Noto Sans" w:cs="等线" w:ascii="Noto Sans" w:hAnsi="Noto Sans"/>
           <w:sz w:val="20"/>
           <w:szCs w:val="20"/>
           <w:lang w:val="en-US" w:eastAsia="zh-CN"/>
@@ -237,7 +239,7 @@
       </w:r>
       <w:r>
         <w:rPr>
-          <w:rFonts w:ascii="Times New Roman" w:hAnsi="Times New Roman" w:cs="等线" w:eastAsia="Times New Roman"/>
+          <w:rFonts w:ascii="Noto Sans" w:hAnsi="Noto Sans" w:cs="等线" w:eastAsia="Noto Sans"/>
           <w:sz w:val="20"/>
           <w:szCs w:val="20"/>
           <w:lang w:val="en-US" w:eastAsia="zh-CN"/>
@@ -252,14 +254,12 @@
         <w:spacing w:lineRule="auto" w:line="240"/>
         <w:jc w:val="both"/>
         <w:rPr>
-          <w:rFonts w:ascii="Times New Roman" w:hAnsi="Times New Roman" w:eastAsia="Times New Roman"/>
-          <w:sz w:val="20"/>
-          <w:szCs w:val="20"/>
-        </w:rPr>
-      </w:pPr>
-      <w:r>
-        <w:rPr>
-          <w:rFonts w:eastAsia="Times New Roman" w:cs="等线" w:ascii="Times New Roman" w:hAnsi="Times New Roman"/>
+          <w:rFonts w:ascii="Noto Sans" w:hAnsi="Noto Sans" w:eastAsia="Noto Sans"/>
+        </w:rPr>
+      </w:pPr>
+      <w:r>
+        <w:rPr>
+          <w:rFonts w:eastAsia="Noto Sans" w:cs="等线" w:ascii="Noto Sans" w:hAnsi="Noto Sans"/>
           <w:sz w:val="20"/>
           <w:szCs w:val="20"/>
           <w:lang w:val="en-US" w:eastAsia="zh-CN"/>
@@ -268,7 +268,7 @@
       </w:r>
       <w:r>
         <w:rPr>
-          <w:rFonts w:ascii="Times New Roman" w:hAnsi="Times New Roman" w:cs="等线" w:eastAsia="Times New Roman"/>
+          <w:rFonts w:ascii="Noto Sans" w:hAnsi="Noto Sans" w:cs="等线" w:eastAsia="Noto Sans"/>
           <w:sz w:val="20"/>
           <w:szCs w:val="20"/>
           <w:lang w:val="en-US" w:eastAsia="zh-CN"/>
@@ -277,7 +277,7 @@
       </w:r>
       <w:r>
         <w:rPr>
-          <w:rFonts w:eastAsia="Times New Roman" w:cs="等线" w:ascii="Times New Roman" w:hAnsi="Times New Roman"/>
+          <w:rFonts w:eastAsia="Noto Sans" w:cs="等线" w:ascii="Noto Sans" w:hAnsi="Noto Sans"/>
           <w:sz w:val="20"/>
           <w:szCs w:val="20"/>
           <w:lang w:val="en-US" w:eastAsia="zh-CN"/>
@@ -286,7 +286,7 @@
       </w:r>
       <w:r>
         <w:rPr>
-          <w:rFonts w:ascii="Times New Roman" w:hAnsi="Times New Roman" w:cs="等线" w:eastAsia="Times New Roman"/>
+          <w:rFonts w:ascii="Noto Sans" w:hAnsi="Noto Sans" w:cs="等线" w:eastAsia="Noto Sans"/>
           <w:sz w:val="20"/>
           <w:szCs w:val="20"/>
           <w:lang w:val="en-US" w:eastAsia="zh-CN"/>
@@ -295,7 +295,7 @@
       </w:r>
       <w:r>
         <w:rPr>
-          <w:rFonts w:eastAsia="Times New Roman" w:cs="等线" w:ascii="Times New Roman" w:hAnsi="Times New Roman"/>
+          <w:rFonts w:eastAsia="Noto Sans" w:cs="等线" w:ascii="Noto Sans" w:hAnsi="Noto Sans"/>
           <w:sz w:val="20"/>
           <w:szCs w:val="20"/>
           <w:lang w:val="en-US" w:eastAsia="zh-CN"/>
@@ -304,7 +304,7 @@
       </w:r>
       <w:r>
         <w:rPr>
-          <w:rFonts w:ascii="Times New Roman" w:hAnsi="Times New Roman" w:cs="等线" w:eastAsia="Times New Roman"/>
+          <w:rFonts w:ascii="Noto Sans" w:hAnsi="Noto Sans" w:cs="等线" w:eastAsia="Noto Sans"/>
           <w:sz w:val="20"/>
           <w:szCs w:val="20"/>
           <w:lang w:val="en-US" w:eastAsia="zh-CN"/>
@@ -321,10 +321,10 @@
           <w:numId w:val="0"/>
         </w:numPr>
         <w:spacing w:lineRule="auto" w:line="240"/>
-        <w:ind w:left="0" w:hanging="0"/>
+        <w:ind w:hanging="0" w:left="0"/>
         <w:jc w:val="both"/>
         <w:rPr>
-          <w:rFonts w:ascii="Times New Roman" w:hAnsi="Times New Roman" w:eastAsia="Times New Roman" w:cs="等线"/>
+          <w:rFonts w:ascii="Noto Sans" w:hAnsi="Noto Sans" w:eastAsia="Noto Sans" w:cs="等线"/>
           <w:sz w:val="18"/>
           <w:szCs w:val="18"/>
           <w:lang w:val="en-US" w:eastAsia="zh-CN"/>
@@ -332,7 +332,7 @@
       </w:pPr>
       <w:r>
         <w:rPr>
-          <w:rFonts w:eastAsia="Times New Roman" w:cs="等线" w:ascii="Times New Roman" w:hAnsi="Times New Roman"/>
+          <w:rFonts w:eastAsia="Noto Sans" w:cs="等线" w:ascii="Noto Sans" w:hAnsi="Noto Sans"/>
           <w:sz w:val="18"/>
           <w:szCs w:val="18"/>
           <w:lang w:val="en-US" w:eastAsia="zh-CN"/>
@@ -348,16 +348,17 @@
         </w:numPr>
         <w:bidi w:val="0"/>
         <w:spacing w:lineRule="auto" w:line="240"/>
-        <w:ind w:left="0" w:hanging="0"/>
-        <w:rPr>
-          <w:rFonts w:ascii="Times New Roman" w:hAnsi="Times New Roman" w:eastAsia="Times New Roman"/>
-        </w:rPr>
-      </w:pPr>
-      <w:r>
-        <w:rPr>
-          <w:rFonts w:ascii="Times New Roman" w:hAnsi="Times New Roman" w:cs="等线" w:eastAsia="Times New Roman"/>
+        <w:ind w:hanging="0" w:left="0"/>
+        <w:rPr>
+          <w:rFonts w:ascii="Noto Sans" w:hAnsi="Noto Sans" w:eastAsia="Noto Sans"/>
+        </w:rPr>
+      </w:pPr>
+      <w:r>
+        <w:rPr>
+          <w:rFonts w:ascii="Noto Sans" w:hAnsi="Noto Sans" w:cs="等线" w:eastAsia="Noto Sans"/>
           <w:b/>
           <w:bCs/>
+          <w:color w:val="C9211E"/>
           <w:sz w:val="21"/>
           <w:szCs w:val="21"/>
           <w:lang w:val="en-US" w:eastAsia="zh-CN"/>
@@ -366,9 +367,10 @@
       </w:r>
       <w:r>
         <w:rPr>
-          <w:rFonts w:eastAsia="Times New Roman" w:cs="等线" w:ascii="Times New Roman" w:hAnsi="Times New Roman"/>
+          <w:rFonts w:eastAsia="Noto Sans" w:cs="等线" w:ascii="Noto Sans" w:hAnsi="Noto Sans"/>
           <w:b/>
           <w:bCs/>
+          <w:color w:val="C9211E"/>
           <w:sz w:val="21"/>
           <w:szCs w:val="21"/>
           <w:lang w:val="en-US" w:eastAsia="zh-CN"/>
@@ -377,9 +379,10 @@
       </w:r>
       <w:r>
         <w:rPr>
-          <w:rFonts w:ascii="Times New Roman" w:hAnsi="Times New Roman" w:cs="等线" w:eastAsia="Times New Roman"/>
+          <w:rFonts w:ascii="Noto Sans" w:hAnsi="Noto Sans" w:cs="等线" w:eastAsia="Noto Sans"/>
           <w:b/>
           <w:bCs/>
+          <w:color w:val="C9211E"/>
           <w:sz w:val="21"/>
           <w:szCs w:val="21"/>
           <w:lang w:val="en-US" w:eastAsia="zh-CN"/>
@@ -396,17 +399,15 @@
           <w:numId w:val="0"/>
         </w:numPr>
         <w:spacing w:lineRule="auto" w:line="240"/>
-        <w:ind w:left="0" w:hanging="0"/>
+        <w:ind w:hanging="0" w:left="0"/>
         <w:jc w:val="both"/>
         <w:rPr>
-          <w:rFonts w:ascii="Times New Roman" w:hAnsi="Times New Roman" w:eastAsia="Times New Roman"/>
-          <w:sz w:val="20"/>
-          <w:szCs w:val="20"/>
-        </w:rPr>
-      </w:pPr>
-      <w:r>
-        <w:rPr>
-          <w:rFonts w:eastAsia="Times New Roman" w:cs="等线" w:ascii="Times New Roman" w:hAnsi="Times New Roman"/>
+          <w:rFonts w:ascii="Noto Sans" w:hAnsi="Noto Sans" w:eastAsia="Noto Sans"/>
+        </w:rPr>
+      </w:pPr>
+      <w:r>
+        <w:rPr>
+          <w:rFonts w:eastAsia="Noto Sans" w:cs="等线" w:ascii="Noto Sans" w:hAnsi="Noto Sans"/>
           <w:sz w:val="20"/>
           <w:szCs w:val="20"/>
           <w:lang w:val="en-US" w:eastAsia="zh-CN"/>
@@ -415,30 +416,76 @@
       </w:r>
       <w:r>
         <w:rPr>
-          <w:rFonts w:ascii="Times New Roman" w:hAnsi="Times New Roman" w:cs="等线" w:eastAsia="Times New Roman"/>
-          <w:sz w:val="20"/>
-          <w:szCs w:val="20"/>
-          <w:lang w:val="en-US" w:eastAsia="zh-CN"/>
-        </w:rPr>
-        <w:t>本应用应当都能够支持</w:t>
-      </w:r>
-      <w:r>
-        <w:rPr>
-          <w:rFonts w:eastAsia="Times New Roman" w:cs="等线" w:ascii="Times New Roman" w:hAnsi="Times New Roman"/>
-          <w:sz w:val="20"/>
-          <w:szCs w:val="20"/>
-          <w:lang w:val="en-US" w:eastAsia="zh-CN"/>
-        </w:rPr>
-        <w:t>Qwen2</w:t>
-      </w:r>
-      <w:r>
-        <w:rPr>
-          <w:rFonts w:ascii="Times New Roman" w:hAnsi="Times New Roman" w:cs="等线" w:eastAsia="Times New Roman"/>
-          <w:sz w:val="20"/>
-          <w:szCs w:val="20"/>
-          <w:lang w:val="en-US" w:eastAsia="zh-CN"/>
-        </w:rPr>
-        <w:t>（通义千问）的模型。</w:t>
+          <w:rFonts w:ascii="Noto Sans" w:hAnsi="Noto Sans" w:cs="等线" w:eastAsia="Noto Sans"/>
+          <w:sz w:val="20"/>
+          <w:szCs w:val="20"/>
+          <w:lang w:val="en-US" w:eastAsia="zh-CN"/>
+        </w:rPr>
+        <w:t xml:space="preserve">本应用应当都能够支持阿里巴巴通义千问 </w:t>
+      </w:r>
+      <w:r>
+        <w:rPr>
+          <w:rFonts w:eastAsia="Noto Sans" w:cs="等线" w:ascii="Noto Sans" w:hAnsi="Noto Sans"/>
+          <w:sz w:val="20"/>
+          <w:szCs w:val="20"/>
+          <w:lang w:val="en-US" w:eastAsia="zh-CN"/>
+        </w:rPr>
+        <w:t>Qwen</w:t>
+      </w:r>
+      <w:r>
+        <w:rPr>
+          <w:rFonts w:eastAsia="Noto Sans" w:cs="等线" w:ascii="Noto Sans" w:hAnsi="Noto Sans"/>
+          <w:sz w:val="20"/>
+          <w:szCs w:val="20"/>
+          <w:lang w:val="en-US" w:eastAsia="zh-CN"/>
+        </w:rPr>
+        <w:t xml:space="preserve">3 </w:t>
+      </w:r>
+      <w:r>
+        <w:rPr>
+          <w:rFonts w:eastAsia="Noto Sans" w:cs="等线" w:ascii="Noto Sans" w:hAnsi="Noto Sans"/>
+          <w:color w:val="C9211E"/>
+          <w:sz w:val="20"/>
+          <w:szCs w:val="20"/>
+          <w:lang w:val="en-US" w:eastAsia="zh-CN"/>
+        </w:rPr>
+        <w:t>GGUF</w:t>
+      </w:r>
+      <w:r>
+        <w:rPr>
+          <w:rFonts w:ascii="Noto Sans" w:hAnsi="Noto Sans" w:cs="等线" w:eastAsia="Noto Sans"/>
+          <w:sz w:val="20"/>
+          <w:szCs w:val="20"/>
+          <w:lang w:val="en-US" w:eastAsia="zh-CN"/>
+        </w:rPr>
+        <w:t>类型</w:t>
+      </w:r>
+      <w:r>
+        <w:rPr>
+          <w:rFonts w:ascii="Noto Sans" w:hAnsi="Noto Sans" w:cs="等线" w:eastAsia="Noto Sans"/>
+          <w:sz w:val="20"/>
+          <w:szCs w:val="20"/>
+          <w:lang w:val="en-US" w:eastAsia="zh-CN"/>
+        </w:rPr>
+        <w:t>的</w:t>
+      </w:r>
+      <w:r>
+        <w:rPr>
+          <w:rFonts w:eastAsia="Noto Sans" w:cs="等线" w:ascii="Noto Sans" w:hAnsi="Noto Sans"/>
+          <w:sz w:val="20"/>
+          <w:szCs w:val="20"/>
+          <w:lang w:val="en-US" w:eastAsia="zh-CN"/>
+        </w:rPr>
+        <w:t>AI</w:t>
+      </w:r>
+      <w:r>
+        <w:rPr>
+          <w:rFonts w:ascii="Noto Sans" w:hAnsi="Noto Sans" w:cs="等线" w:eastAsia="Noto Sans"/>
+          <w:sz w:val="20"/>
+          <w:szCs w:val="20"/>
+          <w:lang w:val="en-US" w:eastAsia="zh-CN"/>
+        </w:rPr>
+        <w:t>文本对话大模型。</w:t>
       </w:r>
     </w:p>
     <w:p>
@@ -450,17 +497,15 @@
           <w:numId w:val="0"/>
         </w:numPr>
         <w:spacing w:lineRule="auto" w:line="240"/>
-        <w:ind w:left="0" w:hanging="0"/>
+        <w:ind w:hanging="0" w:left="0"/>
         <w:jc w:val="both"/>
         <w:rPr>
-          <w:rFonts w:ascii="Times New Roman" w:hAnsi="Times New Roman" w:eastAsia="Times New Roman"/>
-          <w:sz w:val="20"/>
-          <w:szCs w:val="20"/>
-        </w:rPr>
-      </w:pPr>
-      <w:r>
-        <w:rPr>
-          <w:rFonts w:eastAsia="Times New Roman" w:cs="等线" w:ascii="Times New Roman" w:hAnsi="Times New Roman"/>
+          <w:rFonts w:ascii="Noto Sans" w:hAnsi="Noto Sans" w:eastAsia="Noto Sans"/>
+        </w:rPr>
+      </w:pPr>
+      <w:r>
+        <w:rPr>
+          <w:rFonts w:eastAsia="Noto Sans" w:cs="等线" w:ascii="Noto Sans" w:hAnsi="Noto Sans"/>
           <w:sz w:val="20"/>
           <w:szCs w:val="20"/>
           <w:lang w:val="en-US" w:eastAsia="zh-CN"/>
@@ -469,7 +514,7 @@
       </w:r>
       <w:r>
         <w:rPr>
-          <w:rFonts w:ascii="Times New Roman" w:hAnsi="Times New Roman" w:cs="等线" w:eastAsia="Times New Roman"/>
+          <w:rFonts w:ascii="Noto Sans" w:hAnsi="Noto Sans" w:cs="等线" w:eastAsia="Noto Sans"/>
           <w:sz w:val="20"/>
           <w:szCs w:val="20"/>
           <w:lang w:val="en-US" w:eastAsia="zh-CN"/>
@@ -486,17 +531,15 @@
           <w:numId w:val="1"/>
         </w:numPr>
         <w:spacing w:lineRule="auto" w:line="240"/>
-        <w:ind w:left="0" w:hanging="0"/>
+        <w:ind w:hanging="0" w:left="0"/>
         <w:jc w:val="both"/>
         <w:rPr>
-          <w:rFonts w:ascii="Times New Roman" w:hAnsi="Times New Roman" w:eastAsia="Times New Roman"/>
-          <w:sz w:val="20"/>
-          <w:szCs w:val="20"/>
-        </w:rPr>
-      </w:pPr>
-      <w:r>
-        <w:rPr>
-          <w:rFonts w:eastAsia="Times New Roman" w:cs="等线" w:ascii="Times New Roman" w:hAnsi="Times New Roman"/>
+          <w:rFonts w:ascii="Noto Sans" w:hAnsi="Noto Sans" w:eastAsia="Noto Sans"/>
+        </w:rPr>
+      </w:pPr>
+      <w:r>
+        <w:rPr>
+          <w:rFonts w:eastAsia="Noto Sans" w:cs="等线" w:ascii="Noto Sans" w:hAnsi="Noto Sans"/>
           <w:sz w:val="20"/>
           <w:szCs w:val="20"/>
           <w:lang w:val="en-US" w:eastAsia="zh-CN"/>
@@ -505,7 +548,7 @@
       </w:r>
       <w:r>
         <w:rPr>
-          <w:rFonts w:ascii="Times New Roman" w:hAnsi="Times New Roman" w:cs="等线" w:eastAsia="Times New Roman"/>
+          <w:rFonts w:ascii="Noto Sans" w:hAnsi="Noto Sans" w:cs="等线" w:eastAsia="Noto Sans"/>
           <w:sz w:val="20"/>
           <w:szCs w:val="20"/>
           <w:lang w:val="en-US" w:eastAsia="zh-CN"/>
@@ -514,16 +557,45 @@
       </w:r>
       <w:r>
         <w:rPr>
-          <w:rFonts w:eastAsia="Times New Roman" w:cs="等线" w:ascii="Times New Roman" w:hAnsi="Times New Roman"/>
-          <w:sz w:val="20"/>
-          <w:szCs w:val="20"/>
-          <w:lang w:val="en-US" w:eastAsia="zh-CN"/>
-        </w:rPr>
-        <w:t>Qwen2</w:t>
-      </w:r>
-      <w:r>
-        <w:rPr>
-          <w:rFonts w:ascii="Times New Roman" w:hAnsi="Times New Roman" w:cs="等线" w:eastAsia="Times New Roman"/>
+          <w:rFonts w:eastAsia="Noto Sans" w:cs="等线" w:ascii="Noto Sans" w:hAnsi="Noto Sans"/>
+          <w:sz w:val="20"/>
+          <w:szCs w:val="20"/>
+          <w:lang w:val="en-US" w:eastAsia="zh-CN"/>
+        </w:rPr>
+        <w:t>Qwen</w:t>
+      </w:r>
+      <w:r>
+        <w:rPr>
+          <w:rFonts w:eastAsia="Noto Sans" w:cs="等线" w:ascii="Noto Sans" w:hAnsi="Noto Sans"/>
+          <w:sz w:val="20"/>
+          <w:szCs w:val="20"/>
+          <w:lang w:val="en-US" w:eastAsia="zh-CN"/>
+        </w:rPr>
+        <w:t xml:space="preserve">3 </w:t>
+      </w:r>
+      <w:r>
+        <w:rPr>
+          <w:rFonts w:eastAsia="Noto Sans" w:cs="等线" w:ascii="Noto Sans" w:hAnsi="Noto Sans"/>
+          <w:color w:val="C9211E"/>
+          <w:sz w:val="20"/>
+          <w:szCs w:val="20"/>
+          <w:lang w:val="en-US" w:eastAsia="zh-CN"/>
+        </w:rPr>
+        <w:t>GGUF</w:t>
+      </w:r>
+      <w:r>
+        <w:rPr>
+          <w:rFonts w:ascii="Noto Sans" w:hAnsi="Noto Sans" w:cs="等线" w:eastAsia="Noto Sans"/>
+          <w:color w:val="C9211E"/>
+          <w:sz w:val="20"/>
+          <w:szCs w:val="20"/>
+          <w:lang w:val="en-US" w:eastAsia="zh-CN"/>
+        </w:rPr>
+        <w:t>类型</w:t>
+      </w:r>
+      <w:r>
+        <w:rPr>
+          <w:rFonts w:ascii="Noto Sans" w:hAnsi="Noto Sans" w:cs="等线" w:eastAsia="Noto Sans"/>
           <w:sz w:val="20"/>
           <w:szCs w:val="20"/>
           <w:lang w:val="en-US" w:eastAsia="zh-CN"/>
@@ -532,16 +604,16 @@
       </w:r>
       <w:r>
         <w:rPr>
-          <w:rFonts w:eastAsia="Times New Roman" w:cs="等线" w:ascii="Times New Roman" w:hAnsi="Times New Roman"/>
-          <w:sz w:val="20"/>
-          <w:szCs w:val="20"/>
-          <w:lang w:val="en-US" w:eastAsia="zh-CN"/>
-        </w:rPr>
-        <w:t xml:space="preserve">Qwen2-1.5B-Instruct </w:t>
-      </w:r>
-      <w:r>
-        <w:rPr>
-          <w:rFonts w:ascii="Times New Roman" w:hAnsi="Times New Roman" w:cs="等线" w:eastAsia="Times New Roman"/>
+          <w:rFonts w:eastAsia="Noto Sans" w:cs="等线" w:ascii="Noto Sans" w:hAnsi="Noto Sans"/>
+          <w:sz w:val="20"/>
+          <w:szCs w:val="20"/>
+          <w:lang w:val="en-US" w:eastAsia="zh-CN"/>
+        </w:rPr>
+        <w:t xml:space="preserve">Qwen3-1.7B-GGUF </w:t>
+      </w:r>
+      <w:r>
+        <w:rPr>
+          <w:rFonts w:ascii="Noto Sans" w:hAnsi="Noto Sans" w:cs="等线" w:eastAsia="Noto Sans"/>
           <w:sz w:val="20"/>
           <w:szCs w:val="20"/>
           <w:lang w:val="en-US" w:eastAsia="zh-CN"/>
@@ -550,7 +622,7 @@
       </w:r>
       <w:r>
         <w:rPr>
-          <w:rFonts w:eastAsia="Times New Roman" w:cs="等线" w:ascii="Times New Roman" w:hAnsi="Times New Roman"/>
+          <w:rFonts w:eastAsia="Noto Sans" w:cs="等线" w:ascii="Noto Sans" w:hAnsi="Noto Sans"/>
           <w:sz w:val="20"/>
           <w:szCs w:val="20"/>
           <w:lang w:val="en-US" w:eastAsia="zh-CN"/>
@@ -559,7 +631,7 @@
       </w:r>
       <w:r>
         <w:rPr>
-          <w:rFonts w:ascii="Times New Roman" w:hAnsi="Times New Roman" w:cs="等线" w:eastAsia="Times New Roman"/>
+          <w:rFonts w:ascii="Noto Sans" w:hAnsi="Noto Sans" w:cs="等线" w:eastAsia="Noto Sans"/>
           <w:sz w:val="20"/>
           <w:szCs w:val="20"/>
           <w:lang w:val="en-US" w:eastAsia="zh-CN"/>
@@ -576,17 +648,15 @@
           <w:numId w:val="1"/>
         </w:numPr>
         <w:spacing w:lineRule="auto" w:line="240"/>
-        <w:ind w:left="0" w:hanging="0"/>
+        <w:ind w:hanging="0" w:left="0"/>
         <w:jc w:val="both"/>
         <w:rPr>
-          <w:rFonts w:ascii="Times New Roman" w:hAnsi="Times New Roman" w:eastAsia="Times New Roman"/>
-          <w:sz w:val="20"/>
-          <w:szCs w:val="20"/>
-        </w:rPr>
-      </w:pPr>
-      <w:r>
-        <w:rPr>
-          <w:rFonts w:ascii="Times New Roman" w:hAnsi="Times New Roman" w:cs="等线" w:eastAsia="Times New Roman"/>
+          <w:rFonts w:ascii="Noto Sans" w:hAnsi="Noto Sans" w:eastAsia="Noto Sans"/>
+        </w:rPr>
+      </w:pPr>
+      <w:r>
+        <w:rPr>
+          <w:rFonts w:ascii="Noto Sans" w:hAnsi="Noto Sans" w:cs="等线" w:eastAsia="Noto Sans"/>
           <w:sz w:val="20"/>
           <w:szCs w:val="20"/>
           <w:lang w:val="en-US" w:eastAsia="zh-CN"/>
@@ -595,7 +665,7 @@
       </w:r>
       <w:r>
         <w:rPr>
-          <w:rFonts w:eastAsia="Times New Roman" w:cs="等线" w:ascii="Times New Roman" w:hAnsi="Times New Roman"/>
+          <w:rFonts w:eastAsia="Noto Sans" w:cs="等线" w:ascii="Noto Sans" w:hAnsi="Noto Sans"/>
           <w:sz w:val="20"/>
           <w:szCs w:val="20"/>
           <w:lang w:val="en-US" w:eastAsia="zh-CN"/>
@@ -604,16 +674,16 @@
       </w:r>
       <w:r>
         <w:rPr>
-          <w:rFonts w:ascii="Times New Roman" w:hAnsi="Times New Roman" w:cs="等线" w:eastAsia="Times New Roman"/>
-          <w:sz w:val="20"/>
-          <w:szCs w:val="20"/>
-          <w:lang w:val="en-US" w:eastAsia="zh-CN"/>
-        </w:rPr>
-        <w:t>电脑叫做访达）中找到“下载”文件夹，在“下载”文件加当中应该会有“</w:t>
-      </w:r>
-      <w:r>
-        <w:rPr>
-          <w:rFonts w:eastAsia="Times New Roman" w:cs="等线" w:ascii="Times New Roman" w:hAnsi="Times New Roman"/>
+          <w:rFonts w:ascii="Noto Sans" w:hAnsi="Noto Sans" w:cs="等线" w:eastAsia="Noto Sans"/>
+          <w:sz w:val="20"/>
+          <w:szCs w:val="20"/>
+          <w:lang w:val="en-US" w:eastAsia="zh-CN"/>
+        </w:rPr>
+        <w:t>电脑叫做“访达”）中找到“下载”文件夹，在“下载”文件加当中应该会有“</w:t>
+      </w:r>
+      <w:r>
+        <w:rPr>
+          <w:rFonts w:eastAsia="Noto Sans" w:cs="等线" w:ascii="Noto Sans" w:hAnsi="Noto Sans"/>
           <w:sz w:val="20"/>
           <w:szCs w:val="20"/>
           <w:lang w:val="en-US" w:eastAsia="zh-CN"/>
@@ -622,7 +692,7 @@
       </w:r>
       <w:r>
         <w:rPr>
-          <w:rFonts w:ascii="Times New Roman" w:hAnsi="Times New Roman" w:cs="等线" w:eastAsia="Times New Roman"/>
+          <w:rFonts w:ascii="Noto Sans" w:hAnsi="Noto Sans" w:cs="等线" w:eastAsia="Noto Sans"/>
           <w:sz w:val="20"/>
           <w:szCs w:val="20"/>
           <w:lang w:val="en-US" w:eastAsia="zh-CN"/>
@@ -631,7 +701,7 @@
       </w:r>
       <w:r>
         <w:rPr>
-          <w:rFonts w:eastAsia="Times New Roman" w:cs="等线" w:ascii="Times New Roman" w:hAnsi="Times New Roman"/>
+          <w:rFonts w:eastAsia="Noto Sans" w:cs="等线" w:ascii="Noto Sans" w:hAnsi="Noto Sans"/>
           <w:sz w:val="20"/>
           <w:szCs w:val="20"/>
           <w:lang w:val="en-US" w:eastAsia="zh-CN"/>
@@ -640,7 +710,7 @@
       </w:r>
       <w:r>
         <w:rPr>
-          <w:rFonts w:ascii="Times New Roman" w:hAnsi="Times New Roman" w:cs="等线" w:eastAsia="Times New Roman"/>
+          <w:rFonts w:ascii="Noto Sans" w:hAnsi="Noto Sans" w:cs="等线" w:eastAsia="Noto Sans"/>
           <w:sz w:val="20"/>
           <w:szCs w:val="20"/>
           <w:lang w:val="en-US" w:eastAsia="zh-CN"/>
@@ -649,7 +719,7 @@
       </w:r>
       <w:r>
         <w:rPr>
-          <w:rFonts w:eastAsia="Times New Roman" w:cs="等线" w:ascii="Times New Roman" w:hAnsi="Times New Roman"/>
+          <w:rFonts w:eastAsia="Noto Sans" w:cs="等线" w:ascii="Noto Sans" w:hAnsi="Noto Sans"/>
           <w:sz w:val="20"/>
           <w:szCs w:val="20"/>
           <w:lang w:val="en-US" w:eastAsia="zh-CN"/>
@@ -658,7 +728,7 @@
       </w:r>
       <w:r>
         <w:rPr>
-          <w:rFonts w:ascii="Times New Roman" w:hAnsi="Times New Roman" w:cs="等线" w:eastAsia="Times New Roman"/>
+          <w:rFonts w:ascii="Noto Sans" w:hAnsi="Noto Sans" w:cs="等线" w:eastAsia="Noto Sans"/>
           <w:sz w:val="20"/>
           <w:szCs w:val="20"/>
           <w:lang w:val="en-US" w:eastAsia="zh-CN"/>
@@ -667,34 +737,34 @@
       </w:r>
       <w:r>
         <w:rPr>
-          <w:rFonts w:eastAsia="Times New Roman" w:cs="等线" w:ascii="Times New Roman" w:hAnsi="Times New Roman"/>
-          <w:sz w:val="20"/>
-          <w:szCs w:val="20"/>
-          <w:lang w:val="en-US" w:eastAsia="zh-CN"/>
-        </w:rPr>
-        <w:t>Qwen2-0.5B-Instruct</w:t>
-      </w:r>
-      <w:r>
-        <w:rPr>
-          <w:rFonts w:ascii="Times New Roman" w:hAnsi="Times New Roman" w:cs="等线" w:eastAsia="Times New Roman"/>
-          <w:sz w:val="20"/>
-          <w:szCs w:val="20"/>
-          <w:lang w:val="en-US" w:eastAsia="zh-CN"/>
-        </w:rPr>
-        <w:t>文件夹了，这时请新建</w:t>
-      </w:r>
-      <w:r>
-        <w:rPr>
-          <w:rFonts w:eastAsia="Times New Roman" w:cs="等线" w:ascii="Times New Roman" w:hAnsi="Times New Roman"/>
-          <w:sz w:val="20"/>
-          <w:szCs w:val="20"/>
-          <w:lang w:val="en-US" w:eastAsia="zh-CN"/>
-        </w:rPr>
-        <w:t>Qwen2-1.5B-Instruct</w:t>
-      </w:r>
-      <w:r>
-        <w:rPr>
-          <w:rFonts w:ascii="Times New Roman" w:hAnsi="Times New Roman" w:cs="等线" w:eastAsia="Times New Roman"/>
+          <w:rFonts w:eastAsia="Noto Sans" w:cs="等线" w:ascii="Noto Sans" w:hAnsi="Noto Sans"/>
+          <w:sz w:val="20"/>
+          <w:szCs w:val="20"/>
+          <w:lang w:val="en-US" w:eastAsia="zh-CN"/>
+        </w:rPr>
+        <w:t>Qwen3-0.6B-GGUF</w:t>
+      </w:r>
+      <w:r>
+        <w:rPr>
+          <w:rFonts w:ascii="Noto Sans" w:hAnsi="Noto Sans" w:cs="等线" w:eastAsia="Noto Sans"/>
+          <w:sz w:val="20"/>
+          <w:szCs w:val="20"/>
+          <w:lang w:val="en-US" w:eastAsia="zh-CN"/>
+        </w:rPr>
+        <w:t>（本应用的模型）文件夹了，这时请新建名称为：</w:t>
+      </w:r>
+      <w:r>
+        <w:rPr>
+          <w:rFonts w:eastAsia="Noto Sans" w:cs="等线" w:ascii="Noto Sans" w:hAnsi="Noto Sans"/>
+          <w:sz w:val="20"/>
+          <w:szCs w:val="20"/>
+          <w:lang w:val="en-US" w:eastAsia="zh-CN"/>
+        </w:rPr>
+        <w:t>Qwen3-1.7B-GGUF</w:t>
+      </w:r>
+      <w:r>
+        <w:rPr>
+          <w:rFonts w:ascii="Noto Sans" w:hAnsi="Noto Sans" w:cs="等线" w:eastAsia="Noto Sans"/>
           <w:sz w:val="20"/>
           <w:szCs w:val="20"/>
           <w:lang w:val="en-US" w:eastAsia="zh-CN"/>
@@ -707,16 +777,15 @@
         <w:pStyle w:val="Normal"/>
         <w:widowControl w:val="false"/>
         <w:spacing w:lineRule="auto" w:line="240"/>
-        <w:ind w:left="0" w:hanging="0"/>
+        <w:ind w:hanging="0" w:left="0"/>
         <w:jc w:val="both"/>
         <w:rPr>
-          <w:rFonts w:ascii="Times New Roman" w:hAnsi="Times New Roman" w:eastAsia="Times New Roman"/>
-          <w:sz w:val="20"/>
-          <w:szCs w:val="20"/>
-        </w:rPr>
-      </w:pPr>
-      <w:r>
-        <w:rPr/>
+          <w:rFonts w:ascii="Noto Sans" w:hAnsi="Noto Sans" w:eastAsia="Noto Sans"/>
+          <w:sz w:val="20"/>
+          <w:szCs w:val="20"/>
+        </w:rPr>
+      </w:pPr>
+      <w:r>
         <w:drawing>
           <wp:anchor behindDoc="0" distT="0" distB="0" distL="0" distR="0" simplePos="0" locked="0" layoutInCell="0" allowOverlap="1" relativeHeight="2">
             <wp:simplePos x="0" y="0"/>
@@ -763,6 +832,157 @@
           </wp:anchor>
         </w:drawing>
       </w:r>
+      <w:r>
+        <w:rPr>
+          <w:rFonts w:ascii="Noto Sans" w:hAnsi="Noto Sans" w:eastAsia="Noto Sans"/>
+          <w:sz w:val="20"/>
+          <w:szCs w:val="20"/>
+        </w:rPr>
+        <w:t>上图：</w:t>
+      </w:r>
+      <w:r>
+        <w:rPr>
+          <w:rFonts w:eastAsia="Noto Sans" w:ascii="Noto Sans" w:hAnsi="Noto Sans"/>
+          <w:sz w:val="20"/>
+          <w:szCs w:val="20"/>
+        </w:rPr>
+        <w:t>windows</w:t>
+      </w:r>
+      <w:r>
+        <w:rPr>
+          <w:rFonts w:ascii="Noto Sans" w:hAnsi="Noto Sans" w:eastAsia="Noto Sans"/>
+          <w:sz w:val="20"/>
+          <w:szCs w:val="20"/>
+        </w:rPr>
+        <w:t>中的示意图</w:t>
+      </w:r>
+    </w:p>
+    <w:p>
+      <w:pPr>
+        <w:pStyle w:val="Normal"/>
+        <w:widowControl w:val="false"/>
+        <w:spacing w:lineRule="auto" w:line="240"/>
+        <w:ind w:hanging="0" w:left="0"/>
+        <w:jc w:val="both"/>
+        <w:rPr>
+          <w:rFonts w:ascii="Noto Sans" w:hAnsi="Noto Sans" w:eastAsia="Noto Sans"/>
+          <w:sz w:val="20"/>
+          <w:szCs w:val="20"/>
+        </w:rPr>
+      </w:pPr>
+      <w:r>
+        <w:rPr>
+          <w:rFonts w:eastAsia="Noto Sans" w:ascii="Noto Sans" w:hAnsi="Noto Sans"/>
+          <w:sz w:val="20"/>
+          <w:szCs w:val="20"/>
+        </w:rPr>
+      </w:r>
+    </w:p>
+    <w:p>
+      <w:pPr>
+        <w:pStyle w:val="Normal"/>
+        <w:widowControl w:val="false"/>
+        <w:spacing w:lineRule="auto" w:line="240"/>
+        <w:ind w:hanging="0" w:left="0"/>
+        <w:jc w:val="both"/>
+        <w:rPr>
+          <w:rFonts w:ascii="Noto Sans" w:hAnsi="Noto Sans" w:eastAsia="Noto Sans"/>
+          <w:sz w:val="20"/>
+          <w:szCs w:val="20"/>
+        </w:rPr>
+      </w:pPr>
+      <w:r>
+        <w:drawing>
+          <wp:anchor behindDoc="0" distT="0" distB="0" distL="0" distR="0" simplePos="0" locked="0" layoutInCell="0" allowOverlap="1" relativeHeight="4">
+            <wp:simplePos x="0" y="0"/>
+            <wp:positionH relativeFrom="column">
+              <wp:align>center</wp:align>
+            </wp:positionH>
+            <wp:positionV relativeFrom="paragraph">
+              <wp:posOffset>635</wp:posOffset>
+            </wp:positionV>
+            <wp:extent cx="5274310" cy="3913505"/>
+            <wp:effectExtent l="0" t="0" r="0" b="0"/>
+            <wp:wrapSquare wrapText="largest"/>
+            <wp:docPr id="2" name="Image3" descr=""/>
+            <wp:cNvGraphicFramePr>
+              <a:graphicFrameLocks xmlns:a="http://schemas.openxmlformats.org/drawingml/2006/main" noChangeAspect="1"/>
+            </wp:cNvGraphicFramePr>
+            <a:graphic xmlns:a="http://schemas.openxmlformats.org/drawingml/2006/main">
+              <a:graphicData uri="http://schemas.openxmlformats.org/drawingml/2006/picture">
+                <pic:pic xmlns:pic="http://schemas.openxmlformats.org/drawingml/2006/picture">
+                  <pic:nvPicPr>
+                    <pic:cNvPr id="2" name="Image3" descr=""/>
+                    <pic:cNvPicPr>
+                      <a:picLocks noChangeAspect="1" noChangeArrowheads="1"/>
+                    </pic:cNvPicPr>
+                  </pic:nvPicPr>
+                  <pic:blipFill>
+                    <a:blip r:embed="rId3"/>
+                    <a:stretch>
+                      <a:fillRect/>
+                    </a:stretch>
+                  </pic:blipFill>
+                  <pic:spPr bwMode="auto">
+                    <a:xfrm>
+                      <a:off x="0" y="0"/>
+                      <a:ext cx="5274310" cy="3913505"/>
+                    </a:xfrm>
+                    <a:prstGeom prst="rect">
+                      <a:avLst/>
+                    </a:prstGeom>
+                  </pic:spPr>
+                </pic:pic>
+              </a:graphicData>
+            </a:graphic>
+          </wp:anchor>
+        </w:drawing>
+      </w:r>
+      <w:r>
+        <w:rPr>
+          <w:rFonts w:ascii="Noto Sans" w:hAnsi="Noto Sans" w:eastAsia="Noto Sans"/>
+          <w:sz w:val="20"/>
+          <w:szCs w:val="20"/>
+        </w:rPr>
+        <w:t>上图：</w:t>
+      </w:r>
+      <w:r>
+        <w:rPr>
+          <w:rFonts w:eastAsia="Noto Sans" w:ascii="Noto Sans" w:hAnsi="Noto Sans"/>
+          <w:sz w:val="20"/>
+          <w:szCs w:val="20"/>
+        </w:rPr>
+        <w:t>Mac</w:t>
+      </w:r>
+      <w:r>
+        <w:rPr>
+          <w:rFonts w:ascii="Noto Sans" w:hAnsi="Noto Sans" w:eastAsia="Noto Sans"/>
+          <w:sz w:val="20"/>
+          <w:szCs w:val="20"/>
+        </w:rPr>
+        <w:t>中的示意图</w:t>
+      </w:r>
+    </w:p>
+    <w:p>
+      <w:pPr>
+        <w:pStyle w:val="Normal"/>
+        <w:widowControl w:val="false"/>
+        <w:spacing w:lineRule="auto" w:line="240"/>
+        <w:ind w:hanging="0" w:left="0"/>
+        <w:jc w:val="both"/>
+        <w:rPr>
+          <w:rFonts w:ascii="Noto Sans" w:hAnsi="Noto Sans" w:eastAsia="Noto Sans"/>
+          <w:sz w:val="20"/>
+          <w:szCs w:val="20"/>
+        </w:rPr>
+      </w:pPr>
+      <w:r>
+        <w:rPr>
+          <w:rFonts w:eastAsia="Noto Sans" w:ascii="Noto Sans" w:hAnsi="Noto Sans"/>
+          <w:sz w:val="20"/>
+          <w:szCs w:val="20"/>
+        </w:rPr>
+      </w:r>
     </w:p>
     <w:p>
       <w:pPr>
@@ -773,17 +993,13 @@
           <w:numId w:val="1"/>
         </w:numPr>
         <w:spacing w:lineRule="auto" w:line="240"/>
-        <w:ind w:left="0" w:hanging="0"/>
+        <w:ind w:hanging="0" w:left="0"/>
         <w:jc w:val="both"/>
-        <w:rPr>
-          <w:rFonts w:ascii="Times New Roman" w:hAnsi="Times New Roman" w:eastAsia="Times New Roman"/>
-          <w:sz w:val="20"/>
-          <w:szCs w:val="20"/>
-        </w:rPr>
-      </w:pPr>
-      <w:r>
-        <w:rPr>
-          <w:rFonts w:ascii="Times New Roman" w:hAnsi="Times New Roman" w:cs="等线" w:eastAsia="Times New Roman"/>
+        <w:rPr/>
+      </w:pPr>
+      <w:r>
+        <w:rPr>
+          <w:rFonts w:ascii="Noto Sans" w:hAnsi="Noto Sans" w:cs="等线" w:eastAsia="Noto Sans"/>
           <w:sz w:val="20"/>
           <w:szCs w:val="20"/>
           <w:lang w:val="en-US" w:eastAsia="zh-CN"/>
@@ -792,16 +1008,16 @@
       </w:r>
       <w:r>
         <w:rPr>
-          <w:rFonts w:eastAsia="Times New Roman" w:cs="等线" w:ascii="Times New Roman" w:hAnsi="Times New Roman"/>
-          <w:sz w:val="20"/>
-          <w:szCs w:val="20"/>
-          <w:lang w:val="en-US" w:eastAsia="zh-CN"/>
-        </w:rPr>
-        <w:t>Qwen2-1.5B-Instruct</w:t>
-      </w:r>
-      <w:r>
-        <w:rPr>
-          <w:rFonts w:ascii="Times New Roman" w:hAnsi="Times New Roman" w:cs="等线" w:eastAsia="Times New Roman"/>
+          <w:rFonts w:eastAsia="Noto Sans" w:cs="等线" w:ascii="Noto Sans" w:hAnsi="Noto Sans"/>
+          <w:sz w:val="20"/>
+          <w:szCs w:val="20"/>
+          <w:lang w:val="en-US" w:eastAsia="zh-CN"/>
+        </w:rPr>
+        <w:t>Qwen3-1.7B-GGUF</w:t>
+      </w:r>
+      <w:r>
+        <w:rPr>
+          <w:rFonts w:ascii="Noto Sans" w:hAnsi="Noto Sans" w:cs="等线" w:eastAsia="Noto Sans"/>
           <w:sz w:val="20"/>
           <w:szCs w:val="20"/>
           <w:lang w:val="en-US" w:eastAsia="zh-CN"/>
@@ -810,37 +1026,35 @@
       </w:r>
       <w:r>
         <w:rPr>
-          <w:rFonts w:eastAsia="Times New Roman" w:cs="等线" w:ascii="Times New Roman" w:hAnsi="Times New Roman"/>
-          <w:sz w:val="20"/>
-          <w:szCs w:val="20"/>
-          <w:lang w:val="en-US" w:eastAsia="zh-CN"/>
-        </w:rPr>
-        <w:t>Qwen2-1.5B-Instruct</w:t>
-      </w:r>
-      <w:r>
-        <w:rPr>
-          <w:rFonts w:ascii="Times New Roman" w:hAnsi="Times New Roman" w:cs="等线" w:eastAsia="Times New Roman"/>
+          <w:rFonts w:eastAsia="Noto Sans" w:cs="等线" w:ascii="Noto Sans" w:hAnsi="Noto Sans"/>
+          <w:sz w:val="20"/>
+          <w:szCs w:val="20"/>
+          <w:lang w:val="en-US" w:eastAsia="zh-CN"/>
+        </w:rPr>
+        <w:t>Qwen3-1.7B-GGUF</w:t>
+      </w:r>
+      <w:r>
+        <w:rPr>
+          <w:rFonts w:ascii="Noto Sans" w:hAnsi="Noto Sans" w:cs="等线" w:eastAsia="Noto Sans"/>
           <w:sz w:val="20"/>
           <w:szCs w:val="20"/>
           <w:lang w:val="en-US" w:eastAsia="zh-CN"/>
         </w:rPr>
         <w:t>的模型参数文件的链接是：</w:t>
       </w:r>
-      <w:hyperlink r:id="rId3">
-        <w:r>
-          <w:rPr>
-            <w:rStyle w:val="InternetLink"/>
-            <w:rFonts w:eastAsia="Times New Roman" w:cs="等线" w:ascii="Times New Roman" w:hAnsi="Times New Roman"/>
-            <w:sz w:val="20"/>
-            <w:szCs w:val="20"/>
-            <w:lang w:val="en-US" w:eastAsia="zh-CN"/>
-          </w:rPr>
-          <w:t>https://huggingface.co/Qwen/Qwen2-1.5B-Instruct/tree/main</w:t>
-        </w:r>
-      </w:hyperlink>
-      <w:r>
-        <w:rPr>
-          <w:rFonts w:eastAsia="Times New Roman" w:cs="等线" w:ascii="Times New Roman" w:hAnsi="Times New Roman"/>
+      <w:r>
+        <w:rPr>
+          <w:rStyle w:val="Hyperlink"/>
+          <w:rFonts w:eastAsia="Noto Sans" w:cs="等线" w:ascii="Noto Sans" w:hAnsi="Noto Sans"/>
+          <w:sz w:val="20"/>
+          <w:szCs w:val="20"/>
+          <w:lang w:val="en-US" w:eastAsia="zh-CN"/>
+        </w:rPr>
+        <w:t>https://huggingface.co/Qwen/Qwen3-1.7B-GGUF/tree/main</w:t>
+      </w:r>
+      <w:r>
+        <w:rPr>
+          <w:rFonts w:eastAsia="Noto Sans" w:cs="等线" w:ascii="Noto Sans" w:hAnsi="Noto Sans"/>
           <w:sz w:val="20"/>
           <w:szCs w:val="20"/>
           <w:lang w:val="en-US" w:eastAsia="zh-CN"/>
@@ -849,7 +1063,7 @@
       </w:r>
       <w:r>
         <w:rPr>
-          <w:rFonts w:ascii="Times New Roman" w:hAnsi="Times New Roman" w:cs="等线" w:eastAsia="Times New Roman"/>
+          <w:rFonts w:ascii="Noto Sans" w:hAnsi="Noto Sans" w:cs="等线" w:eastAsia="Noto Sans"/>
           <w:sz w:val="20"/>
           <w:szCs w:val="20"/>
           <w:lang w:val="en-US" w:eastAsia="zh-CN"/>
@@ -858,7 +1072,7 @@
       </w:r>
       <w:r>
         <w:rPr>
-          <w:rFonts w:eastAsia="Times New Roman" w:cs="等线" w:ascii="Times New Roman" w:hAnsi="Times New Roman"/>
+          <w:rFonts w:eastAsia="Noto Sans" w:cs="等线" w:ascii="Noto Sans" w:hAnsi="Noto Sans"/>
           <w:sz w:val="20"/>
           <w:szCs w:val="20"/>
           <w:lang w:val="en-US" w:eastAsia="zh-CN"/>
@@ -867,7 +1081,16 @@
       </w:r>
       <w:r>
         <w:rPr>
-          <w:rFonts w:ascii="Times New Roman" w:hAnsi="Times New Roman" w:cs="等线" w:eastAsia="Times New Roman"/>
+          <w:rFonts w:eastAsia="Noto Sans" w:cs="等线" w:ascii="Noto Sans" w:hAnsi="Noto Sans"/>
+          <w:sz w:val="20"/>
+          <w:szCs w:val="20"/>
+          <w:lang w:val="en-US" w:eastAsia="zh-CN"/>
+        </w:rPr>
+        <w:t>3</w:t>
+      </w:r>
+      <w:r>
+        <w:rPr>
+          <w:rFonts w:ascii="Noto Sans" w:hAnsi="Noto Sans" w:cs="等线" w:eastAsia="Noto Sans"/>
           <w:sz w:val="20"/>
           <w:szCs w:val="20"/>
           <w:lang w:val="en-US" w:eastAsia="zh-CN"/>
@@ -876,7 +1099,7 @@
       </w:r>
       <w:r>
         <w:rPr>
-          <w:rFonts w:eastAsia="Times New Roman" w:cs="等线" w:ascii="Times New Roman" w:hAnsi="Times New Roman"/>
+          <w:rFonts w:eastAsia="Noto Sans" w:cs="等线" w:ascii="Noto Sans" w:hAnsi="Noto Sans"/>
           <w:sz w:val="20"/>
           <w:szCs w:val="20"/>
           <w:lang w:val="en-US" w:eastAsia="zh-CN"/>
@@ -885,7 +1108,7 @@
       </w:r>
       <w:r>
         <w:rPr>
-          <w:rFonts w:ascii="Times New Roman" w:hAnsi="Times New Roman" w:cs="等线" w:eastAsia="Times New Roman"/>
+          <w:rFonts w:ascii="Noto Sans" w:hAnsi="Noto Sans" w:cs="等线" w:eastAsia="Noto Sans"/>
           <w:sz w:val="20"/>
           <w:szCs w:val="20"/>
           <w:lang w:val="en-US" w:eastAsia="zh-CN"/>
@@ -894,16 +1117,35 @@
       </w:r>
       <w:r>
         <w:rPr>
-          <w:rFonts w:eastAsia="Times New Roman" w:cs="等线" w:ascii="Times New Roman" w:hAnsi="Times New Roman"/>
-          <w:sz w:val="20"/>
-          <w:szCs w:val="20"/>
-          <w:lang w:val="en-US" w:eastAsia="zh-CN"/>
-        </w:rPr>
-        <w:t>Qwen2</w:t>
-      </w:r>
-      <w:r>
-        <w:rPr>
-          <w:rFonts w:ascii="Times New Roman" w:hAnsi="Times New Roman" w:cs="等线" w:eastAsia="Times New Roman"/>
+          <w:rFonts w:eastAsia="Noto Sans" w:cs="等线" w:ascii="Noto Sans" w:hAnsi="Noto Sans"/>
+          <w:sz w:val="20"/>
+          <w:szCs w:val="20"/>
+          <w:lang w:val="en-US" w:eastAsia="zh-CN"/>
+        </w:rPr>
+        <w:t>Qwen</w:t>
+      </w:r>
+      <w:r>
+        <w:rPr>
+          <w:rFonts w:eastAsia="Noto Sans" w:cs="等线" w:ascii="Noto Sans" w:hAnsi="Noto Sans"/>
+          <w:sz w:val="20"/>
+          <w:szCs w:val="20"/>
+          <w:lang w:val="en-US" w:eastAsia="zh-CN"/>
+        </w:rPr>
+        <w:t xml:space="preserve">3 </w:t>
+      </w:r>
+      <w:r>
+        <w:rPr>
+          <w:rFonts w:eastAsia="Noto Sans" w:cs="等线" w:ascii="Noto Sans" w:hAnsi="Noto Sans"/>
+          <w:color w:val="C9211E"/>
+          <w:sz w:val="20"/>
+          <w:szCs w:val="20"/>
+          <w:lang w:val="en-US" w:eastAsia="zh-CN"/>
+        </w:rPr>
+        <w:t>GGUF</w:t>
+      </w:r>
+      <w:r>
+        <w:rPr>
+          <w:rFonts w:ascii="Noto Sans" w:hAnsi="Noto Sans" w:cs="等线" w:eastAsia="Noto Sans"/>
           <w:sz w:val="20"/>
           <w:szCs w:val="20"/>
           <w:lang w:val="en-US" w:eastAsia="zh-CN"/>
@@ -916,16 +1158,20 @@
         <w:pStyle w:val="Normal"/>
         <w:widowControl w:val="false"/>
         <w:spacing w:lineRule="auto" w:line="240"/>
-        <w:ind w:left="0" w:hanging="0"/>
+        <w:ind w:hanging="0" w:left="0"/>
         <w:jc w:val="both"/>
         <w:rPr>
-          <w:rFonts w:ascii="Times New Roman" w:hAnsi="Times New Roman" w:eastAsia="Times New Roman"/>
-          <w:sz w:val="20"/>
-          <w:szCs w:val="20"/>
-        </w:rPr>
-      </w:pPr>
-      <w:r>
-        <w:rPr/>
+          <w:rFonts w:ascii="Noto Sans" w:hAnsi="Noto Sans" w:eastAsia="Noto Sans"/>
+          <w:sz w:val="20"/>
+          <w:szCs w:val="20"/>
+        </w:rPr>
+      </w:pPr>
+      <w:r>
+        <w:rPr>
+          <w:rFonts w:eastAsia="Noto Sans" w:ascii="Noto Sans" w:hAnsi="Noto Sans"/>
+          <w:sz w:val="20"/>
+          <w:szCs w:val="20"/>
+        </w:rPr>
       </w:r>
     </w:p>
     <w:p>
@@ -933,16 +1179,20 @@
         <w:pStyle w:val="Normal"/>
         <w:widowControl w:val="false"/>
         <w:spacing w:lineRule="auto" w:line="240"/>
-        <w:ind w:left="0" w:hanging="0"/>
+        <w:ind w:hanging="0" w:left="0"/>
         <w:jc w:val="both"/>
         <w:rPr>
-          <w:rFonts w:ascii="Times New Roman" w:hAnsi="Times New Roman" w:eastAsia="Times New Roman"/>
-          <w:sz w:val="20"/>
-          <w:szCs w:val="20"/>
-        </w:rPr>
-      </w:pPr>
-      <w:r>
-        <w:rPr/>
+          <w:rFonts w:ascii="Noto Sans" w:hAnsi="Noto Sans" w:eastAsia="Noto Sans"/>
+          <w:sz w:val="20"/>
+          <w:szCs w:val="20"/>
+        </w:rPr>
+      </w:pPr>
+      <w:r>
+        <w:rPr>
+          <w:rFonts w:eastAsia="Noto Sans" w:ascii="Noto Sans" w:hAnsi="Noto Sans"/>
+          <w:sz w:val="20"/>
+          <w:szCs w:val="20"/>
+        </w:rPr>
         <w:drawing>
           <wp:anchor behindDoc="0" distT="0" distB="0" distL="0" distR="0" simplePos="0" locked="0" layoutInCell="0" allowOverlap="1" relativeHeight="3">
             <wp:simplePos x="0" y="0"/>
@@ -952,10 +1202,10 @@
             <wp:positionV relativeFrom="paragraph">
               <wp:posOffset>635</wp:posOffset>
             </wp:positionV>
-            <wp:extent cx="5274310" cy="2956560"/>
+            <wp:extent cx="5274310" cy="2471420"/>
             <wp:effectExtent l="0" t="0" r="0" b="0"/>
             <wp:wrapSquare wrapText="largest"/>
-            <wp:docPr id="2" name="Image2" descr=""/>
+            <wp:docPr id="3" name="Image2" descr=""/>
             <wp:cNvGraphicFramePr>
               <a:graphicFrameLocks xmlns:a="http://schemas.openxmlformats.org/drawingml/2006/main" noChangeAspect="1"/>
             </wp:cNvGraphicFramePr>
@@ -963,7 +1213,7 @@
               <a:graphicData uri="http://schemas.openxmlformats.org/drawingml/2006/picture">
                 <pic:pic xmlns:pic="http://schemas.openxmlformats.org/drawingml/2006/picture">
                   <pic:nvPicPr>
-                    <pic:cNvPr id="2" name="Image2" descr=""/>
+                    <pic:cNvPr id="3" name="Image2" descr=""/>
                     <pic:cNvPicPr>
                       <a:picLocks noChangeAspect="1" noChangeArrowheads="1"/>
                     </pic:cNvPicPr>
@@ -977,7 +1227,7 @@
                   <pic:spPr bwMode="auto">
                     <a:xfrm>
                       <a:off x="0" y="0"/>
-                      <a:ext cx="5274310" cy="2956560"/>
+                      <a:ext cx="5274310" cy="2471420"/>
                     </a:xfrm>
                     <a:prstGeom prst="rect">
                       <a:avLst/>
@@ -995,16 +1245,20 @@
         <w:pStyle w:val="Normal"/>
         <w:widowControl w:val="false"/>
         <w:spacing w:lineRule="auto" w:line="240"/>
-        <w:ind w:left="0" w:hanging="0"/>
+        <w:ind w:hanging="0" w:left="0"/>
         <w:jc w:val="both"/>
         <w:rPr>
-          <w:rFonts w:ascii="Times New Roman" w:hAnsi="Times New Roman" w:eastAsia="Times New Roman"/>
-          <w:sz w:val="20"/>
-          <w:szCs w:val="20"/>
-        </w:rPr>
-      </w:pPr>
-      <w:r>
-        <w:rPr/>
+          <w:rFonts w:ascii="Noto Sans" w:hAnsi="Noto Sans" w:eastAsia="Noto Sans"/>
+          <w:sz w:val="20"/>
+          <w:szCs w:val="20"/>
+        </w:rPr>
+      </w:pPr>
+      <w:r>
+        <w:rPr>
+          <w:rFonts w:eastAsia="Noto Sans" w:ascii="Noto Sans" w:hAnsi="Noto Sans"/>
+          <w:sz w:val="20"/>
+          <w:szCs w:val="20"/>
+        </w:rPr>
       </w:r>
     </w:p>
     <w:p>
@@ -1016,17 +1270,15 @@
           <w:numId w:val="1"/>
         </w:numPr>
         <w:spacing w:lineRule="auto" w:line="240"/>
-        <w:ind w:left="0" w:hanging="0"/>
+        <w:ind w:hanging="0" w:left="0"/>
         <w:jc w:val="both"/>
         <w:rPr>
-          <w:rFonts w:ascii="Times New Roman" w:hAnsi="Times New Roman" w:eastAsia="Times New Roman"/>
-          <w:sz w:val="20"/>
-          <w:szCs w:val="20"/>
-        </w:rPr>
-      </w:pPr>
-      <w:r>
-        <w:rPr>
-          <w:rFonts w:ascii="Times New Roman" w:hAnsi="Times New Roman" w:cs="等线" w:eastAsia="Times New Roman"/>
+          <w:rFonts w:ascii="Noto Sans" w:hAnsi="Noto Sans" w:eastAsia="Noto Sans"/>
+        </w:rPr>
+      </w:pPr>
+      <w:r>
+        <w:rPr>
+          <w:rFonts w:ascii="Noto Sans" w:hAnsi="Noto Sans" w:cs="等线" w:eastAsia="Noto Sans"/>
           <w:sz w:val="20"/>
           <w:szCs w:val="20"/>
           <w:lang w:val="en-US" w:eastAsia="zh-CN"/>
@@ -1035,7 +1287,7 @@
       </w:r>
       <w:r>
         <w:rPr>
-          <w:rFonts w:eastAsia="Times New Roman" w:cs="等线" w:ascii="Times New Roman" w:hAnsi="Times New Roman"/>
+          <w:rFonts w:eastAsia="Noto Sans" w:cs="等线" w:ascii="Noto Sans" w:hAnsi="Noto Sans"/>
           <w:sz w:val="20"/>
           <w:szCs w:val="20"/>
           <w:lang w:val="en-US" w:eastAsia="zh-CN"/>
@@ -1044,12 +1296,30 @@
       </w:r>
       <w:r>
         <w:rPr>
-          <w:rFonts w:ascii="Times New Roman" w:hAnsi="Times New Roman" w:cs="等线" w:eastAsia="Times New Roman"/>
-          <w:sz w:val="20"/>
-          <w:szCs w:val="20"/>
-          <w:lang w:val="en-US" w:eastAsia="zh-CN"/>
-        </w:rPr>
-        <w:t>）中新建的文件夹当中。</w:t>
+          <w:rFonts w:ascii="Noto Sans" w:hAnsi="Noto Sans" w:cs="等线" w:eastAsia="Noto Sans"/>
+          <w:sz w:val="20"/>
+          <w:szCs w:val="20"/>
+          <w:lang w:val="en-US" w:eastAsia="zh-CN"/>
+        </w:rPr>
+        <w:t>）中新建的文件夹（</w:t>
+      </w:r>
+      <w:r>
+        <w:rPr>
+          <w:rFonts w:eastAsia="Noto Sans" w:cs="等线" w:ascii="Noto Sans" w:hAnsi="Noto Sans"/>
+          <w:sz w:val="20"/>
+          <w:szCs w:val="20"/>
+          <w:lang w:val="en-US" w:eastAsia="zh-CN"/>
+        </w:rPr>
+        <w:t>Qwen3-1.7B-GGUF</w:t>
+      </w:r>
+      <w:r>
+        <w:rPr>
+          <w:rFonts w:ascii="Noto Sans" w:hAnsi="Noto Sans" w:cs="等线" w:eastAsia="Noto Sans"/>
+          <w:sz w:val="20"/>
+          <w:szCs w:val="20"/>
+          <w:lang w:val="en-US" w:eastAsia="zh-CN"/>
+        </w:rPr>
+        <w:t>）当中。</w:t>
       </w:r>
     </w:p>
     <w:p>
@@ -1061,17 +1331,15 @@
           <w:numId w:val="1"/>
         </w:numPr>
         <w:spacing w:lineRule="auto" w:line="240"/>
-        <w:ind w:left="0" w:hanging="0"/>
+        <w:ind w:hanging="0" w:left="0"/>
         <w:jc w:val="both"/>
         <w:rPr>
-          <w:rFonts w:ascii="Times New Roman" w:hAnsi="Times New Roman" w:eastAsia="Times New Roman"/>
-          <w:sz w:val="20"/>
-          <w:szCs w:val="20"/>
-        </w:rPr>
-      </w:pPr>
-      <w:r>
-        <w:rPr>
-          <w:rFonts w:ascii="Times New Roman" w:hAnsi="Times New Roman" w:cs="等线" w:eastAsia="Times New Roman"/>
+          <w:rFonts w:ascii="Noto Sans" w:hAnsi="Noto Sans" w:eastAsia="Noto Sans"/>
+        </w:rPr>
+      </w:pPr>
+      <w:r>
+        <w:rPr>
+          <w:rFonts w:ascii="Noto Sans" w:hAnsi="Noto Sans" w:cs="等线" w:eastAsia="Noto Sans"/>
           <w:sz w:val="20"/>
           <w:szCs w:val="20"/>
           <w:lang w:val="en-US" w:eastAsia="zh-CN"/>
@@ -1080,7 +1348,7 @@
       </w:r>
       <w:r>
         <w:rPr>
-          <w:rFonts w:eastAsia="Times New Roman" w:cs="等线" w:ascii="Times New Roman" w:hAnsi="Times New Roman"/>
+          <w:rFonts w:eastAsia="Noto Sans" w:cs="等线" w:ascii="Noto Sans" w:hAnsi="Noto Sans"/>
           <w:sz w:val="20"/>
           <w:szCs w:val="20"/>
           <w:lang w:val="en-US" w:eastAsia="zh-CN"/>
@@ -1089,16 +1357,16 @@
       </w:r>
       <w:r>
         <w:rPr>
-          <w:rFonts w:ascii="Times New Roman" w:hAnsi="Times New Roman" w:cs="等线" w:eastAsia="Times New Roman"/>
-          <w:sz w:val="20"/>
-          <w:szCs w:val="20"/>
-          <w:lang w:val="en-US" w:eastAsia="zh-CN"/>
-        </w:rPr>
-        <w:t>电脑叫做访达）中找到“下载”文件夹，在“下载”文件加当中应该会有“</w:t>
-      </w:r>
-      <w:r>
-        <w:rPr>
-          <w:rFonts w:eastAsia="Times New Roman" w:cs="等线" w:ascii="Times New Roman" w:hAnsi="Times New Roman"/>
+          <w:rFonts w:ascii="Noto Sans" w:hAnsi="Noto Sans" w:cs="等线" w:eastAsia="Noto Sans"/>
+          <w:sz w:val="20"/>
+          <w:szCs w:val="20"/>
+          <w:lang w:val="en-US" w:eastAsia="zh-CN"/>
+        </w:rPr>
+        <w:t>电脑叫做“访达”）中找到“下载”文件夹，在“下载”文件加当中应该会有“</w:t>
+      </w:r>
+      <w:r>
+        <w:rPr>
+          <w:rFonts w:eastAsia="Noto Sans" w:cs="等线" w:ascii="Noto Sans" w:hAnsi="Noto Sans"/>
           <w:sz w:val="20"/>
           <w:szCs w:val="20"/>
           <w:lang w:val="en-US" w:eastAsia="zh-CN"/>
@@ -1107,7 +1375,7 @@
       </w:r>
       <w:r>
         <w:rPr>
-          <w:rFonts w:ascii="Times New Roman" w:hAnsi="Times New Roman" w:cs="等线" w:eastAsia="Times New Roman"/>
+          <w:rFonts w:ascii="Noto Sans" w:hAnsi="Noto Sans" w:cs="等线" w:eastAsia="Noto Sans"/>
           <w:sz w:val="20"/>
           <w:szCs w:val="20"/>
           <w:lang w:val="en-US" w:eastAsia="zh-CN"/>
@@ -1116,7 +1384,7 @@
       </w:r>
       <w:r>
         <w:rPr>
-          <w:rFonts w:eastAsia="Times New Roman" w:cs="等线" w:ascii="Times New Roman" w:hAnsi="Times New Roman"/>
+          <w:rFonts w:eastAsia="Noto Sans" w:cs="等线" w:ascii="Noto Sans" w:hAnsi="Noto Sans"/>
           <w:sz w:val="20"/>
           <w:szCs w:val="20"/>
           <w:lang w:val="en-US" w:eastAsia="zh-CN"/>
@@ -1125,7 +1393,7 @@
       </w:r>
       <w:r>
         <w:rPr>
-          <w:rFonts w:ascii="Times New Roman" w:hAnsi="Times New Roman" w:cs="等线" w:eastAsia="Times New Roman"/>
+          <w:rFonts w:ascii="Noto Sans" w:hAnsi="Noto Sans" w:cs="等线" w:eastAsia="Noto Sans"/>
           <w:sz w:val="20"/>
           <w:szCs w:val="20"/>
           <w:lang w:val="en-US" w:eastAsia="zh-CN"/>
@@ -1134,7 +1402,7 @@
       </w:r>
       <w:r>
         <w:rPr>
-          <w:rFonts w:eastAsia="Times New Roman" w:cs="等线" w:ascii="Times New Roman" w:hAnsi="Times New Roman"/>
+          <w:rFonts w:eastAsia="Noto Sans" w:cs="等线" w:ascii="Noto Sans" w:hAnsi="Noto Sans"/>
           <w:sz w:val="20"/>
           <w:szCs w:val="20"/>
           <w:lang w:val="en-US" w:eastAsia="zh-CN"/>
@@ -1143,7 +1411,7 @@
       </w:r>
       <w:r>
         <w:rPr>
-          <w:rFonts w:ascii="Times New Roman" w:hAnsi="Times New Roman" w:cs="等线" w:eastAsia="Times New Roman"/>
+          <w:rFonts w:ascii="Noto Sans" w:hAnsi="Noto Sans" w:cs="等线" w:eastAsia="Noto Sans"/>
           <w:sz w:val="20"/>
           <w:szCs w:val="20"/>
           <w:lang w:val="en-US" w:eastAsia="zh-CN"/>
@@ -1152,16 +1420,16 @@
       </w:r>
       <w:r>
         <w:rPr>
-          <w:rFonts w:eastAsia="Times New Roman" w:cs="等线" w:ascii="Times New Roman" w:hAnsi="Times New Roman"/>
-          <w:sz w:val="20"/>
-          <w:szCs w:val="20"/>
-          <w:lang w:val="en-US" w:eastAsia="zh-CN"/>
-        </w:rPr>
-        <w:t xml:space="preserve">model_name_list=Qwen2-0.5B-Instruct </w:t>
-      </w:r>
-      <w:r>
-        <w:rPr>
-          <w:rFonts w:ascii="Times New Roman" w:hAnsi="Times New Roman" w:cs="等线" w:eastAsia="Times New Roman"/>
+          <w:rFonts w:eastAsia="Noto Sans" w:cs="等线" w:ascii="Noto Sans" w:hAnsi="Noto Sans"/>
+          <w:sz w:val="20"/>
+          <w:szCs w:val="20"/>
+          <w:lang w:val="en-US" w:eastAsia="zh-CN"/>
+        </w:rPr>
+        <w:t xml:space="preserve">model_name_list=Qwen3-0.6B-GGUF </w:t>
+      </w:r>
+      <w:r>
+        <w:rPr>
+          <w:rFonts w:ascii="Noto Sans" w:hAnsi="Noto Sans" w:cs="等线" w:eastAsia="Noto Sans"/>
           <w:sz w:val="20"/>
           <w:szCs w:val="20"/>
           <w:lang w:val="en-US" w:eastAsia="zh-CN"/>
@@ -1170,16 +1438,16 @@
       </w:r>
       <w:r>
         <w:rPr>
-          <w:rFonts w:eastAsia="Times New Roman" w:cs="等线" w:ascii="Times New Roman" w:hAnsi="Times New Roman"/>
-          <w:sz w:val="20"/>
-          <w:szCs w:val="20"/>
-          <w:lang w:val="en-US" w:eastAsia="zh-CN"/>
-        </w:rPr>
-        <w:t xml:space="preserve">: model_name_list=Qwen2-0.5B-Instruct,Qwen2-1.5B-Instruct </w:t>
-      </w:r>
-      <w:r>
-        <w:rPr>
-          <w:rFonts w:ascii="Times New Roman" w:hAnsi="Times New Roman" w:cs="等线" w:eastAsia="Times New Roman"/>
+          <w:rFonts w:eastAsia="Noto Sans" w:cs="等线" w:ascii="Noto Sans" w:hAnsi="Noto Sans"/>
+          <w:sz w:val="20"/>
+          <w:szCs w:val="20"/>
+          <w:lang w:val="en-US" w:eastAsia="zh-CN"/>
+        </w:rPr>
+        <w:t xml:space="preserve">: model_name_list=Qwen3-0.6B-GGUF,Qwen3-1.7B-GGUF </w:t>
+      </w:r>
+      <w:r>
+        <w:rPr>
+          <w:rFonts w:ascii="Noto Sans" w:hAnsi="Noto Sans" w:cs="等线" w:eastAsia="Noto Sans"/>
           <w:sz w:val="20"/>
           <w:szCs w:val="20"/>
           <w:lang w:val="en-US" w:eastAsia="zh-CN"/>
@@ -1188,7 +1456,7 @@
       </w:r>
       <w:r>
         <w:rPr>
-          <w:rFonts w:eastAsia="Times New Roman" w:cs="等线" w:ascii="Times New Roman" w:hAnsi="Times New Roman"/>
+          <w:rFonts w:eastAsia="Noto Sans" w:cs="等线" w:ascii="Noto Sans" w:hAnsi="Noto Sans"/>
           <w:sz w:val="20"/>
           <w:szCs w:val="20"/>
           <w:lang w:val="en-US" w:eastAsia="zh-CN"/>
@@ -1197,7 +1465,7 @@
       </w:r>
       <w:r>
         <w:rPr>
-          <w:rFonts w:ascii="Times New Roman" w:hAnsi="Times New Roman" w:cs="等线" w:eastAsia="Times New Roman"/>
+          <w:rFonts w:ascii="Noto Sans" w:hAnsi="Noto Sans" w:cs="等线" w:eastAsia="Noto Sans"/>
           <w:sz w:val="20"/>
           <w:szCs w:val="20"/>
           <w:lang w:val="en-US" w:eastAsia="zh-CN"/>
@@ -1206,16 +1474,16 @@
       </w:r>
       <w:r>
         <w:rPr>
-          <w:rFonts w:eastAsia="Times New Roman" w:cs="等线" w:ascii="Times New Roman" w:hAnsi="Times New Roman"/>
-          <w:sz w:val="20"/>
-          <w:szCs w:val="20"/>
-          <w:lang w:val="en-US" w:eastAsia="zh-CN"/>
-        </w:rPr>
-        <w:t xml:space="preserve">Qwen2-7B-Instruct </w:t>
-      </w:r>
-      <w:r>
-        <w:rPr>
-          <w:rFonts w:ascii="Times New Roman" w:hAnsi="Times New Roman" w:cs="等线" w:eastAsia="Times New Roman"/>
+          <w:rFonts w:eastAsia="Noto Sans" w:cs="等线" w:ascii="Noto Sans" w:hAnsi="Noto Sans"/>
+          <w:sz w:val="20"/>
+          <w:szCs w:val="20"/>
+          <w:lang w:val="en-US" w:eastAsia="zh-CN"/>
+        </w:rPr>
+        <w:t xml:space="preserve">Qwen3-32B-GGUF </w:t>
+      </w:r>
+      <w:r>
+        <w:rPr>
+          <w:rFonts w:ascii="Noto Sans" w:hAnsi="Noto Sans" w:cs="等线" w:eastAsia="Noto Sans"/>
           <w:sz w:val="20"/>
           <w:szCs w:val="20"/>
           <w:lang w:val="en-US" w:eastAsia="zh-CN"/>
@@ -1224,7 +1492,7 @@
       </w:r>
       <w:r>
         <w:rPr>
-          <w:rFonts w:eastAsia="Times New Roman" w:cs="等线" w:ascii="Times New Roman" w:hAnsi="Times New Roman"/>
+          <w:rFonts w:eastAsia="Noto Sans" w:cs="等线" w:ascii="Noto Sans" w:hAnsi="Noto Sans"/>
           <w:sz w:val="20"/>
           <w:szCs w:val="20"/>
           <w:lang w:val="en-US" w:eastAsia="zh-CN"/>
@@ -1233,7 +1501,7 @@
       </w:r>
       <w:r>
         <w:rPr>
-          <w:rFonts w:ascii="Times New Roman" w:hAnsi="Times New Roman" w:cs="等线" w:eastAsia="Times New Roman"/>
+          <w:rFonts w:ascii="Noto Sans" w:hAnsi="Noto Sans" w:cs="等线" w:eastAsia="Noto Sans"/>
           <w:sz w:val="20"/>
           <w:szCs w:val="20"/>
           <w:lang w:val="en-US" w:eastAsia="zh-CN"/>
@@ -1242,16 +1510,16 @@
       </w:r>
       <w:r>
         <w:rPr>
-          <w:rFonts w:eastAsia="Times New Roman" w:cs="等线" w:ascii="Times New Roman" w:hAnsi="Times New Roman"/>
-          <w:sz w:val="20"/>
-          <w:szCs w:val="20"/>
-          <w:lang w:val="en-US" w:eastAsia="zh-CN"/>
-        </w:rPr>
-        <w:t xml:space="preserve">model_name_list=Qwen2-0.5B-Instruct,Qwen2-1.5B-Instruct,Qwen2-7B-Instruct </w:t>
-      </w:r>
-      <w:r>
-        <w:rPr>
-          <w:rFonts w:ascii="Times New Roman" w:hAnsi="Times New Roman" w:cs="等线" w:eastAsia="Times New Roman"/>
+          <w:rFonts w:eastAsia="Noto Sans" w:cs="等线" w:ascii="Noto Sans" w:hAnsi="Noto Sans"/>
+          <w:sz w:val="20"/>
+          <w:szCs w:val="20"/>
+          <w:lang w:val="en-US" w:eastAsia="zh-CN"/>
+        </w:rPr>
+        <w:t xml:space="preserve">model_name_list=Qwen3-0.6B-GGUF,Qwen3-1.7B-GGUF,Qwen/Qwen3-32B-GGUF </w:t>
+      </w:r>
+      <w:r>
+        <w:rPr>
+          <w:rFonts w:ascii="Noto Sans" w:hAnsi="Noto Sans" w:cs="等线" w:eastAsia="Noto Sans"/>
           <w:sz w:val="20"/>
           <w:szCs w:val="20"/>
           <w:lang w:val="en-US" w:eastAsia="zh-CN"/>
@@ -1260,7 +1528,7 @@
       </w:r>
       <w:r>
         <w:rPr>
-          <w:rFonts w:eastAsia="Times New Roman" w:cs="等线" w:ascii="Times New Roman" w:hAnsi="Times New Roman"/>
+          <w:rFonts w:eastAsia="Noto Sans" w:cs="等线" w:ascii="Noto Sans" w:hAnsi="Noto Sans"/>
           <w:sz w:val="20"/>
           <w:szCs w:val="20"/>
           <w:lang w:val="en-US" w:eastAsia="zh-CN"/>
@@ -1269,12 +1537,22 @@
       </w:r>
       <w:r>
         <w:rPr>
-          <w:rFonts w:ascii="Times New Roman" w:hAnsi="Times New Roman" w:cs="等线" w:eastAsia="Times New Roman"/>
+          <w:rFonts w:ascii="Noto Sans" w:hAnsi="Noto Sans" w:cs="等线" w:eastAsia="Noto Sans"/>
           <w:sz w:val="20"/>
           <w:szCs w:val="20"/>
           <w:lang w:val="en-US" w:eastAsia="zh-CN"/>
         </w:rPr>
         <w:t>即可。</w:t>
+      </w:r>
+      <w:r>
+        <w:rPr>
+          <w:rFonts w:ascii="Noto Sans" w:hAnsi="Noto Sans" w:cs="等线" w:eastAsia="Noto Sans"/>
+          <w:color w:val="C9211E"/>
+          <w:sz w:val="20"/>
+          <w:szCs w:val="20"/>
+          <w:lang w:val="en-US" w:eastAsia="zh-CN"/>
+        </w:rPr>
+        <w:t>注意：请使用英文逗号，最好使用英文字母数字作为模型名称名称。</w:t>
       </w:r>
     </w:p>
     <w:p>
@@ -1286,17 +1564,15 @@
           <w:numId w:val="1"/>
         </w:numPr>
         <w:spacing w:lineRule="auto" w:line="240"/>
-        <w:ind w:left="0" w:hanging="0"/>
+        <w:ind w:hanging="0" w:left="0"/>
         <w:jc w:val="both"/>
         <w:rPr>
-          <w:rFonts w:ascii="Times New Roman" w:hAnsi="Times New Roman" w:eastAsia="Times New Roman"/>
-          <w:sz w:val="20"/>
-          <w:szCs w:val="20"/>
-        </w:rPr>
-      </w:pPr>
-      <w:r>
-        <w:rPr>
-          <w:rFonts w:ascii="Times New Roman" w:hAnsi="Times New Roman" w:cs="等线" w:eastAsia="Times New Roman"/>
+          <w:rFonts w:ascii="Noto Sans" w:hAnsi="Noto Sans" w:eastAsia="Noto Sans"/>
+        </w:rPr>
+      </w:pPr>
+      <w:r>
+        <w:rPr>
+          <w:rFonts w:ascii="Noto Sans" w:hAnsi="Noto Sans" w:cs="等线" w:eastAsia="Noto Sans"/>
           <w:sz w:val="20"/>
           <w:szCs w:val="20"/>
           <w:lang w:val="en-US" w:eastAsia="zh-CN"/>
@@ -1305,7 +1581,7 @@
       </w:r>
       <w:r>
         <w:rPr>
-          <w:rFonts w:eastAsia="Times New Roman" w:cs="等线" w:ascii="Times New Roman" w:hAnsi="Times New Roman"/>
+          <w:rFonts w:eastAsia="Noto Sans" w:cs="等线" w:ascii="Noto Sans" w:hAnsi="Noto Sans"/>
           <w:sz w:val="20"/>
           <w:szCs w:val="20"/>
           <w:lang w:val="en-US" w:eastAsia="zh-CN"/>
@@ -1314,7 +1590,7 @@
       </w:r>
       <w:r>
         <w:rPr>
-          <w:rFonts w:ascii="Times New Roman" w:hAnsi="Times New Roman" w:cs="等线" w:eastAsia="Times New Roman"/>
+          <w:rFonts w:ascii="Noto Sans" w:hAnsi="Noto Sans" w:cs="等线" w:eastAsia="Noto Sans"/>
           <w:sz w:val="20"/>
           <w:szCs w:val="20"/>
           <w:lang w:val="en-US" w:eastAsia="zh-CN"/>
@@ -1323,7 +1599,7 @@
       </w:r>
       <w:r>
         <w:rPr>
-          <w:rFonts w:eastAsia="Times New Roman" w:cs="等线" w:ascii="Times New Roman" w:hAnsi="Times New Roman"/>
+          <w:rFonts w:eastAsia="Noto Sans" w:cs="等线" w:ascii="Noto Sans" w:hAnsi="Noto Sans"/>
           <w:sz w:val="20"/>
           <w:szCs w:val="20"/>
           <w:lang w:val="en-US" w:eastAsia="zh-CN"/>
@@ -1340,14 +1616,14 @@
         </w:numPr>
         <w:bidi w:val="0"/>
         <w:spacing w:lineRule="auto" w:line="240"/>
-        <w:ind w:left="0" w:hanging="0"/>
-        <w:rPr>
-          <w:rFonts w:ascii="Times New Roman" w:hAnsi="Times New Roman" w:eastAsia="Times New Roman"/>
-        </w:rPr>
-      </w:pPr>
-      <w:r>
-        <w:rPr>
-          <w:rFonts w:ascii="Times New Roman" w:hAnsi="Times New Roman" w:cs="等线" w:eastAsia="Times New Roman"/>
+        <w:ind w:hanging="0" w:left="0"/>
+        <w:rPr>
+          <w:rFonts w:ascii="Noto Sans" w:hAnsi="Noto Sans" w:eastAsia="Noto Sans"/>
+        </w:rPr>
+      </w:pPr>
+      <w:r>
+        <w:rPr>
+          <w:rFonts w:ascii="Noto Sans" w:hAnsi="Noto Sans" w:cs="等线" w:eastAsia="Noto Sans"/>
           <w:b/>
           <w:bCs/>
           <w:sz w:val="21"/>
@@ -1366,17 +1642,15 @@
           <w:numId w:val="0"/>
         </w:numPr>
         <w:spacing w:lineRule="auto" w:line="240"/>
-        <w:ind w:left="0" w:hanging="0"/>
+        <w:ind w:hanging="0" w:left="0"/>
         <w:jc w:val="both"/>
         <w:rPr>
-          <w:rFonts w:ascii="Times New Roman" w:hAnsi="Times New Roman" w:eastAsia="Times New Roman"/>
-          <w:sz w:val="20"/>
-          <w:szCs w:val="20"/>
-        </w:rPr>
-      </w:pPr>
-      <w:r>
-        <w:rPr>
-          <w:rFonts w:eastAsia="Times New Roman" w:cs="等线" w:ascii="Times New Roman" w:hAnsi="Times New Roman"/>
+          <w:rFonts w:ascii="Noto Sans" w:hAnsi="Noto Sans" w:eastAsia="Noto Sans"/>
+        </w:rPr>
+      </w:pPr>
+      <w:r>
+        <w:rPr>
+          <w:rFonts w:eastAsia="Noto Sans" w:cs="等线" w:ascii="Noto Sans" w:hAnsi="Noto Sans"/>
           <w:sz w:val="20"/>
           <w:szCs w:val="20"/>
           <w:lang w:val="en-US" w:eastAsia="zh-CN"/>
@@ -1385,7 +1659,7 @@
       </w:r>
       <w:r>
         <w:rPr>
-          <w:rFonts w:ascii="Times New Roman" w:hAnsi="Times New Roman" w:cs="等线" w:eastAsia="Times New Roman"/>
+          <w:rFonts w:ascii="Noto Sans" w:hAnsi="Noto Sans" w:cs="等线" w:eastAsia="Noto Sans"/>
           <w:sz w:val="20"/>
           <w:szCs w:val="20"/>
           <w:lang w:val="en-US" w:eastAsia="zh-CN"/>
@@ -1394,16 +1668,16 @@
       </w:r>
       <w:r>
         <w:rPr>
-          <w:rFonts w:eastAsia="Times New Roman" w:cs="等线" w:ascii="Times New Roman" w:hAnsi="Times New Roman"/>
-          <w:sz w:val="20"/>
-          <w:szCs w:val="20"/>
-          <w:lang w:val="en-US" w:eastAsia="zh-CN"/>
-        </w:rPr>
-        <w:t>Qwen2-0.5B-Instruct</w:t>
-      </w:r>
-      <w:r>
-        <w:rPr>
-          <w:rFonts w:ascii="Times New Roman" w:hAnsi="Times New Roman" w:cs="等线" w:eastAsia="Times New Roman"/>
+          <w:rFonts w:eastAsia="Noto Sans" w:cs="等线" w:ascii="Noto Sans" w:hAnsi="Noto Sans"/>
+          <w:sz w:val="20"/>
+          <w:szCs w:val="20"/>
+          <w:lang w:val="en-US" w:eastAsia="zh-CN"/>
+        </w:rPr>
+        <w:t>Qwen3-0.6B-GGUF</w:t>
+      </w:r>
+      <w:r>
+        <w:rPr>
+          <w:rFonts w:ascii="Noto Sans" w:hAnsi="Noto Sans" w:cs="等线" w:eastAsia="Noto Sans"/>
           <w:sz w:val="20"/>
           <w:szCs w:val="20"/>
           <w:lang w:val="en-US" w:eastAsia="zh-CN"/>
@@ -1420,17 +1694,39 @@
           <w:numId w:val="0"/>
         </w:numPr>
         <w:spacing w:lineRule="auto" w:line="240"/>
-        <w:ind w:left="0" w:hanging="0"/>
+        <w:ind w:hanging="0" w:left="0"/>
         <w:jc w:val="both"/>
         <w:rPr>
-          <w:rFonts w:ascii="Times New Roman" w:hAnsi="Times New Roman" w:eastAsia="Times New Roman"/>
-          <w:sz w:val="20"/>
-          <w:szCs w:val="20"/>
-        </w:rPr>
-      </w:pPr>
-      <w:r>
-        <w:rPr>
-          <w:rFonts w:ascii="Times New Roman" w:hAnsi="Times New Roman" w:cs="等线" w:eastAsia="Times New Roman"/>
+          <w:rFonts w:cs="等线"/>
+          <w:sz w:val="20"/>
+          <w:szCs w:val="20"/>
+          <w:lang w:val="en-US" w:eastAsia="zh-CN"/>
+        </w:rPr>
+      </w:pPr>
+      <w:r>
+        <w:rPr>
+          <w:rFonts w:eastAsia="Noto Sans" w:ascii="Noto Sans" w:hAnsi="Noto Sans"/>
+        </w:rPr>
+      </w:r>
+    </w:p>
+    <w:p>
+      <w:pPr>
+        <w:pStyle w:val="Normal"/>
+        <w:widowControl w:val="false"/>
+        <w:numPr>
+          <w:ilvl w:val="0"/>
+          <w:numId w:val="0"/>
+        </w:numPr>
+        <w:spacing w:lineRule="auto" w:line="240"/>
+        <w:ind w:hanging="0" w:left="0"/>
+        <w:jc w:val="both"/>
+        <w:rPr>
+          <w:rFonts w:ascii="Noto Sans" w:hAnsi="Noto Sans" w:eastAsia="Noto Sans"/>
+        </w:rPr>
+      </w:pPr>
+      <w:r>
+        <w:rPr>
+          <w:rFonts w:ascii="Noto Sans" w:hAnsi="Noto Sans" w:cs="等线" w:eastAsia="Noto Sans"/>
           <w:sz w:val="20"/>
           <w:szCs w:val="20"/>
           <w:lang w:val="en-US" w:eastAsia="zh-CN"/>
@@ -1439,7 +1735,7 @@
       </w:r>
       <w:r>
         <w:rPr>
-          <w:rFonts w:eastAsia="Times New Roman" w:cs="等线" w:ascii="Times New Roman" w:hAnsi="Times New Roman"/>
+          <w:rFonts w:eastAsia="Noto Sans" w:cs="等线" w:ascii="Noto Sans" w:hAnsi="Noto Sans"/>
           <w:sz w:val="20"/>
           <w:szCs w:val="20"/>
           <w:lang w:val="en-US" w:eastAsia="zh-CN"/>
@@ -1448,7 +1744,7 @@
       </w:r>
       <w:r>
         <w:rPr>
-          <w:rFonts w:ascii="Times New Roman" w:hAnsi="Times New Roman" w:cs="等线" w:eastAsia="Times New Roman"/>
+          <w:rFonts w:ascii="Noto Sans" w:hAnsi="Noto Sans" w:cs="等线" w:eastAsia="Noto Sans"/>
           <w:sz w:val="20"/>
           <w:szCs w:val="20"/>
           <w:lang w:val="en-US" w:eastAsia="zh-CN"/>
@@ -1457,16 +1753,16 @@
       </w:r>
       <w:r>
         <w:rPr>
-          <w:rFonts w:eastAsia="Times New Roman" w:cs="等线" w:ascii="Times New Roman" w:hAnsi="Times New Roman"/>
-          <w:sz w:val="20"/>
-          <w:szCs w:val="20"/>
-          <w:lang w:val="en-US" w:eastAsia="zh-CN"/>
-        </w:rPr>
-        <w:t>Qwen2-0.5B-Instruct</w:t>
-      </w:r>
-      <w:r>
-        <w:rPr>
-          <w:rFonts w:ascii="Times New Roman" w:hAnsi="Times New Roman" w:cs="等线" w:eastAsia="Times New Roman"/>
+          <w:rFonts w:eastAsia="Noto Sans" w:cs="等线" w:ascii="Noto Sans" w:hAnsi="Noto Sans"/>
+          <w:sz w:val="20"/>
+          <w:szCs w:val="20"/>
+          <w:lang w:val="en-US" w:eastAsia="zh-CN"/>
+        </w:rPr>
+        <w:t>Qwen3-0.6B-GGUF</w:t>
+      </w:r>
+      <w:r>
+        <w:rPr>
+          <w:rFonts w:ascii="Noto Sans" w:hAnsi="Noto Sans" w:cs="等线" w:eastAsia="Noto Sans"/>
           <w:sz w:val="20"/>
           <w:szCs w:val="20"/>
           <w:lang w:val="en-US" w:eastAsia="zh-CN"/>
@@ -1475,16 +1771,25 @@
       </w:r>
       <w:r>
         <w:rPr>
-          <w:rFonts w:eastAsia="Times New Roman" w:cs="等线" w:ascii="Times New Roman" w:hAnsi="Times New Roman"/>
-          <w:sz w:val="20"/>
-          <w:szCs w:val="20"/>
-          <w:lang w:val="en-US" w:eastAsia="zh-CN"/>
-        </w:rPr>
-        <w:t>1GB</w:t>
-      </w:r>
-      <w:r>
-        <w:rPr>
-          <w:rFonts w:ascii="Times New Roman" w:hAnsi="Times New Roman" w:cs="等线" w:eastAsia="Times New Roman"/>
+          <w:rFonts w:eastAsia="Noto Sans" w:cs="等线" w:ascii="Noto Sans" w:hAnsi="Noto Sans"/>
+          <w:sz w:val="20"/>
+          <w:szCs w:val="20"/>
+          <w:lang w:val="en-US" w:eastAsia="zh-CN"/>
+        </w:rPr>
+        <w:t>0.7</w:t>
+      </w:r>
+      <w:r>
+        <w:rPr>
+          <w:rFonts w:eastAsia="Noto Sans" w:cs="等线" w:ascii="Noto Sans" w:hAnsi="Noto Sans"/>
+          <w:sz w:val="20"/>
+          <w:szCs w:val="20"/>
+          <w:lang w:val="en-US" w:eastAsia="zh-CN"/>
+        </w:rPr>
+        <w:t>GB</w:t>
+      </w:r>
+      <w:r>
+        <w:rPr>
+          <w:rFonts w:ascii="Noto Sans" w:hAnsi="Noto Sans" w:cs="等线" w:eastAsia="Noto Sans"/>
           <w:sz w:val="20"/>
           <w:szCs w:val="20"/>
           <w:lang w:val="en-US" w:eastAsia="zh-CN"/>
@@ -1493,16 +1798,16 @@
       </w:r>
       <w:r>
         <w:rPr>
-          <w:rFonts w:eastAsia="Times New Roman" w:cs="等线" w:ascii="Times New Roman" w:hAnsi="Times New Roman"/>
-          <w:sz w:val="20"/>
-          <w:szCs w:val="20"/>
-          <w:lang w:val="en-US" w:eastAsia="zh-CN"/>
-        </w:rPr>
-        <w:t>Qwen2-0.5B-Instruct</w:t>
-      </w:r>
-      <w:r>
-        <w:rPr>
-          <w:rFonts w:ascii="Times New Roman" w:hAnsi="Times New Roman" w:cs="等线" w:eastAsia="Times New Roman"/>
+          <w:rFonts w:eastAsia="Noto Sans" w:cs="等线" w:ascii="Noto Sans" w:hAnsi="Noto Sans"/>
+          <w:sz w:val="20"/>
+          <w:szCs w:val="20"/>
+          <w:lang w:val="en-US" w:eastAsia="zh-CN"/>
+        </w:rPr>
+        <w:t>Qwen3-0.6B-GGUF</w:t>
+      </w:r>
+      <w:r>
+        <w:rPr>
+          <w:rFonts w:ascii="Noto Sans" w:hAnsi="Noto Sans" w:cs="等线" w:eastAsia="Noto Sans"/>
           <w:sz w:val="20"/>
           <w:szCs w:val="20"/>
           <w:lang w:val="en-US" w:eastAsia="zh-CN"/>
@@ -1511,16 +1816,16 @@
       </w:r>
       <w:r>
         <w:rPr>
-          <w:rFonts w:eastAsia="Times New Roman" w:cs="等线" w:ascii="Times New Roman" w:hAnsi="Times New Roman"/>
-          <w:sz w:val="20"/>
-          <w:szCs w:val="20"/>
-          <w:lang w:val="en-US" w:eastAsia="zh-CN"/>
-        </w:rPr>
-        <w:t>Qwen2-1.5B-Instruct</w:t>
-      </w:r>
-      <w:r>
-        <w:rPr>
-          <w:rFonts w:ascii="Times New Roman" w:hAnsi="Times New Roman" w:cs="等线" w:eastAsia="Times New Roman"/>
+          <w:rFonts w:eastAsia="Noto Sans" w:cs="等线" w:ascii="Noto Sans" w:hAnsi="Noto Sans"/>
+          <w:sz w:val="20"/>
+          <w:szCs w:val="20"/>
+          <w:lang w:val="en-US" w:eastAsia="zh-CN"/>
+        </w:rPr>
+        <w:t xml:space="preserve">Qwen3-1.7B-GGUF </w:t>
+      </w:r>
+      <w:r>
+        <w:rPr>
+          <w:rFonts w:ascii="Noto Sans" w:hAnsi="Noto Sans" w:cs="等线" w:eastAsia="Noto Sans"/>
           <w:sz w:val="20"/>
           <w:szCs w:val="20"/>
           <w:lang w:val="en-US" w:eastAsia="zh-CN"/>
@@ -1529,16 +1834,25 @@
       </w:r>
       <w:r>
         <w:rPr>
-          <w:rFonts w:eastAsia="Times New Roman" w:cs="等线" w:ascii="Times New Roman" w:hAnsi="Times New Roman"/>
-          <w:sz w:val="20"/>
-          <w:szCs w:val="20"/>
-          <w:lang w:val="en-US" w:eastAsia="zh-CN"/>
-        </w:rPr>
-        <w:t>4GB</w:t>
-      </w:r>
-      <w:r>
-        <w:rPr>
-          <w:rFonts w:ascii="Times New Roman" w:hAnsi="Times New Roman" w:cs="等线" w:eastAsia="Times New Roman"/>
+          <w:rFonts w:eastAsia="Noto Sans" w:cs="等线" w:ascii="Noto Sans" w:hAnsi="Noto Sans"/>
+          <w:sz w:val="20"/>
+          <w:szCs w:val="20"/>
+          <w:lang w:val="en-US" w:eastAsia="zh-CN"/>
+        </w:rPr>
+        <w:t>1.9</w:t>
+      </w:r>
+      <w:r>
+        <w:rPr>
+          <w:rFonts w:eastAsia="Noto Sans" w:cs="等线" w:ascii="Noto Sans" w:hAnsi="Noto Sans"/>
+          <w:sz w:val="20"/>
+          <w:szCs w:val="20"/>
+          <w:lang w:val="en-US" w:eastAsia="zh-CN"/>
+        </w:rPr>
+        <w:t>GB</w:t>
+      </w:r>
+      <w:r>
+        <w:rPr>
+          <w:rFonts w:ascii="Noto Sans" w:hAnsi="Noto Sans" w:cs="等线" w:eastAsia="Noto Sans"/>
           <w:sz w:val="20"/>
           <w:szCs w:val="20"/>
           <w:lang w:val="en-US" w:eastAsia="zh-CN"/>
@@ -1547,7 +1861,7 @@
       </w:r>
       <w:r>
         <w:rPr>
-          <w:rFonts w:eastAsia="Times New Roman" w:cs="等线" w:ascii="Times New Roman" w:hAnsi="Times New Roman"/>
+          <w:rFonts w:eastAsia="Noto Sans" w:cs="等线" w:ascii="Noto Sans" w:hAnsi="Noto Sans"/>
           <w:sz w:val="20"/>
           <w:szCs w:val="20"/>
           <w:lang w:val="en-US" w:eastAsia="zh-CN"/>
@@ -1556,34 +1870,59 @@
       </w:r>
       <w:r>
         <w:rPr>
-          <w:rFonts w:ascii="Times New Roman" w:hAnsi="Times New Roman" w:cs="等线" w:eastAsia="Times New Roman"/>
-          <w:sz w:val="20"/>
-          <w:szCs w:val="20"/>
-          <w:lang w:val="en-US" w:eastAsia="zh-CN"/>
-        </w:rPr>
-        <w:t>。所以本应用只默认封装</w:t>
-      </w:r>
-      <w:r>
-        <w:rPr>
-          <w:rFonts w:eastAsia="Times New Roman" w:cs="等线" w:ascii="Times New Roman" w:hAnsi="Times New Roman"/>
-          <w:sz w:val="20"/>
-          <w:szCs w:val="20"/>
-          <w:lang w:val="en-US" w:eastAsia="zh-CN"/>
-        </w:rPr>
-        <w:t>Qwen2-0.5B-Instruct</w:t>
-      </w:r>
-      <w:r>
-        <w:rPr>
-          <w:rFonts w:ascii="Times New Roman" w:hAnsi="Times New Roman" w:cs="等线" w:eastAsia="Times New Roman"/>
-          <w:sz w:val="20"/>
-          <w:szCs w:val="20"/>
-          <w:lang w:val="en-US" w:eastAsia="zh-CN"/>
-        </w:rPr>
-        <w:t>模型。其他使用模型需要用户自行下载模型参数按 “</w:t>
-      </w:r>
-      <w:r>
-        <w:rPr>
-          <w:rFonts w:ascii="Times New Roman" w:hAnsi="Times New Roman" w:cs="等线" w:eastAsia="Times New Roman"/>
+          <w:rFonts w:ascii="Noto Sans" w:hAnsi="Noto Sans" w:cs="等线" w:eastAsia="Noto Sans"/>
+          <w:sz w:val="20"/>
+          <w:szCs w:val="20"/>
+          <w:lang w:val="en-US" w:eastAsia="zh-CN"/>
+        </w:rPr>
+        <w:t>。应用本身太大下载过程中可能出现网络中断等等问题导致下载应用失败，产生不良好的体验。</w:t>
+      </w:r>
+    </w:p>
+    <w:p>
+      <w:pPr>
+        <w:pStyle w:val="Normal"/>
+        <w:widowControl w:val="false"/>
+        <w:numPr>
+          <w:ilvl w:val="0"/>
+          <w:numId w:val="0"/>
+        </w:numPr>
+        <w:spacing w:lineRule="auto" w:line="240"/>
+        <w:ind w:hanging="0" w:left="0"/>
+        <w:jc w:val="both"/>
+        <w:rPr>
+          <w:rFonts w:ascii="Noto Sans" w:hAnsi="Noto Sans" w:eastAsia="Noto Sans"/>
+        </w:rPr>
+      </w:pPr>
+      <w:r>
+        <w:rPr>
+          <w:rFonts w:ascii="Noto Sans" w:hAnsi="Noto Sans" w:cs="等线" w:eastAsia="Noto Sans"/>
+          <w:sz w:val="20"/>
+          <w:szCs w:val="20"/>
+          <w:lang w:val="en-US" w:eastAsia="zh-CN"/>
+        </w:rPr>
+        <w:t>所以本应用只默认封装</w:t>
+      </w:r>
+      <w:r>
+        <w:rPr>
+          <w:rFonts w:eastAsia="Noto Sans" w:cs="等线" w:ascii="Noto Sans" w:hAnsi="Noto Sans"/>
+          <w:sz w:val="20"/>
+          <w:szCs w:val="20"/>
+          <w:lang w:val="en-US" w:eastAsia="zh-CN"/>
+        </w:rPr>
+        <w:t>Qwen3-0.6B-GGUF</w:t>
+      </w:r>
+      <w:r>
+        <w:rPr>
+          <w:rFonts w:ascii="Noto Sans" w:hAnsi="Noto Sans" w:cs="等线" w:eastAsia="Noto Sans"/>
+          <w:sz w:val="20"/>
+          <w:szCs w:val="20"/>
+          <w:lang w:val="en-US" w:eastAsia="zh-CN"/>
+        </w:rPr>
+        <w:t>模型。其他使用模型需要用户自行下载模型参数按本文档步骤三中 “</w:t>
+      </w:r>
+      <w:r>
+        <w:rPr>
+          <w:rFonts w:ascii="Noto Sans" w:hAnsi="Noto Sans" w:cs="等线" w:eastAsia="Noto Sans"/>
           <w:b/>
           <w:bCs/>
           <w:sz w:val="21"/>
@@ -1594,7 +1933,7 @@
       </w:r>
       <w:r>
         <w:rPr>
-          <w:rFonts w:eastAsia="Times New Roman" w:cs="等线" w:ascii="Times New Roman" w:hAnsi="Times New Roman"/>
+          <w:rFonts w:eastAsia="Noto Sans" w:cs="等线" w:ascii="Noto Sans" w:hAnsi="Noto Sans"/>
           <w:b/>
           <w:bCs/>
           <w:sz w:val="21"/>
@@ -1605,7 +1944,7 @@
       </w:r>
       <w:r>
         <w:rPr>
-          <w:rFonts w:ascii="Times New Roman" w:hAnsi="Times New Roman" w:cs="等线" w:eastAsia="Times New Roman"/>
+          <w:rFonts w:ascii="Noto Sans" w:hAnsi="Noto Sans" w:cs="等线" w:eastAsia="Noto Sans"/>
           <w:b/>
           <w:bCs/>
           <w:sz w:val="21"/>
@@ -1616,12 +1955,12 @@
       </w:r>
       <w:r>
         <w:rPr>
-          <w:rFonts w:ascii="Times New Roman" w:hAnsi="Times New Roman" w:cs="等线" w:eastAsia="Times New Roman"/>
-          <w:sz w:val="20"/>
-          <w:szCs w:val="20"/>
-          <w:lang w:val="en-US" w:eastAsia="zh-CN"/>
-        </w:rPr>
-        <w:t>” 自行完成操作。</w:t>
+          <w:rFonts w:ascii="Noto Sans" w:hAnsi="Noto Sans" w:cs="等线" w:eastAsia="Noto Sans"/>
+          <w:sz w:val="20"/>
+          <w:szCs w:val="20"/>
+          <w:lang w:val="en-US" w:eastAsia="zh-CN"/>
+        </w:rPr>
+        <w:t>” 提示，用户自行完成操作。</w:t>
       </w:r>
     </w:p>
     <w:p>
@@ -1629,17 +1968,17 @@
         <w:pStyle w:val="Normal"/>
         <w:widowControl w:val="false"/>
         <w:spacing w:lineRule="auto" w:line="240"/>
-        <w:ind w:left="0" w:hanging="0"/>
+        <w:ind w:hanging="0" w:left="0"/>
         <w:jc w:val="both"/>
         <w:rPr>
-          <w:rFonts w:ascii="Times New Roman" w:hAnsi="Times New Roman" w:eastAsia="Times New Roman"/>
-          <w:sz w:val="20"/>
-          <w:szCs w:val="20"/>
-        </w:rPr>
-      </w:pPr>
-      <w:r>
-        <w:rPr>
-          <w:rFonts w:eastAsia="Times New Roman" w:ascii="Times New Roman" w:hAnsi="Times New Roman"/>
+          <w:rFonts w:ascii="Noto Sans" w:hAnsi="Noto Sans" w:eastAsia="Noto Sans"/>
+          <w:sz w:val="20"/>
+          <w:szCs w:val="20"/>
+        </w:rPr>
+      </w:pPr>
+      <w:r>
+        <w:rPr>
+          <w:rFonts w:eastAsia="Noto Sans" w:ascii="Noto Sans" w:hAnsi="Noto Sans"/>
           <w:sz w:val="20"/>
           <w:szCs w:val="20"/>
         </w:rPr>
@@ -1650,17 +1989,15 @@
         <w:pStyle w:val="Normal"/>
         <w:widowControl w:val="false"/>
         <w:spacing w:lineRule="auto" w:line="240"/>
-        <w:ind w:left="0" w:hanging="0"/>
+        <w:ind w:hanging="0" w:left="0"/>
         <w:jc w:val="both"/>
         <w:rPr>
-          <w:rFonts w:ascii="Times New Roman" w:hAnsi="Times New Roman" w:eastAsia="Times New Roman"/>
-          <w:sz w:val="20"/>
-          <w:szCs w:val="20"/>
-        </w:rPr>
-      </w:pPr>
-      <w:r>
-        <w:rPr>
-          <w:rFonts w:eastAsia="Times New Roman" w:cs="等线" w:ascii="Times New Roman" w:hAnsi="Times New Roman"/>
+          <w:rFonts w:ascii="Noto Sans" w:hAnsi="Noto Sans" w:eastAsia="Noto Sans"/>
+        </w:rPr>
+      </w:pPr>
+      <w:r>
+        <w:rPr>
+          <w:rFonts w:eastAsia="Noto Sans" w:cs="等线" w:ascii="Noto Sans" w:hAnsi="Noto Sans"/>
           <w:sz w:val="20"/>
           <w:szCs w:val="20"/>
           <w:lang w:val="en-US" w:eastAsia="zh-CN"/>
@@ -1669,7 +2006,7 @@
       </w:r>
       <w:r>
         <w:rPr>
-          <w:rFonts w:ascii="Times New Roman" w:hAnsi="Times New Roman" w:cs="等线" w:eastAsia="Times New Roman"/>
+          <w:rFonts w:ascii="Noto Sans" w:hAnsi="Noto Sans" w:cs="等线" w:eastAsia="Noto Sans"/>
           <w:sz w:val="20"/>
           <w:szCs w:val="20"/>
           <w:lang w:val="en-US" w:eastAsia="zh-CN"/>
@@ -1678,7 +2015,7 @@
       </w:r>
       <w:r>
         <w:rPr>
-          <w:rFonts w:eastAsia="Times New Roman" w:cs="等线" w:ascii="Times New Roman" w:hAnsi="Times New Roman"/>
+          <w:rFonts w:eastAsia="Noto Sans" w:cs="等线" w:ascii="Noto Sans" w:hAnsi="Noto Sans"/>
           <w:sz w:val="20"/>
           <w:szCs w:val="20"/>
           <w:lang w:val="en-US" w:eastAsia="zh-CN"/>
@@ -1687,7 +2024,7 @@
       </w:r>
       <w:r>
         <w:rPr>
-          <w:rFonts w:ascii="Times New Roman" w:hAnsi="Times New Roman" w:cs="等线" w:eastAsia="Times New Roman"/>
+          <w:rFonts w:ascii="Noto Sans" w:hAnsi="Noto Sans" w:cs="等线" w:eastAsia="Noto Sans"/>
           <w:sz w:val="20"/>
           <w:szCs w:val="20"/>
           <w:lang w:val="en-US" w:eastAsia="zh-CN"/>
@@ -1700,148 +2037,19 @@
         <w:pStyle w:val="Normal"/>
         <w:widowControl w:val="false"/>
         <w:spacing w:lineRule="auto" w:line="240"/>
-        <w:ind w:left="0" w:hanging="0"/>
+        <w:ind w:hanging="0" w:left="0"/>
         <w:jc w:val="both"/>
         <w:rPr>
-          <w:rFonts w:ascii="Times New Roman" w:hAnsi="Times New Roman" w:eastAsia="Times New Roman"/>
-          <w:sz w:val="20"/>
-          <w:szCs w:val="20"/>
-        </w:rPr>
-      </w:pPr>
-      <w:r>
-        <w:rPr>
-          <w:rFonts w:ascii="Times New Roman" w:hAnsi="Times New Roman" w:cs="等线" w:eastAsia="Times New Roman"/>
-          <w:sz w:val="20"/>
-          <w:szCs w:val="20"/>
-          <w:lang w:val="en-US" w:eastAsia="zh-CN"/>
-        </w:rPr>
-        <w:t>答：实际测试过</w:t>
-      </w:r>
-      <w:r>
-        <w:rPr>
-          <w:rFonts w:eastAsia="Times New Roman" w:cs="等线" w:ascii="Times New Roman" w:hAnsi="Times New Roman"/>
-          <w:sz w:val="20"/>
-          <w:szCs w:val="20"/>
-          <w:lang w:val="en-US" w:eastAsia="zh-CN"/>
-        </w:rPr>
-        <w:t>Qwen2-0.5B-Instruct</w:t>
-      </w:r>
-      <w:r>
-        <w:rPr>
-          <w:rFonts w:ascii="Times New Roman" w:hAnsi="Times New Roman" w:cs="等线" w:eastAsia="Times New Roman"/>
-          <w:sz w:val="20"/>
-          <w:szCs w:val="20"/>
-          <w:lang w:val="en-US" w:eastAsia="zh-CN"/>
-        </w:rPr>
-        <w:t>，</w:t>
-      </w:r>
-      <w:r>
-        <w:rPr>
-          <w:rFonts w:eastAsia="Times New Roman" w:cs="等线" w:ascii="Times New Roman" w:hAnsi="Times New Roman"/>
-          <w:sz w:val="20"/>
-          <w:szCs w:val="20"/>
-          <w:lang w:val="en-US" w:eastAsia="zh-CN"/>
-        </w:rPr>
-        <w:t>Qwen2-1.5B-Instruct</w:t>
-      </w:r>
-      <w:r>
-        <w:rPr>
-          <w:rFonts w:ascii="Times New Roman" w:hAnsi="Times New Roman" w:cs="等线" w:eastAsia="Times New Roman"/>
-          <w:sz w:val="20"/>
-          <w:szCs w:val="20"/>
-          <w:lang w:val="en-US" w:eastAsia="zh-CN"/>
-        </w:rPr>
-        <w:t>，</w:t>
-      </w:r>
-      <w:r>
-        <w:rPr>
-          <w:rFonts w:eastAsia="Times New Roman" w:cs="等线" w:ascii="Times New Roman" w:hAnsi="Times New Roman"/>
-          <w:sz w:val="20"/>
-          <w:szCs w:val="20"/>
-          <w:lang w:val="en-US" w:eastAsia="zh-CN"/>
-        </w:rPr>
-        <w:t>Qwen2-7B-Instruct</w:t>
-      </w:r>
-      <w:r>
-        <w:rPr>
-          <w:rFonts w:ascii="Times New Roman" w:hAnsi="Times New Roman" w:cs="等线" w:eastAsia="Times New Roman"/>
-          <w:sz w:val="20"/>
-          <w:szCs w:val="20"/>
-          <w:lang w:val="en-US" w:eastAsia="zh-CN"/>
-        </w:rPr>
-        <w:t>这三个模型，完全可以正常使用。至于</w:t>
-      </w:r>
-      <w:r>
-        <w:rPr>
-          <w:rFonts w:eastAsia="Times New Roman" w:cs="等线" w:ascii="Times New Roman" w:hAnsi="Times New Roman"/>
-          <w:sz w:val="20"/>
-          <w:szCs w:val="20"/>
-          <w:lang w:val="en-US" w:eastAsia="zh-CN"/>
-        </w:rPr>
-        <w:t>Qwen2</w:t>
-      </w:r>
-      <w:r>
-        <w:rPr>
-          <w:rFonts w:ascii="Times New Roman" w:hAnsi="Times New Roman" w:cs="等线" w:eastAsia="Times New Roman"/>
-          <w:sz w:val="20"/>
-          <w:szCs w:val="20"/>
-          <w:lang w:val="en-US" w:eastAsia="zh-CN"/>
-        </w:rPr>
-        <w:t xml:space="preserve">的其他模型例如 </w:t>
-      </w:r>
-      <w:r>
-        <w:rPr>
-          <w:rFonts w:eastAsia="Times New Roman" w:cs="等线" w:ascii="Times New Roman" w:hAnsi="Times New Roman"/>
-          <w:sz w:val="20"/>
-          <w:szCs w:val="20"/>
-          <w:lang w:val="en-US" w:eastAsia="zh-CN"/>
-        </w:rPr>
-        <w:t>Qwen2-57B-A14B-Instruct</w:t>
-      </w:r>
-      <w:r>
-        <w:rPr>
-          <w:rFonts w:ascii="Times New Roman" w:hAnsi="Times New Roman" w:cs="等线" w:eastAsia="Times New Roman"/>
-          <w:sz w:val="20"/>
-          <w:szCs w:val="20"/>
-          <w:lang w:val="en-US" w:eastAsia="zh-CN"/>
-        </w:rPr>
-        <w:t xml:space="preserve">， </w:t>
-      </w:r>
-      <w:r>
-        <w:rPr>
-          <w:rFonts w:eastAsia="Times New Roman" w:cs="等线" w:ascii="Times New Roman" w:hAnsi="Times New Roman"/>
-          <w:sz w:val="20"/>
-          <w:szCs w:val="20"/>
-          <w:lang w:val="en-US" w:eastAsia="zh-CN"/>
-        </w:rPr>
-        <w:t xml:space="preserve">Qwen2-72B-Instruct </w:t>
-      </w:r>
-      <w:r>
-        <w:rPr>
-          <w:rFonts w:ascii="Times New Roman" w:hAnsi="Times New Roman" w:cs="等线" w:eastAsia="Times New Roman"/>
-          <w:sz w:val="20"/>
-          <w:szCs w:val="20"/>
-          <w:lang w:val="en-US" w:eastAsia="zh-CN"/>
-        </w:rPr>
-        <w:t xml:space="preserve">等等这些 </w:t>
-      </w:r>
-      <w:r>
-        <w:rPr>
-          <w:rFonts w:eastAsia="Times New Roman" w:cs="等线" w:ascii="Times New Roman" w:hAnsi="Times New Roman"/>
-          <w:sz w:val="20"/>
-          <w:szCs w:val="20"/>
-          <w:lang w:val="en-US" w:eastAsia="zh-CN"/>
-        </w:rPr>
-        <w:t>Qwen2</w:t>
-      </w:r>
-      <w:r>
-        <w:rPr>
-          <w:rFonts w:ascii="Times New Roman" w:hAnsi="Times New Roman" w:cs="等线" w:eastAsia="Times New Roman"/>
-          <w:sz w:val="20"/>
-          <w:szCs w:val="20"/>
-          <w:lang w:val="en-US" w:eastAsia="zh-CN"/>
-        </w:rPr>
-        <w:t>系列的模型，碍于开发者电脑配置有限，未能实测。但是理论上应该是可以支持新增并正常使用的。</w:t>
+          <w:rFonts w:cs="等线"/>
+          <w:sz w:val="20"/>
+          <w:szCs w:val="20"/>
+          <w:lang w:val="en-US" w:eastAsia="zh-CN"/>
+        </w:rPr>
+      </w:pPr>
+      <w:r>
+        <w:rPr>
+          <w:rFonts w:eastAsia="Noto Sans" w:ascii="Noto Sans" w:hAnsi="Noto Sans"/>
+        </w:rPr>
       </w:r>
     </w:p>
     <w:p>
@@ -1849,20 +2057,65 @@
         <w:pStyle w:val="Normal"/>
         <w:widowControl w:val="false"/>
         <w:spacing w:lineRule="auto" w:line="240"/>
-        <w:ind w:left="0" w:hanging="0"/>
+        <w:ind w:hanging="0" w:left="0"/>
         <w:jc w:val="both"/>
         <w:rPr>
-          <w:rFonts w:ascii="Times New Roman" w:hAnsi="Times New Roman" w:eastAsia="Times New Roman"/>
-          <w:sz w:val="20"/>
-          <w:szCs w:val="20"/>
-        </w:rPr>
-      </w:pPr>
-      <w:r>
-        <w:rPr>
-          <w:rFonts w:eastAsia="Times New Roman" w:ascii="Times New Roman" w:hAnsi="Times New Roman"/>
-          <w:sz w:val="20"/>
-          <w:szCs w:val="20"/>
-        </w:rPr>
+          <w:rFonts w:ascii="Noto Sans" w:hAnsi="Noto Sans" w:eastAsia="Noto Sans"/>
+        </w:rPr>
+      </w:pPr>
+      <w:r>
+        <w:rPr>
+          <w:rFonts w:ascii="Noto Sans" w:hAnsi="Noto Sans" w:cs="等线" w:eastAsia="Noto Sans"/>
+          <w:sz w:val="20"/>
+          <w:szCs w:val="20"/>
+          <w:lang w:val="en-US" w:eastAsia="zh-CN"/>
+        </w:rPr>
+        <w:t>答：理论上所有支持</w:t>
+      </w:r>
+      <w:r>
+        <w:rPr>
+          <w:rFonts w:eastAsia="Noto Sans" w:cs="等线" w:ascii="Noto Sans" w:hAnsi="Noto Sans"/>
+          <w:sz w:val="20"/>
+          <w:szCs w:val="20"/>
+          <w:lang w:val="en-US" w:eastAsia="zh-CN"/>
+        </w:rPr>
+        <w:t>llama.</w:t>
+      </w:r>
+      <w:r>
+        <w:rPr>
+          <w:rFonts w:eastAsia="Noto Sans" w:cs="等线" w:ascii="Noto Sans" w:hAnsi="Noto Sans"/>
+          <w:sz w:val="20"/>
+          <w:szCs w:val="20"/>
+          <w:lang w:val="en-US" w:eastAsia="zh-CN"/>
+        </w:rPr>
+        <w:t xml:space="preserve">ccp </w:t>
+      </w:r>
+      <w:r>
+        <w:rPr>
+          <w:rFonts w:ascii="Noto Sans" w:hAnsi="Noto Sans" w:cs="等线" w:eastAsia="Noto Sans"/>
+          <w:sz w:val="20"/>
+          <w:szCs w:val="20"/>
+          <w:lang w:val="en-US" w:eastAsia="zh-CN"/>
+        </w:rPr>
+        <w:t>加载的模型都可以支持。目前本应用关注的模型主要</w:t>
+      </w:r>
+      <w:r>
+        <w:rPr>
+          <w:rFonts w:eastAsia="Noto Sans" w:cs="等线" w:ascii="Noto Sans" w:hAnsi="Noto Sans"/>
+          <w:sz w:val="20"/>
+          <w:szCs w:val="20"/>
+          <w:lang w:val="en-US" w:eastAsia="zh-CN"/>
+        </w:rPr>
+        <w:t>Qwen3 GGUF</w:t>
+      </w:r>
+      <w:r>
+        <w:rPr>
+          <w:rFonts w:ascii="Noto Sans" w:hAnsi="Noto Sans" w:cs="等线" w:eastAsia="Noto Sans"/>
+          <w:sz w:val="20"/>
+          <w:szCs w:val="20"/>
+          <w:lang w:val="en-US" w:eastAsia="zh-CN"/>
+        </w:rPr>
+        <w:t>类型的大模型支持。</w:t>
       </w:r>
     </w:p>
     <w:p>
@@ -1870,112 +2123,20 @@
         <w:pStyle w:val="Normal"/>
         <w:widowControl w:val="false"/>
         <w:spacing w:lineRule="auto" w:line="240"/>
-        <w:ind w:left="0" w:hanging="0"/>
+        <w:ind w:hanging="0" w:left="0"/>
         <w:jc w:val="both"/>
         <w:rPr>
-          <w:rFonts w:ascii="Times New Roman" w:hAnsi="Times New Roman" w:eastAsia="Times New Roman"/>
-          <w:sz w:val="20"/>
-          <w:szCs w:val="20"/>
-        </w:rPr>
-      </w:pPr>
-      <w:r>
-        <w:rPr>
-          <w:rFonts w:ascii="Times New Roman" w:hAnsi="Times New Roman" w:cs="等线" w:eastAsia="Times New Roman"/>
-          <w:sz w:val="20"/>
-          <w:szCs w:val="20"/>
-          <w:lang w:val="en-US" w:eastAsia="zh-CN"/>
-        </w:rPr>
-        <w:t xml:space="preserve">小提示： </w:t>
-      </w:r>
-      <w:r>
-        <w:rPr>
-          <w:rFonts w:eastAsia="Times New Roman" w:cs="等线" w:ascii="Times New Roman" w:hAnsi="Times New Roman"/>
-          <w:sz w:val="20"/>
-          <w:szCs w:val="20"/>
-          <w:lang w:val="en-US" w:eastAsia="zh-CN"/>
-        </w:rPr>
-        <w:t>Qwen2-57B-A14B-Instruct</w:t>
-      </w:r>
-      <w:r>
-        <w:rPr>
-          <w:rFonts w:ascii="Times New Roman" w:hAnsi="Times New Roman" w:cs="等线" w:eastAsia="Times New Roman"/>
-          <w:sz w:val="20"/>
-          <w:szCs w:val="20"/>
-          <w:lang w:val="en-US" w:eastAsia="zh-CN"/>
-        </w:rPr>
-        <w:t xml:space="preserve">， </w:t>
-      </w:r>
-      <w:r>
-        <w:rPr>
-          <w:rFonts w:eastAsia="Times New Roman" w:cs="等线" w:ascii="Times New Roman" w:hAnsi="Times New Roman"/>
-          <w:sz w:val="20"/>
-          <w:szCs w:val="20"/>
-          <w:lang w:val="en-US" w:eastAsia="zh-CN"/>
-        </w:rPr>
-        <w:t>Qwen2-72B-Instruct</w:t>
-      </w:r>
-      <w:r>
-        <w:rPr>
-          <w:rFonts w:ascii="Times New Roman" w:hAnsi="Times New Roman" w:cs="等线" w:eastAsia="Times New Roman"/>
-          <w:sz w:val="20"/>
-          <w:szCs w:val="20"/>
-          <w:lang w:val="en-US" w:eastAsia="zh-CN"/>
-        </w:rPr>
-        <w:t>这些超高模型参数的电脑配置必须要有英伟达支持</w:t>
-      </w:r>
-      <w:r>
-        <w:rPr>
-          <w:rFonts w:eastAsia="Times New Roman" w:cs="等线" w:ascii="Times New Roman" w:hAnsi="Times New Roman"/>
-          <w:sz w:val="20"/>
-          <w:szCs w:val="20"/>
-          <w:lang w:val="en-US" w:eastAsia="zh-CN"/>
-        </w:rPr>
-        <w:t>CUDA</w:t>
-      </w:r>
-      <w:r>
-        <w:rPr>
-          <w:rFonts w:ascii="Times New Roman" w:hAnsi="Times New Roman" w:cs="等线" w:eastAsia="Times New Roman"/>
-          <w:sz w:val="20"/>
-          <w:szCs w:val="20"/>
-          <w:lang w:val="en-US" w:eastAsia="zh-CN"/>
-        </w:rPr>
-        <w:t>加速功能的显卡，并且电脑内存也要非常大（</w:t>
-      </w:r>
-      <w:r>
-        <w:rPr>
-          <w:rFonts w:eastAsia="Times New Roman" w:cs="等线" w:ascii="Times New Roman" w:hAnsi="Times New Roman"/>
-          <w:sz w:val="20"/>
-          <w:szCs w:val="20"/>
-          <w:lang w:val="en-US" w:eastAsia="zh-CN"/>
-        </w:rPr>
-        <w:t>&gt;32GB</w:t>
-      </w:r>
-      <w:r>
-        <w:rPr>
-          <w:rFonts w:ascii="Times New Roman" w:hAnsi="Times New Roman" w:cs="等线" w:eastAsia="Times New Roman"/>
-          <w:sz w:val="20"/>
-          <w:szCs w:val="20"/>
-          <w:lang w:val="en-US" w:eastAsia="zh-CN"/>
-        </w:rPr>
-        <w:t xml:space="preserve">）才可能运行。具体请参考 </w:t>
-      </w:r>
-      <w:r>
-        <w:rPr>
-          <w:rFonts w:eastAsia="Times New Roman" w:cs="等线" w:ascii="Times New Roman" w:hAnsi="Times New Roman"/>
-          <w:sz w:val="20"/>
-          <w:szCs w:val="20"/>
-          <w:lang w:val="en-US" w:eastAsia="zh-CN"/>
-        </w:rPr>
-        <w:t>Qwen2</w:t>
-      </w:r>
-      <w:r>
-        <w:rPr>
-          <w:rFonts w:ascii="Times New Roman" w:hAnsi="Times New Roman" w:cs="等线" w:eastAsia="Times New Roman"/>
-          <w:sz w:val="20"/>
-          <w:szCs w:val="20"/>
-          <w:lang w:val="en-US" w:eastAsia="zh-CN"/>
-        </w:rPr>
-        <w:t>相关模型的配置要求。</w:t>
+          <w:rFonts w:ascii="Noto Sans" w:hAnsi="Noto Sans" w:eastAsia="Noto Sans"/>
+          <w:sz w:val="20"/>
+          <w:szCs w:val="20"/>
+        </w:rPr>
+      </w:pPr>
+      <w:r>
+        <w:rPr>
+          <w:rFonts w:eastAsia="Noto Sans" w:ascii="Noto Sans" w:hAnsi="Noto Sans"/>
+          <w:sz w:val="20"/>
+          <w:szCs w:val="20"/>
+        </w:rPr>
       </w:r>
     </w:p>
     <w:p>
@@ -1983,17 +2144,17 @@
         <w:pStyle w:val="Normal"/>
         <w:widowControl w:val="false"/>
         <w:spacing w:lineRule="auto" w:line="240"/>
-        <w:ind w:left="0" w:hanging="0"/>
+        <w:ind w:hanging="0" w:left="0"/>
         <w:jc w:val="both"/>
         <w:rPr>
-          <w:rFonts w:ascii="Times New Roman" w:hAnsi="Times New Roman" w:eastAsia="Times New Roman"/>
-          <w:sz w:val="20"/>
-          <w:szCs w:val="20"/>
-        </w:rPr>
-      </w:pPr>
-      <w:r>
-        <w:rPr>
-          <w:rFonts w:eastAsia="Times New Roman" w:ascii="Times New Roman" w:hAnsi="Times New Roman"/>
+          <w:rFonts w:ascii="Noto Sans" w:hAnsi="Noto Sans" w:eastAsia="Noto Sans"/>
+          <w:sz w:val="20"/>
+          <w:szCs w:val="20"/>
+        </w:rPr>
+      </w:pPr>
+      <w:r>
+        <w:rPr>
+          <w:rFonts w:eastAsia="Noto Sans" w:ascii="Noto Sans" w:hAnsi="Noto Sans"/>
           <w:sz w:val="20"/>
           <w:szCs w:val="20"/>
         </w:rPr>
@@ -2004,17 +2165,17 @@
         <w:pStyle w:val="Normal"/>
         <w:widowControl w:val="false"/>
         <w:spacing w:lineRule="auto" w:line="240"/>
-        <w:ind w:left="0" w:hanging="0"/>
+        <w:ind w:hanging="0" w:left="0"/>
         <w:jc w:val="both"/>
         <w:rPr>
-          <w:rFonts w:ascii="Times New Roman" w:hAnsi="Times New Roman" w:eastAsia="Times New Roman"/>
-          <w:sz w:val="20"/>
-          <w:szCs w:val="20"/>
-        </w:rPr>
-      </w:pPr>
-      <w:r>
-        <w:rPr>
-          <w:rFonts w:eastAsia="Times New Roman" w:ascii="Times New Roman" w:hAnsi="Times New Roman"/>
+          <w:rFonts w:ascii="Noto Sans" w:hAnsi="Noto Sans" w:eastAsia="Noto Sans"/>
+          <w:sz w:val="20"/>
+          <w:szCs w:val="20"/>
+        </w:rPr>
+      </w:pPr>
+      <w:r>
+        <w:rPr>
+          <w:rFonts w:eastAsia="Noto Sans" w:ascii="Noto Sans" w:hAnsi="Noto Sans"/>
           <w:sz w:val="20"/>
           <w:szCs w:val="20"/>
         </w:rPr>
@@ -2025,17 +2186,17 @@
         <w:pStyle w:val="Normal"/>
         <w:widowControl w:val="false"/>
         <w:spacing w:lineRule="auto" w:line="240"/>
-        <w:ind w:left="0" w:hanging="0"/>
+        <w:ind w:hanging="0" w:left="0"/>
         <w:jc w:val="both"/>
         <w:rPr>
-          <w:rFonts w:ascii="Times New Roman" w:hAnsi="Times New Roman" w:eastAsia="Times New Roman"/>
-          <w:sz w:val="20"/>
-          <w:szCs w:val="20"/>
-        </w:rPr>
-      </w:pPr>
-      <w:r>
-        <w:rPr>
-          <w:rFonts w:eastAsia="Times New Roman" w:ascii="Times New Roman" w:hAnsi="Times New Roman"/>
+          <w:rFonts w:ascii="Noto Sans" w:hAnsi="Noto Sans" w:eastAsia="Noto Sans"/>
+          <w:sz w:val="20"/>
+          <w:szCs w:val="20"/>
+        </w:rPr>
+      </w:pPr>
+      <w:r>
+        <w:rPr>
+          <w:rFonts w:eastAsia="Noto Sans" w:ascii="Noto Sans" w:hAnsi="Noto Sans"/>
           <w:sz w:val="20"/>
           <w:szCs w:val="20"/>
         </w:rPr>
@@ -2046,17 +2207,17 @@
         <w:pStyle w:val="Normal"/>
         <w:widowControl w:val="false"/>
         <w:spacing w:lineRule="auto" w:line="240"/>
-        <w:ind w:left="0" w:hanging="0"/>
+        <w:ind w:hanging="0" w:left="0"/>
         <w:jc w:val="both"/>
         <w:rPr>
-          <w:rFonts w:ascii="Times New Roman" w:hAnsi="Times New Roman" w:eastAsia="Times New Roman"/>
-          <w:sz w:val="20"/>
-          <w:szCs w:val="20"/>
-        </w:rPr>
-      </w:pPr>
-      <w:r>
-        <w:rPr>
-          <w:rFonts w:eastAsia="Times New Roman" w:ascii="Times New Roman" w:hAnsi="Times New Roman"/>
+          <w:rFonts w:ascii="Noto Sans" w:hAnsi="Noto Sans" w:eastAsia="Noto Sans"/>
+          <w:sz w:val="20"/>
+          <w:szCs w:val="20"/>
+        </w:rPr>
+      </w:pPr>
+      <w:r>
+        <w:rPr>
+          <w:rFonts w:eastAsia="Noto Sans" w:ascii="Noto Sans" w:hAnsi="Noto Sans"/>
           <w:sz w:val="20"/>
           <w:szCs w:val="20"/>
         </w:rPr>
@@ -2067,38 +2228,17 @@
         <w:pStyle w:val="Normal"/>
         <w:widowControl w:val="false"/>
         <w:spacing w:lineRule="auto" w:line="240"/>
-        <w:ind w:left="0" w:hanging="0"/>
+        <w:ind w:hanging="0" w:left="0"/>
         <w:jc w:val="both"/>
         <w:rPr>
-          <w:rFonts w:ascii="Times New Roman" w:hAnsi="Times New Roman" w:eastAsia="Times New Roman"/>
-          <w:sz w:val="20"/>
-          <w:szCs w:val="20"/>
-        </w:rPr>
-      </w:pPr>
-      <w:r>
-        <w:rPr>
-          <w:rFonts w:eastAsia="Times New Roman" w:ascii="Times New Roman" w:hAnsi="Times New Roman"/>
-          <w:sz w:val="20"/>
-          <w:szCs w:val="20"/>
-        </w:rPr>
-      </w:r>
-    </w:p>
-    <w:p>
-      <w:pPr>
-        <w:pStyle w:val="Normal"/>
-        <w:widowControl w:val="false"/>
-        <w:spacing w:lineRule="auto" w:line="240"/>
-        <w:ind w:left="0" w:hanging="0"/>
-        <w:jc w:val="both"/>
-        <w:rPr>
-          <w:rFonts w:ascii="Times New Roman" w:hAnsi="Times New Roman" w:eastAsia="Times New Roman"/>
-          <w:sz w:val="20"/>
-          <w:szCs w:val="20"/>
-        </w:rPr>
-      </w:pPr>
-      <w:r>
-        <w:rPr>
-          <w:rFonts w:eastAsia="Times New Roman" w:ascii="Times New Roman" w:hAnsi="Times New Roman"/>
+          <w:rFonts w:ascii="Noto Sans" w:hAnsi="Noto Sans" w:eastAsia="Noto Sans"/>
+          <w:sz w:val="20"/>
+          <w:szCs w:val="20"/>
+        </w:rPr>
+      </w:pPr>
+      <w:r>
+        <w:rPr>
+          <w:rFonts w:eastAsia="Noto Sans" w:ascii="Noto Sans" w:hAnsi="Noto Sans"/>
           <w:sz w:val="20"/>
           <w:szCs w:val="20"/>
         </w:rPr>
@@ -2111,12 +2251,12 @@
         <w:spacing w:lineRule="auto" w:line="240"/>
         <w:jc w:val="center"/>
         <w:rPr>
-          <w:rFonts w:ascii="Times New Roman" w:hAnsi="Times New Roman" w:eastAsia="Times New Roman"/>
-        </w:rPr>
-      </w:pPr>
-      <w:r>
-        <w:rPr>
-          <w:rFonts w:ascii="Times New Roman" w:hAnsi="Times New Roman" w:cs="等线" w:eastAsia="Times New Roman"/>
+          <w:rFonts w:ascii="Noto Sans" w:hAnsi="Noto Sans" w:eastAsia="Noto Sans"/>
+        </w:rPr>
+      </w:pPr>
+      <w:r>
+        <w:rPr>
+          <w:rFonts w:ascii="Noto Sans" w:hAnsi="Noto Sans" w:cs="等线" w:eastAsia="Noto Sans"/>
           <w:sz w:val="24"/>
           <w:szCs w:val="24"/>
           <w:lang w:val="en-US" w:eastAsia="zh-CN"/>
@@ -2130,19 +2270,36 @@
         <w:spacing w:lineRule="auto" w:line="240"/>
         <w:jc w:val="center"/>
         <w:rPr>
-          <w:rFonts w:ascii="Times New Roman" w:hAnsi="Times New Roman" w:eastAsia="Times New Roman"/>
+          <w:rFonts w:ascii="Noto Sans" w:hAnsi="Noto Sans" w:eastAsia="Noto Sans"/>
+        </w:rPr>
+      </w:pPr>
+      <w:r>
+        <w:rPr>
+          <w:rFonts w:ascii="Noto Sans" w:hAnsi="Noto Sans" w:cs="等线" w:eastAsia="Noto Sans"/>
           <w:sz w:val="16"/>
           <w:szCs w:val="16"/>
-        </w:rPr>
-      </w:pPr>
-      <w:r>
-        <w:rPr>
-          <w:rFonts w:ascii="Times New Roman" w:hAnsi="Times New Roman" w:cs="等线" w:eastAsia="Times New Roman"/>
+          <w:lang w:val="en-US" w:eastAsia="zh-CN"/>
+        </w:rPr>
+        <w:t>如有描述不清、描述不符甚至描述有误的，敬请谅解。</w:t>
+      </w:r>
+    </w:p>
+    <w:p>
+      <w:pPr>
+        <w:pStyle w:val="Normal"/>
+        <w:spacing w:lineRule="auto" w:line="240"/>
+        <w:jc w:val="center"/>
+        <w:rPr>
+          <w:rFonts w:ascii="Noto Sans" w:hAnsi="Noto Sans" w:eastAsia="Noto Sans"/>
+        </w:rPr>
+      </w:pPr>
+      <w:r>
+        <w:rPr>
+          <w:rFonts w:ascii="Noto Sans" w:hAnsi="Noto Sans" w:cs="等线" w:eastAsia="Noto Sans"/>
           <w:sz w:val="16"/>
           <w:szCs w:val="16"/>
           <w:lang w:val="en-US" w:eastAsia="zh-CN"/>
         </w:rPr>
-        <w:t>如有描述不清、描述不符甚至描述有误的，敬请谅解。</w:t>
+        <w:t>如有描述与实际功能不符，请以应用的实际版本功能为准。</w:t>
       </w:r>
     </w:p>
     <w:p>
@@ -2151,19 +2308,36 @@
         <w:spacing w:lineRule="auto" w:line="240"/>
         <w:jc w:val="center"/>
         <w:rPr>
-          <w:rFonts w:ascii="Times New Roman" w:hAnsi="Times New Roman" w:eastAsia="Times New Roman"/>
+          <w:rFonts w:ascii="Noto Sans" w:hAnsi="Noto Sans" w:eastAsia="Noto Sans"/>
+        </w:rPr>
+      </w:pPr>
+      <w:r>
+        <w:rPr>
+          <w:rFonts w:ascii="Noto Sans" w:hAnsi="Noto Sans" w:cs="等线" w:eastAsia="Noto Sans"/>
           <w:sz w:val="16"/>
           <w:szCs w:val="16"/>
-        </w:rPr>
-      </w:pPr>
-      <w:r>
-        <w:rPr>
-          <w:rFonts w:ascii="Times New Roman" w:hAnsi="Times New Roman" w:cs="等线" w:eastAsia="Times New Roman"/>
+          <w:lang w:val="en-US" w:eastAsia="zh-CN"/>
+        </w:rPr>
+        <w:t>本操作手册描述不全面之处，敬请谅解。</w:t>
+      </w:r>
+    </w:p>
+    <w:p>
+      <w:pPr>
+        <w:pStyle w:val="Normal"/>
+        <w:spacing w:lineRule="auto" w:line="240"/>
+        <w:jc w:val="center"/>
+        <w:rPr>
+          <w:rFonts w:ascii="Noto Sans" w:hAnsi="Noto Sans" w:eastAsia="Noto Sans"/>
+        </w:rPr>
+      </w:pPr>
+      <w:r>
+        <w:rPr>
+          <w:rFonts w:ascii="Noto Sans" w:hAnsi="Noto Sans" w:cs="等线" w:eastAsia="Noto Sans"/>
           <w:sz w:val="16"/>
           <w:szCs w:val="16"/>
           <w:lang w:val="en-US" w:eastAsia="zh-CN"/>
         </w:rPr>
-        <w:t>如有描述与实际功能不符，请以应用的实际版本功能为准。</w:t>
+        <w:t>本应用的相关测试已尽可能进行验证，如有遗漏甚至产生相关问题，敬请谅解。</w:t>
       </w:r>
     </w:p>
     <w:p>
@@ -2172,19 +2346,35 @@
         <w:spacing w:lineRule="auto" w:line="240"/>
         <w:jc w:val="center"/>
         <w:rPr>
-          <w:rFonts w:ascii="Times New Roman" w:hAnsi="Times New Roman" w:eastAsia="Times New Roman"/>
+          <w:rFonts w:ascii="Noto Sans" w:hAnsi="Noto Sans" w:eastAsia="Noto Sans"/>
+        </w:rPr>
+      </w:pPr>
+      <w:r>
+        <w:rPr>
+          <w:rFonts w:ascii="Noto Sans" w:hAnsi="Noto Sans" w:cs="等线" w:eastAsia="Noto Sans"/>
           <w:sz w:val="16"/>
           <w:szCs w:val="16"/>
-        </w:rPr>
-      </w:pPr>
-      <w:r>
-        <w:rPr>
-          <w:rFonts w:ascii="Times New Roman" w:hAnsi="Times New Roman" w:cs="等线" w:eastAsia="Times New Roman"/>
+          <w:lang w:val="en-US" w:eastAsia="zh-CN"/>
+        </w:rPr>
+        <w:t>本应用所依赖的运行环境以及所有代码相关外部库（依赖）、模型之相关权利义务均属原作者所有。</w:t>
+      </w:r>
+    </w:p>
+    <w:p>
+      <w:pPr>
+        <w:pStyle w:val="Normal"/>
+        <w:spacing w:lineRule="auto" w:line="240"/>
+        <w:jc w:val="center"/>
+        <w:rPr>
+          <w:rFonts w:ascii="Noto Sans" w:hAnsi="Noto Sans" w:eastAsia="Noto Sans"/>
+        </w:rPr>
+      </w:pPr>
+      <w:r>
+        <w:rPr>
+          <w:rFonts w:eastAsia="Noto Sans" w:ascii="Noto Sans" w:hAnsi="Noto Sans"/>
           <w:sz w:val="16"/>
           <w:szCs w:val="16"/>
-          <w:lang w:val="en-US" w:eastAsia="zh-CN"/>
-        </w:rPr>
-        <w:t>本操作手册描述不全面之处，敬请谅解。</w:t>
+        </w:rPr>
+        <w:t>Author: Logan Qin</w:t>
       </w:r>
     </w:p>
     <w:p>
@@ -2193,78 +2383,14 @@
         <w:spacing w:lineRule="auto" w:line="240"/>
         <w:jc w:val="center"/>
         <w:rPr>
-          <w:rFonts w:ascii="Times New Roman" w:hAnsi="Times New Roman" w:eastAsia="Times New Roman"/>
+          <w:rFonts w:ascii="Noto Sans" w:hAnsi="Noto Sans" w:eastAsia="Noto Sans"/>
+        </w:rPr>
+      </w:pPr>
+      <w:r>
+        <w:rPr>
+          <w:rFonts w:eastAsia="Noto Sans" w:cs="等线" w:ascii="Noto Sans" w:hAnsi="Noto Sans"/>
           <w:sz w:val="16"/>
           <w:szCs w:val="16"/>
-        </w:rPr>
-      </w:pPr>
-      <w:r>
-        <w:rPr>
-          <w:rFonts w:ascii="Times New Roman" w:hAnsi="Times New Roman" w:cs="等线" w:eastAsia="Times New Roman"/>
-          <w:sz w:val="16"/>
-          <w:szCs w:val="16"/>
-          <w:lang w:val="en-US" w:eastAsia="zh-CN"/>
-        </w:rPr>
-        <w:t>本应用的相关测试已尽可能进行验证，如有遗漏甚至产生相关问题，敬请谅解。</w:t>
-      </w:r>
-    </w:p>
-    <w:p>
-      <w:pPr>
-        <w:pStyle w:val="Normal"/>
-        <w:spacing w:lineRule="auto" w:line="240"/>
-        <w:jc w:val="center"/>
-        <w:rPr>
-          <w:rFonts w:ascii="Times New Roman" w:hAnsi="Times New Roman" w:eastAsia="Times New Roman"/>
-          <w:sz w:val="16"/>
-          <w:szCs w:val="16"/>
-        </w:rPr>
-      </w:pPr>
-      <w:r>
-        <w:rPr>
-          <w:rFonts w:ascii="Times New Roman" w:hAnsi="Times New Roman" w:cs="等线" w:eastAsia="Times New Roman"/>
-          <w:sz w:val="16"/>
-          <w:szCs w:val="16"/>
-          <w:lang w:val="en-US" w:eastAsia="zh-CN"/>
-        </w:rPr>
-        <w:t>本应用所依赖的运行环境以及所有代码相关外部库（依赖）、模型之相关权利义务均属原作者所有。</w:t>
-      </w:r>
-    </w:p>
-    <w:p>
-      <w:pPr>
-        <w:pStyle w:val="Normal"/>
-        <w:spacing w:lineRule="auto" w:line="240"/>
-        <w:jc w:val="center"/>
-        <w:rPr>
-          <w:rFonts w:ascii="Times New Roman" w:hAnsi="Times New Roman" w:eastAsia="Times New Roman"/>
-          <w:sz w:val="16"/>
-          <w:szCs w:val="16"/>
-        </w:rPr>
-      </w:pPr>
-      <w:r>
-        <w:rPr>
-          <w:rFonts w:eastAsia="Times New Roman" w:ascii="Times New Roman" w:hAnsi="Times New Roman"/>
-          <w:sz w:val="16"/>
-          <w:szCs w:val="16"/>
-        </w:rPr>
-        <w:t>Author: Logan Qin</w:t>
-      </w:r>
-    </w:p>
-    <w:p>
-      <w:pPr>
-        <w:pStyle w:val="Normal"/>
-        <w:spacing w:lineRule="auto" w:line="240"/>
-        <w:jc w:val="center"/>
-        <w:rPr>
-          <w:rFonts w:ascii="Times New Roman" w:hAnsi="Times New Roman" w:eastAsia="Times New Roman"/>
-          <w:sz w:val="16"/>
-          <w:szCs w:val="16"/>
-        </w:rPr>
-      </w:pPr>
-      <w:r>
-        <w:rPr>
-          <w:rFonts w:eastAsia="Times New Roman" w:cs="等线" w:ascii="Times New Roman" w:hAnsi="Times New Roman"/>
-          <w:sz w:val="16"/>
-          <w:szCs w:val="16"/>
           <w:lang w:val="en-US" w:eastAsia="zh-CN"/>
         </w:rPr>
         <w:t>All Rights Reserved.</w:t>
@@ -2275,7 +2401,7 @@
         <w:pStyle w:val="Normal"/>
         <w:spacing w:lineRule="auto" w:line="240"/>
         <w:rPr>
-          <w:rFonts w:ascii="Times New Roman" w:hAnsi="Times New Roman" w:eastAsia="Times New Roman" w:cs="等线"/>
+          <w:rFonts w:ascii="Noto Sans" w:hAnsi="Noto Sans" w:eastAsia="Noto Sans" w:cs="等线"/>
           <w:sz w:val="18"/>
           <w:szCs w:val="18"/>
           <w:lang w:val="en-US" w:eastAsia="zh-CN"/>
@@ -2283,7 +2409,7 @@
       </w:pPr>
       <w:r>
         <w:rPr>
-          <w:rFonts w:eastAsia="Times New Roman" w:cs="等线" w:ascii="Times New Roman" w:hAnsi="Times New Roman"/>
+          <w:rFonts w:eastAsia="Noto Sans" w:cs="等线" w:ascii="Noto Sans" w:hAnsi="Noto Sans"/>
           <w:sz w:val="18"/>
           <w:szCs w:val="18"/>
           <w:lang w:val="en-US" w:eastAsia="zh-CN"/>
@@ -2295,11 +2421,13 @@
         <w:pStyle w:val="Normal"/>
         <w:spacing w:lineRule="auto" w:line="240"/>
         <w:rPr>
-          <w:rFonts w:ascii="Times New Roman" w:hAnsi="Times New Roman" w:eastAsia="Times New Roman"/>
-        </w:rPr>
-      </w:pPr>
-      <w:r>
-        <w:rPr/>
+          <w:rFonts w:ascii="Noto Sans" w:hAnsi="Noto Sans" w:eastAsia="Noto Sans"/>
+        </w:rPr>
+      </w:pPr>
+      <w:r>
+        <w:rPr>
+          <w:rFonts w:eastAsia="Noto Sans" w:ascii="Noto Sans" w:hAnsi="Noto Sans"/>
+        </w:rPr>
       </w:r>
     </w:p>
     <w:sectPr>
@@ -2329,6 +2457,7 @@
         </w:tabs>
         <w:ind w:left="720" w:hanging="360"/>
       </w:pPr>
+      <w:rPr/>
     </w:lvl>
     <w:lvl w:ilvl="1">
       <w:start w:val="1"/>
@@ -2341,6 +2470,7 @@
         </w:tabs>
         <w:ind w:left="1080" w:hanging="360"/>
       </w:pPr>
+      <w:rPr/>
     </w:lvl>
     <w:lvl w:ilvl="2">
       <w:start w:val="1"/>
@@ -2353,6 +2483,7 @@
         </w:tabs>
         <w:ind w:left="1440" w:hanging="360"/>
       </w:pPr>
+      <w:rPr/>
     </w:lvl>
     <w:lvl w:ilvl="3">
       <w:start w:val="1"/>
@@ -2365,6 +2496,7 @@
         </w:tabs>
         <w:ind w:left="1800" w:hanging="360"/>
       </w:pPr>
+      <w:rPr/>
     </w:lvl>
     <w:lvl w:ilvl="4">
       <w:start w:val="1"/>
@@ -2377,6 +2509,7 @@
         </w:tabs>
         <w:ind w:left="2160" w:hanging="360"/>
       </w:pPr>
+      <w:rPr/>
     </w:lvl>
     <w:lvl w:ilvl="5">
       <w:start w:val="1"/>
@@ -2389,6 +2522,7 @@
         </w:tabs>
         <w:ind w:left="2520" w:hanging="360"/>
       </w:pPr>
+      <w:rPr/>
     </w:lvl>
     <w:lvl w:ilvl="6">
       <w:start w:val="1"/>
@@ -2401,6 +2535,7 @@
         </w:tabs>
         <w:ind w:left="2880" w:hanging="360"/>
       </w:pPr>
+      <w:rPr/>
     </w:lvl>
     <w:lvl w:ilvl="7">
       <w:start w:val="1"/>
@@ -2413,6 +2548,7 @@
         </w:tabs>
         <w:ind w:left="3240" w:hanging="360"/>
       </w:pPr>
+      <w:rPr/>
     </w:lvl>
     <w:lvl w:ilvl="8">
       <w:start w:val="1"/>
@@ -2425,6 +2561,7 @@
         </w:tabs>
         <w:ind w:left="3600" w:hanging="360"/>
       </w:pPr>
+      <w:rPr/>
     </w:lvl>
   </w:abstractNum>
   <w:abstractNum w:abstractNumId="2">
@@ -2944,7 +3081,7 @@
     <w:qFormat/>
     <w:rPr/>
   </w:style>
-  <w:style w:type="character" w:styleId="InternetLink">
+  <w:style w:type="character" w:styleId="Hyperlink">
     <w:name w:val="Hyperlink"/>
     <w:rPr>
       <w:color w:val="000080"/>
@@ -2955,7 +3092,7 @@
   <w:style w:type="paragraph" w:styleId="Heading">
     <w:name w:val="Heading"/>
     <w:basedOn w:val="Normal"/>
-    <w:next w:val="TextBody"/>
+    <w:next w:val="BodyText"/>
     <w:qFormat/>
     <w:pPr>
       <w:keepNext w:val="true"/>
@@ -2967,7 +3104,7 @@
       <w:szCs w:val="28"/>
     </w:rPr>
   </w:style>
-  <w:style w:type="paragraph" w:styleId="TextBody">
+  <w:style w:type="paragraph" w:styleId="BodyText">
     <w:name w:val="Body Text"/>
     <w:basedOn w:val="Normal"/>
     <w:pPr>
@@ -2977,7 +3114,7 @@
   </w:style>
   <w:style w:type="paragraph" w:styleId="List">
     <w:name w:val="List"/>
-    <w:basedOn w:val="TextBody"/>
+    <w:basedOn w:val="BodyText"/>
     <w:pPr/>
     <w:rPr>
       <w:rFonts w:cs="Arial"/>
@@ -3046,6 +3183,19 @@
       <w:lang w:val="en-US" w:eastAsia="zh-CN" w:bidi="ar-SA"/>
     </w:rPr>
   </w:style>
+  <w:style w:type="paragraph" w:styleId="PreformattedText">
+    <w:name w:val="Preformatted Text"/>
+    <w:basedOn w:val="Normal"/>
+    <w:qFormat/>
+    <w:pPr>
+      <w:spacing w:before="0" w:after="0"/>
+    </w:pPr>
+    <w:rPr>
+      <w:rFonts w:ascii="Liberation Mono" w:hAnsi="Liberation Mono" w:eastAsia="Liberation Mono" w:cs="Liberation Mono"/>
+      <w:sz w:val="20"/>
+      <w:szCs w:val="20"/>
+    </w:rPr>
+  </w:style>
   <w:style w:type="table" w:default="1" w:styleId="8">
     <w:name w:val="Normal Table"/>
     <w:uiPriority w:val="0"/>
@@ -3064,161 +3214,97 @@
 </file>
 
 <file path=word/theme/theme1.xml><?xml version="1.0" encoding="utf-8"?>
-<a:theme xmlns:a="http://schemas.openxmlformats.org/drawingml/2006/main" name="Office 主题">
+<a:theme xmlns:a="http://schemas.openxmlformats.org/drawingml/2006/main" xmlns:r="http://schemas.openxmlformats.org/officeDocument/2006/relationships" name="Office 主题">
   <a:themeElements>
     <a:clrScheme name="Office">
       <a:dk1>
-        <a:sysClr val="windowText" lastClr="000000"/>
+        <a:srgbClr val="000000"/>
       </a:dk1>
       <a:lt1>
-        <a:sysClr val="window" lastClr="FFFFFF"/>
+        <a:srgbClr val="ffffff"/>
       </a:lt1>
       <a:dk2>
-        <a:srgbClr val="44546A"/>
+        <a:srgbClr val="44546a"/>
       </a:dk2>
       <a:lt2>
-        <a:srgbClr val="E7E6E6"/>
+        <a:srgbClr val="e7e6e6"/>
       </a:lt2>
       <a:accent1>
-        <a:srgbClr val="5B9BD5"/>
+        <a:srgbClr val="5b9bd5"/>
       </a:accent1>
       <a:accent2>
-        <a:srgbClr val="ED7D31"/>
+        <a:srgbClr val="ed7d31"/>
       </a:accent2>
       <a:accent3>
-        <a:srgbClr val="A5A5A5"/>
+        <a:srgbClr val="a5a5a5"/>
       </a:accent3>
       <a:accent4>
-        <a:srgbClr val="FFC000"/>
+        <a:srgbClr val="ffc000"/>
       </a:accent4>
       <a:accent5>
-        <a:srgbClr val="4472C4"/>
+        <a:srgbClr val="4472c4"/>
       </a:accent5>
       <a:accent6>
-        <a:srgbClr val="70AD47"/>
+        <a:srgbClr val="70ad47"/>
       </a:accent6>
       <a:hlink>
-        <a:srgbClr val="0563C1"/>
+        <a:srgbClr val="0563c1"/>
       </a:hlink>
       <a:folHlink>
-        <a:srgbClr val="954F72"/>
+        <a:srgbClr val="954f72"/>
       </a:folHlink>
     </a:clrScheme>
     <a:fontScheme name="Office">
       <a:majorFont>
-        <a:latin typeface="Calibri Light"/>
+        <a:latin typeface="Calibri Light" pitchFamily="0" charset="1"/>
         <a:ea typeface=""/>
         <a:cs typeface=""/>
-        <a:font script="Jpan" typeface="ＭＳ ゴシック"/>
-        <a:font script="Hang" typeface="맑은 고딕"/>
-        <a:font script="Hans" typeface="宋体"/>
-        <a:font script="Hant" typeface="新細明體"/>
-        <a:font script="Arab" typeface="Times New Roman"/>
-        <a:font script="Hebr" typeface="Times New Roman"/>
-        <a:font script="Thai" typeface="Angsana New"/>
-        <a:font script="Ethi" typeface="Nyala"/>
-        <a:font script="Beng" typeface="Vrinda"/>
-        <a:font script="Gujr" typeface="Shruti"/>
-        <a:font script="Khmr" typeface="MoolBoran"/>
-        <a:font script="Knda" typeface="Tunga"/>
-        <a:font script="Guru" typeface="Raavi"/>
-        <a:font script="Cans" typeface="Euphemia"/>
-        <a:font script="Cher" typeface="Plantagenet Cherokee"/>
-        <a:font script="Yiii" typeface="Microsoft Yi Baiti"/>
-        <a:font script="Tibt" typeface="Microsoft Himalaya"/>
-        <a:font script="Thaa" typeface="MV Boli"/>
-        <a:font script="Deva" typeface="Mangal"/>
-        <a:font script="Telu" typeface="Gautami"/>
-        <a:font script="Taml" typeface="Latha"/>
-        <a:font script="Syrc" typeface="Estrangelo Edessa"/>
-        <a:font script="Orya" typeface="Kalinga"/>
-        <a:font script="Mlym" typeface="Kartika"/>
-        <a:font script="Laoo" typeface="DokChampa"/>
-        <a:font script="Sinh" typeface="Iskoola Pota"/>
-        <a:font script="Mong" typeface="Mongolian Baiti"/>
-        <a:font script="Viet" typeface="Times New Roman"/>
-        <a:font script="Uigh" typeface="Microsoft Uighur"/>
-        <a:font script="Geor" typeface="Sylfaen"/>
       </a:majorFont>
       <a:minorFont>
-        <a:latin typeface="Calibri"/>
+        <a:latin typeface="Calibri" pitchFamily="0" charset="1"/>
         <a:ea typeface=""/>
         <a:cs typeface=""/>
-        <a:font script="Jpan" typeface="ＭＳ 明朝"/>
-        <a:font script="Hang" typeface="맑은 고딕"/>
-        <a:font script="Hans" typeface="宋体"/>
-        <a:font script="Hant" typeface="新細明體"/>
-        <a:font script="Arab" typeface="Arial"/>
-        <a:font script="Hebr" typeface="Arial"/>
-        <a:font script="Thai" typeface="Cordia New"/>
-        <a:font script="Ethi" typeface="Nyala"/>
-        <a:font script="Beng" typeface="Vrinda"/>
-        <a:font script="Gujr" typeface="Shruti"/>
-        <a:font script="Khmr" typeface="DaunPenh"/>
-        <a:font script="Knda" typeface="Tunga"/>
-        <a:font script="Guru" typeface="Raavi"/>
-        <a:font script="Cans" typeface="Euphemia"/>
-        <a:font script="Cher" typeface="Plantagenet Cherokee"/>
-        <a:font script="Yiii" typeface="Microsoft Yi Baiti"/>
-        <a:font script="Tibt" typeface="Microsoft Himalaya"/>
-        <a:font script="Thaa" typeface="MV Boli"/>
-        <a:font script="Deva" typeface="Mangal"/>
-        <a:font script="Telu" typeface="Gautami"/>
-        <a:font script="Taml" typeface="Latha"/>
-        <a:font script="Syrc" typeface="Estrangelo Edessa"/>
-        <a:font script="Orya" typeface="Kalinga"/>
-        <a:font script="Mlym" typeface="Kartika"/>
-        <a:font script="Laoo" typeface="DokChampa"/>
-        <a:font script="Sinh" typeface="Iskoola Pota"/>
-        <a:font script="Mong" typeface="Mongolian Baiti"/>
-        <a:font script="Viet" typeface="Arial"/>
-        <a:font script="Uigh" typeface="Microsoft Uighur"/>
-        <a:font script="Geor" typeface="Sylfaen"/>
       </a:minorFont>
     </a:fontScheme>
-    <a:fmtScheme name="Office">
+    <a:fmtScheme>
       <a:fillStyleLst>
         <a:solidFill>
           <a:schemeClr val="phClr"/>
         </a:solidFill>
-        <a:gradFill rotWithShape="1">
+        <a:gradFill>
           <a:gsLst>
             <a:gs pos="0">
               <a:schemeClr val="phClr">
                 <a:lumMod val="110000"/>
-                <a:satMod val="105000"/>
                 <a:tint val="67000"/>
               </a:schemeClr>
             </a:gs>
             <a:gs pos="50000">
               <a:schemeClr val="phClr">
                 <a:lumMod val="105000"/>
-                <a:satMod val="103000"/>
                 <a:tint val="73000"/>
               </a:schemeClr>
             </a:gs>
             <a:gs pos="100000">
               <a:schemeClr val="phClr">
                 <a:lumMod val="105000"/>
-                <a:satMod val="109000"/>
                 <a:tint val="81000"/>
               </a:schemeClr>
             </a:gs>
           </a:gsLst>
           <a:lin ang="5400000" scaled="0"/>
+          <a:tileRect l="0" t="0" r="0" b="0"/>
         </a:gradFill>
-        <a:gradFill rotWithShape="1">
+        <a:gradFill>
           <a:gsLst>
             <a:gs pos="0">
               <a:schemeClr val="phClr">
-                <a:satMod val="103000"/>
                 <a:lumMod val="102000"/>
                 <a:tint val="94000"/>
               </a:schemeClr>
             </a:gs>
             <a:gs pos="50000">
               <a:schemeClr val="phClr">
-                <a:satMod val="110000"/>
                 <a:lumMod val="100000"/>
                 <a:shade val="100000"/>
               </a:schemeClr>
@@ -3226,33 +3312,24 @@
             <a:gs pos="100000">
               <a:schemeClr val="phClr">
                 <a:lumMod val="99000"/>
-                <a:satMod val="120000"/>
                 <a:shade val="78000"/>
               </a:schemeClr>
             </a:gs>
           </a:gsLst>
           <a:lin ang="5400000" scaled="0"/>
+          <a:tileRect l="0" t="0" r="0" b="0"/>
         </a:gradFill>
       </a:fillStyleLst>
       <a:lnStyleLst>
         <a:ln w="6350" cap="flat" cmpd="sng" algn="ctr">
-          <a:solidFill>
-            <a:schemeClr val="phClr"/>
-          </a:solidFill>
           <a:prstDash val="solid"/>
           <a:miter lim="800000"/>
         </a:ln>
         <a:ln w="12700" cap="flat" cmpd="sng" algn="ctr">
-          <a:solidFill>
-            <a:schemeClr val="phClr"/>
-          </a:solidFill>
           <a:prstDash val="solid"/>
           <a:miter lim="800000"/>
         </a:ln>
         <a:ln w="19050" cap="flat" cmpd="sng" algn="ctr">
-          <a:solidFill>
-            <a:schemeClr val="phClr"/>
-          </a:solidFill>
           <a:prstDash val="solid"/>
           <a:miter lim="800000"/>
         </a:ln>
@@ -3265,13 +3342,7 @@
           <a:effectLst/>
         </a:effectStyle>
         <a:effectStyle>
-          <a:effectLst>
-            <a:outerShdw blurRad="57150" dist="19050" dir="5400000" algn="ctr" rotWithShape="0">
-              <a:srgbClr val="000000">
-                <a:alpha val="63000"/>
-              </a:srgbClr>
-            </a:outerShdw>
-          </a:effectLst>
+          <a:effectLst/>
         </a:effectStyle>
       </a:effectStyleLst>
       <a:bgFillStyleLst>
@@ -3281,15 +3352,13 @@
         <a:solidFill>
           <a:schemeClr val="phClr">
             <a:tint val="95000"/>
-            <a:satMod val="170000"/>
           </a:schemeClr>
         </a:solidFill>
-        <a:gradFill rotWithShape="1">
+        <a:gradFill>
           <a:gsLst>
             <a:gs pos="0">
               <a:schemeClr val="phClr">
                 <a:tint val="93000"/>
-                <a:satMod val="150000"/>
                 <a:shade val="98000"/>
                 <a:lumMod val="102000"/>
               </a:schemeClr>
@@ -3297,7 +3366,6 @@
             <a:gs pos="50000">
               <a:schemeClr val="phClr">
                 <a:tint val="98000"/>
-                <a:satMod val="130000"/>
                 <a:shade val="90000"/>
                 <a:lumMod val="103000"/>
               </a:schemeClr>
@@ -3305,15 +3373,14 @@
             <a:gs pos="100000">
               <a:schemeClr val="phClr">
                 <a:shade val="63000"/>
-                <a:satMod val="120000"/>
               </a:schemeClr>
             </a:gs>
           </a:gsLst>
           <a:lin ang="5400000" scaled="0"/>
+          <a:tileRect l="0" t="0" r="0" b="0"/>
         </a:gradFill>
       </a:bgFillStyleLst>
     </a:fmtScheme>
   </a:themeElements>
-  <a:objectDefaults/>
 </a:theme>
 </file>
</xml_diff>

<commit_message>
Fixes for some issues when switching models.
</commit_message>
<xml_diff>
--- a/asset/doc/waterchat_product_introduction_cn.docx
+++ b/asset/doc/waterchat_product_introduction_cn.docx
@@ -430,16 +430,7 @@
           <w:szCs w:val="20"/>
           <w:lang w:val="en-US" w:eastAsia="zh-CN"/>
         </w:rPr>
-        <w:t>Qwen</w:t>
-      </w:r>
-      <w:r>
-        <w:rPr>
-          <w:rFonts w:eastAsia="Noto Sans" w:cs="等线" w:ascii="Noto Sans" w:hAnsi="Noto Sans"/>
-          <w:sz w:val="20"/>
-          <w:szCs w:val="20"/>
-          <w:lang w:val="en-US" w:eastAsia="zh-CN"/>
-        </w:rPr>
-        <w:t xml:space="preserve">3 </w:t>
+        <w:t xml:space="preserve">Qwen3 </w:t>
       </w:r>
       <w:r>
         <w:rPr>
@@ -458,16 +449,7 @@
           <w:szCs w:val="20"/>
           <w:lang w:val="en-US" w:eastAsia="zh-CN"/>
         </w:rPr>
-        <w:t>类型</w:t>
-      </w:r>
-      <w:r>
-        <w:rPr>
-          <w:rFonts w:ascii="Noto Sans" w:hAnsi="Noto Sans" w:cs="等线" w:eastAsia="Noto Sans"/>
-          <w:sz w:val="20"/>
-          <w:szCs w:val="20"/>
-          <w:lang w:val="en-US" w:eastAsia="zh-CN"/>
-        </w:rPr>
-        <w:t>的</w:t>
+        <w:t>类型的</w:t>
       </w:r>
       <w:r>
         <w:rPr>
@@ -562,16 +544,7 @@
           <w:szCs w:val="20"/>
           <w:lang w:val="en-US" w:eastAsia="zh-CN"/>
         </w:rPr>
-        <w:t>Qwen</w:t>
-      </w:r>
-      <w:r>
-        <w:rPr>
-          <w:rFonts w:eastAsia="Noto Sans" w:cs="等线" w:ascii="Noto Sans" w:hAnsi="Noto Sans"/>
-          <w:sz w:val="20"/>
-          <w:szCs w:val="20"/>
-          <w:lang w:val="en-US" w:eastAsia="zh-CN"/>
-        </w:rPr>
-        <w:t xml:space="preserve">3 </w:t>
+        <w:t xml:space="preserve">Qwen3 </w:t>
       </w:r>
       <w:r>
         <w:rPr>
@@ -1077,16 +1050,7 @@
           <w:szCs w:val="20"/>
           <w:lang w:val="en-US" w:eastAsia="zh-CN"/>
         </w:rPr>
-        <w:t>Qwen</w:t>
-      </w:r>
-      <w:r>
-        <w:rPr>
-          <w:rFonts w:eastAsia="Noto Sans" w:cs="等线" w:ascii="Noto Sans" w:hAnsi="Noto Sans"/>
-          <w:sz w:val="20"/>
-          <w:szCs w:val="20"/>
-          <w:lang w:val="en-US" w:eastAsia="zh-CN"/>
-        </w:rPr>
-        <w:t>3</w:t>
+        <w:t>Qwen3</w:t>
       </w:r>
       <w:r>
         <w:rPr>
@@ -1122,16 +1086,7 @@
           <w:szCs w:val="20"/>
           <w:lang w:val="en-US" w:eastAsia="zh-CN"/>
         </w:rPr>
-        <w:t>Qwen</w:t>
-      </w:r>
-      <w:r>
-        <w:rPr>
-          <w:rFonts w:eastAsia="Noto Sans" w:cs="等线" w:ascii="Noto Sans" w:hAnsi="Noto Sans"/>
-          <w:sz w:val="20"/>
-          <w:szCs w:val="20"/>
-          <w:lang w:val="en-US" w:eastAsia="zh-CN"/>
-        </w:rPr>
-        <w:t xml:space="preserve">3 </w:t>
+        <w:t xml:space="preserve">Qwen3 </w:t>
       </w:r>
       <w:r>
         <w:rPr>
@@ -1319,7 +1274,172 @@
           <w:szCs w:val="20"/>
           <w:lang w:val="en-US" w:eastAsia="zh-CN"/>
         </w:rPr>
-        <w:t>）当中。</w:t>
+        <w:t>）当中。注意：如果一个模型内存在多个模型分类时，你可以尝试仅下载对应模型的</w:t>
+      </w:r>
+      <w:r>
+        <w:rPr>
+          <w:rFonts w:eastAsia="Noto Sans" w:cs="等线" w:ascii="Noto Sans" w:hAnsi="Noto Sans"/>
+          <w:sz w:val="20"/>
+          <w:szCs w:val="20"/>
+          <w:lang w:val="en-US" w:eastAsia="zh-CN"/>
+        </w:rPr>
+        <w:t>gguf</w:t>
+      </w:r>
+      <w:r>
+        <w:rPr>
+          <w:rFonts w:ascii="Noto Sans" w:hAnsi="Noto Sans" w:cs="等线" w:eastAsia="Noto Sans"/>
+          <w:sz w:val="20"/>
+          <w:szCs w:val="20"/>
+          <w:lang w:val="en-US" w:eastAsia="zh-CN"/>
+        </w:rPr>
+        <w:t>文件。比如</w:t>
+      </w:r>
+      <w:r>
+        <w:rPr>
+          <w:rFonts w:eastAsia="Noto Sans" w:cs="等线" w:ascii="Noto Sans" w:hAnsi="Noto Sans"/>
+          <w:sz w:val="20"/>
+          <w:szCs w:val="20"/>
+          <w:lang w:val="en-US" w:eastAsia="zh-CN"/>
+        </w:rPr>
+        <w:t>Qwen3-235B-A22B-GGUF (</w:t>
+      </w:r>
+      <w:r>
+        <w:rPr>
+          <w:rFonts w:ascii="Noto Sans" w:hAnsi="Noto Sans" w:cs="等线" w:eastAsia="Noto Sans"/>
+          <w:sz w:val="20"/>
+          <w:szCs w:val="20"/>
+          <w:lang w:val="en-US" w:eastAsia="zh-CN"/>
+        </w:rPr>
+        <w:t>里面有好几个模型</w:t>
+      </w:r>
+      <w:r>
+        <w:rPr>
+          <w:rFonts w:eastAsia="Noto Sans" w:cs="等线" w:ascii="Noto Sans" w:hAnsi="Noto Sans"/>
+          <w:sz w:val="20"/>
+          <w:szCs w:val="20"/>
+          <w:lang w:val="en-US" w:eastAsia="zh-CN"/>
+        </w:rPr>
+        <w:t>:Q4_K_M, Q5_0,Q5_K_M, ...</w:t>
+      </w:r>
+      <w:r>
+        <w:rPr>
+          <w:rFonts w:ascii="Noto Sans" w:hAnsi="Noto Sans" w:cs="等线" w:eastAsia="Noto Sans"/>
+          <w:sz w:val="20"/>
+          <w:szCs w:val="20"/>
+          <w:lang w:val="en-US" w:eastAsia="zh-CN"/>
+        </w:rPr>
+        <w:t xml:space="preserve">），你可以只下载其中 </w:t>
+      </w:r>
+      <w:r>
+        <w:rPr>
+          <w:rFonts w:eastAsia="Noto Sans" w:cs="等线" w:ascii="Noto Sans" w:hAnsi="Noto Sans"/>
+          <w:sz w:val="20"/>
+          <w:szCs w:val="20"/>
+          <w:lang w:val="en-US" w:eastAsia="zh-CN"/>
+        </w:rPr>
+        <w:t>Q5_0</w:t>
+      </w:r>
+      <w:r>
+        <w:rPr>
+          <w:rFonts w:ascii="Noto Sans" w:hAnsi="Noto Sans" w:cs="等线" w:eastAsia="Noto Sans"/>
+          <w:sz w:val="20"/>
+          <w:szCs w:val="20"/>
+          <w:lang w:val="en-US" w:eastAsia="zh-CN"/>
+        </w:rPr>
+        <w:t xml:space="preserve">文件夹下时所有文件，但是这时你也只能使用 </w:t>
+      </w:r>
+      <w:r>
+        <w:rPr>
+          <w:rFonts w:eastAsia="Noto Sans" w:cs="等线" w:ascii="Noto Sans" w:hAnsi="Noto Sans"/>
+          <w:sz w:val="20"/>
+          <w:szCs w:val="20"/>
+          <w:lang w:val="en-US" w:eastAsia="zh-CN"/>
+        </w:rPr>
+        <w:t xml:space="preserve">Qwen3-235B-A22B-GGUF/Q5_0/Qwen3-235B-A22B-Q5_0-00001-of-00006.gguf </w:t>
+      </w:r>
+      <w:r>
+        <w:rPr>
+          <w:rFonts w:ascii="Noto Sans" w:hAnsi="Noto Sans" w:cs="等线" w:eastAsia="Noto Sans"/>
+          <w:sz w:val="20"/>
+          <w:szCs w:val="20"/>
+          <w:lang w:val="en-US" w:eastAsia="zh-CN"/>
+        </w:rPr>
+        <w:t xml:space="preserve">这个模型，你如果还需要使用 </w:t>
+      </w:r>
+      <w:r>
+        <w:rPr>
+          <w:rFonts w:eastAsia="Noto Sans" w:cs="等线" w:ascii="Noto Sans" w:hAnsi="Noto Sans"/>
+          <w:sz w:val="20"/>
+          <w:szCs w:val="20"/>
+          <w:lang w:val="en-US" w:eastAsia="zh-CN"/>
+        </w:rPr>
+        <w:t>Qwen3-235B-A22B-GGUF</w:t>
+      </w:r>
+      <w:r>
+        <w:rPr>
+          <w:rFonts w:ascii="Noto Sans" w:hAnsi="Noto Sans" w:cs="等线" w:eastAsia="Noto Sans"/>
+          <w:sz w:val="20"/>
+          <w:szCs w:val="20"/>
+          <w:lang w:val="en-US" w:eastAsia="zh-CN"/>
+        </w:rPr>
+        <w:t xml:space="preserve">下的 </w:t>
+      </w:r>
+      <w:r>
+        <w:rPr>
+          <w:rFonts w:eastAsia="Noto Sans" w:cs="等线" w:ascii="Noto Sans" w:hAnsi="Noto Sans"/>
+          <w:sz w:val="20"/>
+          <w:szCs w:val="20"/>
+          <w:lang w:val="en-US" w:eastAsia="zh-CN"/>
+        </w:rPr>
+        <w:t>Q5_K_M</w:t>
+      </w:r>
+      <w:r>
+        <w:rPr>
+          <w:rFonts w:ascii="Noto Sans" w:hAnsi="Noto Sans" w:cs="等线" w:eastAsia="Noto Sans"/>
+          <w:sz w:val="20"/>
+          <w:szCs w:val="20"/>
+          <w:lang w:val="en-US" w:eastAsia="zh-CN"/>
+        </w:rPr>
+        <w:t xml:space="preserve">模型你还需要继续下载 </w:t>
+      </w:r>
+      <w:r>
+        <w:rPr>
+          <w:rFonts w:eastAsia="Noto Sans" w:cs="等线" w:ascii="Noto Sans" w:hAnsi="Noto Sans"/>
+          <w:sz w:val="20"/>
+          <w:szCs w:val="20"/>
+          <w:lang w:val="en-US" w:eastAsia="zh-CN"/>
+        </w:rPr>
+        <w:t>Q5_K_M</w:t>
+      </w:r>
+      <w:r>
+        <w:rPr>
+          <w:rFonts w:ascii="Noto Sans" w:hAnsi="Noto Sans" w:cs="等线" w:eastAsia="Noto Sans"/>
+          <w:sz w:val="20"/>
+          <w:szCs w:val="20"/>
+          <w:lang w:val="en-US" w:eastAsia="zh-CN"/>
+        </w:rPr>
+        <w:t>的文件。</w:t>
+      </w:r>
+    </w:p>
+    <w:p>
+      <w:pPr>
+        <w:pStyle w:val="Normal"/>
+        <w:widowControl w:val="false"/>
+        <w:numPr>
+          <w:ilvl w:val="0"/>
+          <w:numId w:val="0"/>
+        </w:numPr>
+        <w:spacing w:lineRule="auto" w:line="240"/>
+        <w:ind w:hanging="0" w:left="0"/>
+        <w:jc w:val="both"/>
+        <w:rPr>
+          <w:rFonts w:ascii="Noto Sans" w:hAnsi="Noto Sans" w:eastAsia="Noto Sans"/>
+        </w:rPr>
+      </w:pPr>
+      <w:r>
+        <w:rPr>
+          <w:rFonts w:eastAsia="Noto Sans" w:ascii="Noto Sans" w:hAnsi="Noto Sans"/>
+        </w:rPr>
       </w:r>
     </w:p>
     <w:p>
@@ -1443,7 +1563,7 @@
           <w:szCs w:val="20"/>
           <w:lang w:val="en-US" w:eastAsia="zh-CN"/>
         </w:rPr>
-        <w:t xml:space="preserve">: model_name_list=Qwen3-0.6B-GGUF,Qwen3-1.7B-GGUF </w:t>
+        <w:t xml:space="preserve">: model_name_list=Qwen3-0.6B-GGUF,Qwen3-1.7B-GGUF/Qwen3-1.7B-Q8_0.gguf </w:t>
       </w:r>
       <w:r>
         <w:rPr>
@@ -1515,7 +1635,7 @@
           <w:szCs w:val="20"/>
           <w:lang w:val="en-US" w:eastAsia="zh-CN"/>
         </w:rPr>
-        <w:t xml:space="preserve">model_name_list=Qwen3-0.6B-GGUF,Qwen3-1.7B-GGUF,Qwen/Qwen3-32B-GGUF </w:t>
+        <w:t>model_name_list=Qwen3-0.6B-GGUF,Qwen3-1.7B-GGUF/Qwen3-1.7B-Q8_0.gguf,Qwen3-32B-GGUF/ Qwen3-32B-Q8_0.gguf</w:t>
       </w:r>
       <w:r>
         <w:rPr>
@@ -1552,7 +1672,48 @@
           <w:szCs w:val="20"/>
           <w:lang w:val="en-US" w:eastAsia="zh-CN"/>
         </w:rPr>
-        <w:t>注意：请使用英文逗号，最好使用英文字母数字作为模型名称名称。</w:t>
+        <w:t xml:space="preserve">注意：英文逗号拼接，不要有空格，需要指定到 </w:t>
+      </w:r>
+      <w:r>
+        <w:rPr>
+          <w:rFonts w:eastAsia="Noto Sans" w:cs="等线" w:ascii="Noto Sans" w:hAnsi="Noto Sans"/>
+          <w:color w:val="C9211E"/>
+          <w:sz w:val="20"/>
+          <w:szCs w:val="20"/>
+          <w:lang w:val="en-US" w:eastAsia="zh-CN"/>
+        </w:rPr>
+        <w:t>xxxx.gguf</w:t>
+      </w:r>
+      <w:r>
+        <w:rPr>
+          <w:rFonts w:ascii="Noto Sans" w:hAnsi="Noto Sans" w:cs="等线" w:eastAsia="Noto Sans"/>
+          <w:color w:val="C9211E"/>
+          <w:sz w:val="20"/>
+          <w:szCs w:val="20"/>
+          <w:lang w:val="en-US" w:eastAsia="zh-CN"/>
+        </w:rPr>
+        <w:t>文件名为止。</w:t>
+      </w:r>
+    </w:p>
+    <w:p>
+      <w:pPr>
+        <w:pStyle w:val="Normal"/>
+        <w:widowControl w:val="false"/>
+        <w:numPr>
+          <w:ilvl w:val="0"/>
+          <w:numId w:val="0"/>
+        </w:numPr>
+        <w:spacing w:lineRule="auto" w:line="240"/>
+        <w:ind w:hanging="0" w:left="0"/>
+        <w:jc w:val="both"/>
+        <w:rPr>
+          <w:rFonts w:ascii="Noto Sans" w:hAnsi="Noto Sans" w:eastAsia="Noto Sans"/>
+        </w:rPr>
+      </w:pPr>
+      <w:r>
+        <w:rPr>
+          <w:rFonts w:eastAsia="Noto Sans" w:ascii="Noto Sans" w:hAnsi="Noto Sans"/>
+        </w:rPr>
       </w:r>
     </w:p>
     <w:p>
@@ -1573,6 +1734,319 @@
       <w:r>
         <w:rPr>
           <w:rFonts w:ascii="Noto Sans" w:hAnsi="Noto Sans" w:cs="等线" w:eastAsia="Noto Sans"/>
+          <w:color w:val="C9211E"/>
+          <w:sz w:val="20"/>
+          <w:szCs w:val="20"/>
+          <w:lang w:val="en-US" w:eastAsia="zh-CN"/>
+        </w:rPr>
+        <w:t>如果新增的模型有多个</w:t>
+      </w:r>
+      <w:r>
+        <w:rPr>
+          <w:rFonts w:eastAsia="Noto Sans" w:cs="等线" w:ascii="Noto Sans" w:hAnsi="Noto Sans"/>
+          <w:color w:val="C9211E"/>
+          <w:sz w:val="20"/>
+          <w:szCs w:val="20"/>
+          <w:lang w:val="en-US" w:eastAsia="zh-CN"/>
+        </w:rPr>
+        <w:t>gguf</w:t>
+      </w:r>
+      <w:r>
+        <w:rPr>
+          <w:rFonts w:ascii="Noto Sans" w:hAnsi="Noto Sans" w:cs="等线" w:eastAsia="Noto Sans"/>
+          <w:color w:val="C9211E"/>
+          <w:sz w:val="20"/>
+          <w:szCs w:val="20"/>
+          <w:lang w:val="en-US" w:eastAsia="zh-CN"/>
+        </w:rPr>
+        <w:t xml:space="preserve">文件，例如 </w:t>
+      </w:r>
+      <w:r>
+        <w:rPr>
+          <w:rFonts w:eastAsia="Noto Sans" w:cs="等线" w:ascii="Noto Sans" w:hAnsi="Noto Sans"/>
+          <w:color w:val="C9211E"/>
+          <w:sz w:val="20"/>
+          <w:szCs w:val="20"/>
+          <w:lang w:val="en-US" w:eastAsia="zh-CN"/>
+        </w:rPr>
+        <w:t>Qwen3-235B-A22B-GGUF (</w:t>
+      </w:r>
+      <w:r>
+        <w:rPr>
+          <w:rFonts w:ascii="Noto Sans" w:hAnsi="Noto Sans" w:cs="等线" w:eastAsia="Noto Sans"/>
+          <w:color w:val="C9211E"/>
+          <w:sz w:val="20"/>
+          <w:szCs w:val="20"/>
+          <w:lang w:val="en-US" w:eastAsia="zh-CN"/>
+        </w:rPr>
+        <w:t>里面有好几个模型</w:t>
+      </w:r>
+      <w:r>
+        <w:rPr>
+          <w:rFonts w:eastAsia="Noto Sans" w:cs="等线" w:ascii="Noto Sans" w:hAnsi="Noto Sans"/>
+          <w:color w:val="C9211E"/>
+          <w:sz w:val="20"/>
+          <w:szCs w:val="20"/>
+          <w:lang w:val="en-US" w:eastAsia="zh-CN"/>
+        </w:rPr>
+        <w:t>:Q4_K_M, Q5_0,Q5_K_M, ...</w:t>
+      </w:r>
+      <w:r>
+        <w:rPr>
+          <w:rFonts w:ascii="Noto Sans" w:hAnsi="Noto Sans" w:cs="等线" w:eastAsia="Noto Sans"/>
+          <w:color w:val="C9211E"/>
+          <w:sz w:val="20"/>
+          <w:szCs w:val="20"/>
+          <w:lang w:val="en-US" w:eastAsia="zh-CN"/>
+        </w:rPr>
+        <w:t>）</w:t>
+      </w:r>
+      <w:r>
+        <w:rPr>
+          <w:rFonts w:eastAsia="Noto Sans" w:cs="等线" w:ascii="Noto Sans" w:hAnsi="Noto Sans"/>
+          <w:color w:val="C9211E"/>
+          <w:sz w:val="20"/>
+          <w:szCs w:val="20"/>
+          <w:lang w:val="en-US" w:eastAsia="zh-CN"/>
+        </w:rPr>
+        <w:t>,</w:t>
+      </w:r>
+      <w:r>
+        <w:rPr>
+          <w:rFonts w:ascii="Noto Sans" w:hAnsi="Noto Sans" w:cs="等线" w:eastAsia="Noto Sans"/>
+          <w:color w:val="C9211E"/>
+          <w:sz w:val="20"/>
+          <w:szCs w:val="20"/>
+          <w:lang w:val="en-US" w:eastAsia="zh-CN"/>
+        </w:rPr>
+        <w:t>比如</w:t>
+      </w:r>
+      <w:r>
+        <w:rPr>
+          <w:rFonts w:eastAsia="Noto Sans" w:cs="等线" w:ascii="Noto Sans" w:hAnsi="Noto Sans"/>
+          <w:color w:val="C9211E"/>
+          <w:sz w:val="20"/>
+          <w:szCs w:val="20"/>
+          <w:lang w:val="en-US" w:eastAsia="zh-CN"/>
+        </w:rPr>
+        <w:t>Qwen3-235B-A22B-GGUF /Q5_0</w:t>
+      </w:r>
+      <w:r>
+        <w:rPr>
+          <w:rFonts w:ascii="Noto Sans" w:hAnsi="Noto Sans" w:cs="等线" w:eastAsia="Noto Sans"/>
+          <w:color w:val="C9211E"/>
+          <w:sz w:val="20"/>
+          <w:szCs w:val="20"/>
+          <w:lang w:val="en-US" w:eastAsia="zh-CN"/>
+        </w:rPr>
+        <w:t>模型，它就有数个</w:t>
+      </w:r>
+      <w:r>
+        <w:rPr>
+          <w:rFonts w:eastAsia="Noto Sans" w:cs="等线" w:ascii="Noto Sans" w:hAnsi="Noto Sans"/>
+          <w:color w:val="C9211E"/>
+          <w:sz w:val="20"/>
+          <w:szCs w:val="20"/>
+          <w:lang w:val="en-US" w:eastAsia="zh-CN"/>
+        </w:rPr>
+        <w:t>gguf</w:t>
+      </w:r>
+      <w:r>
+        <w:rPr>
+          <w:rFonts w:ascii="Noto Sans" w:hAnsi="Noto Sans" w:cs="等线" w:eastAsia="Noto Sans"/>
+          <w:color w:val="C9211E"/>
+          <w:sz w:val="20"/>
+          <w:szCs w:val="20"/>
+          <w:lang w:val="en-US" w:eastAsia="zh-CN"/>
+        </w:rPr>
+        <w:t>文件：</w:t>
+      </w:r>
+      <w:r>
+        <w:rPr>
+          <w:rFonts w:eastAsia="Noto Sans" w:cs="等线" w:ascii="Noto Sans" w:hAnsi="Noto Sans"/>
+          <w:color w:val="C9211E"/>
+          <w:sz w:val="20"/>
+          <w:szCs w:val="20"/>
+          <w:lang w:val="en-US" w:eastAsia="zh-CN"/>
+        </w:rPr>
+        <w:t>Qwen3-235B-A22B-Q5_0-00001-of-00006.gguf</w:t>
+      </w:r>
+      <w:r>
+        <w:rPr>
+          <w:rFonts w:ascii="Noto Sans" w:hAnsi="Noto Sans" w:cs="等线" w:eastAsia="Noto Sans"/>
+          <w:color w:val="C9211E"/>
+          <w:sz w:val="20"/>
+          <w:szCs w:val="20"/>
+          <w:lang w:val="en-US" w:eastAsia="zh-CN"/>
+        </w:rPr>
+        <w:t>，</w:t>
+      </w:r>
+      <w:r>
+        <w:rPr>
+          <w:rFonts w:eastAsia="Noto Sans" w:cs="等线" w:ascii="Noto Sans" w:hAnsi="Noto Sans"/>
+          <w:color w:val="C9211E"/>
+          <w:sz w:val="20"/>
+          <w:szCs w:val="20"/>
+          <w:lang w:val="en-US" w:eastAsia="zh-CN"/>
+        </w:rPr>
+        <w:t>Qwen3-235B-A22B-Q5_0-00002-of-00006.gguf</w:t>
+      </w:r>
+      <w:r>
+        <w:rPr>
+          <w:rFonts w:ascii="Noto Sans" w:hAnsi="Noto Sans" w:cs="等线" w:eastAsia="Noto Sans"/>
+          <w:color w:val="C9211E"/>
+          <w:sz w:val="20"/>
+          <w:szCs w:val="20"/>
+          <w:lang w:val="en-US" w:eastAsia="zh-CN"/>
+        </w:rPr>
+        <w:t>，</w:t>
+      </w:r>
+      <w:r>
+        <w:rPr>
+          <w:rFonts w:eastAsia="Noto Sans" w:cs="等线" w:ascii="Noto Sans" w:hAnsi="Noto Sans"/>
+          <w:color w:val="C9211E"/>
+          <w:sz w:val="20"/>
+          <w:szCs w:val="20"/>
+          <w:lang w:val="en-US" w:eastAsia="zh-CN"/>
+        </w:rPr>
+        <w:t>...</w:t>
+      </w:r>
+      <w:r>
+        <w:rPr>
+          <w:rFonts w:ascii="Noto Sans" w:hAnsi="Noto Sans" w:cs="等线" w:eastAsia="Noto Sans"/>
+          <w:color w:val="C9211E"/>
+          <w:sz w:val="20"/>
+          <w:szCs w:val="20"/>
+          <w:lang w:val="en-US" w:eastAsia="zh-CN"/>
+        </w:rPr>
+        <w:t>等等，则</w:t>
+      </w:r>
+      <w:r>
+        <w:rPr>
+          <w:rFonts w:ascii="Noto Sans" w:hAnsi="Noto Sans" w:cs="等线" w:eastAsia="Noto Sans"/>
+          <w:b/>
+          <w:bCs/>
+          <w:color w:val="C9211E"/>
+          <w:sz w:val="20"/>
+          <w:szCs w:val="20"/>
+          <w:lang w:val="en-US" w:eastAsia="zh-CN"/>
+        </w:rPr>
+        <w:t>需要指定第一个</w:t>
+      </w:r>
+      <w:r>
+        <w:rPr>
+          <w:rFonts w:eastAsia="Noto Sans" w:cs="等线" w:ascii="Noto Sans" w:hAnsi="Noto Sans"/>
+          <w:b/>
+          <w:bCs/>
+          <w:color w:val="C9211E"/>
+          <w:sz w:val="20"/>
+          <w:szCs w:val="20"/>
+          <w:lang w:val="en-US" w:eastAsia="zh-CN"/>
+        </w:rPr>
+        <w:t>gguf</w:t>
+      </w:r>
+      <w:r>
+        <w:rPr>
+          <w:rFonts w:ascii="Noto Sans" w:hAnsi="Noto Sans" w:cs="等线" w:eastAsia="Noto Sans"/>
+          <w:b/>
+          <w:bCs/>
+          <w:color w:val="C9211E"/>
+          <w:sz w:val="20"/>
+          <w:szCs w:val="20"/>
+          <w:lang w:val="en-US" w:eastAsia="zh-CN"/>
+        </w:rPr>
+        <w:t>文件名作为模型名称</w:t>
+      </w:r>
+      <w:r>
+        <w:rPr>
+          <w:rFonts w:ascii="Noto Sans" w:hAnsi="Noto Sans" w:cs="等线" w:eastAsia="Noto Sans"/>
+          <w:color w:val="C9211E"/>
+          <w:sz w:val="20"/>
+          <w:szCs w:val="20"/>
+          <w:lang w:val="en-US" w:eastAsia="zh-CN"/>
+        </w:rPr>
+        <w:t>：</w:t>
+      </w:r>
+      <w:r>
+        <w:rPr>
+          <w:rFonts w:eastAsia="Noto Sans" w:cs="等线" w:ascii="Noto Sans" w:hAnsi="Noto Sans"/>
+          <w:color w:val="C9211E"/>
+          <w:sz w:val="20"/>
+          <w:szCs w:val="20"/>
+          <w:lang w:val="en-US" w:eastAsia="zh-CN"/>
+        </w:rPr>
+        <w:t xml:space="preserve">Qwen3-235B-A22B-GGUF/Q5_0/Qwen3-235B-A22B-Q5_0-00001-of-00006.gguf </w:t>
+      </w:r>
+      <w:r>
+        <w:rPr>
+          <w:rFonts w:ascii="Noto Sans" w:hAnsi="Noto Sans" w:cs="等线" w:eastAsia="Noto Sans"/>
+          <w:color w:val="C9211E"/>
+          <w:sz w:val="20"/>
+          <w:szCs w:val="20"/>
+          <w:lang w:val="en-US" w:eastAsia="zh-CN"/>
+        </w:rPr>
+        <w:t>就是</w:t>
+      </w:r>
+      <w:r>
+        <w:rPr>
+          <w:rFonts w:eastAsia="Noto Sans" w:cs="等线" w:ascii="Noto Sans" w:hAnsi="Noto Sans"/>
+          <w:color w:val="C9211E"/>
+          <w:sz w:val="20"/>
+          <w:szCs w:val="20"/>
+          <w:lang w:val="en-US" w:eastAsia="zh-CN"/>
+        </w:rPr>
+        <w:t>Qwen3-235B-A22B-GGUF /Q5_0</w:t>
+      </w:r>
+      <w:r>
+        <w:rPr>
+          <w:rFonts w:ascii="Noto Sans" w:hAnsi="Noto Sans" w:cs="等线" w:eastAsia="Noto Sans"/>
+          <w:color w:val="C9211E"/>
+          <w:sz w:val="20"/>
+          <w:szCs w:val="20"/>
+          <w:lang w:val="en-US" w:eastAsia="zh-CN"/>
+        </w:rPr>
+        <w:t>模型的名称了。</w:t>
+      </w:r>
+    </w:p>
+    <w:p>
+      <w:pPr>
+        <w:pStyle w:val="Normal"/>
+        <w:widowControl w:val="false"/>
+        <w:numPr>
+          <w:ilvl w:val="0"/>
+          <w:numId w:val="0"/>
+        </w:numPr>
+        <w:spacing w:lineRule="auto" w:line="240"/>
+        <w:ind w:hanging="0" w:left="0"/>
+        <w:jc w:val="both"/>
+        <w:rPr>
+          <w:rFonts w:ascii="Noto Sans" w:hAnsi="Noto Sans" w:eastAsia="Noto Sans"/>
+        </w:rPr>
+      </w:pPr>
+      <w:r>
+        <w:rPr>
+          <w:rFonts w:eastAsia="Noto Sans" w:ascii="Noto Sans" w:hAnsi="Noto Sans"/>
+        </w:rPr>
+      </w:r>
+    </w:p>
+    <w:p>
+      <w:pPr>
+        <w:pStyle w:val="Normal"/>
+        <w:widowControl w:val="false"/>
+        <w:numPr>
+          <w:ilvl w:val="0"/>
+          <w:numId w:val="1"/>
+        </w:numPr>
+        <w:spacing w:lineRule="auto" w:line="240"/>
+        <w:ind w:hanging="0" w:left="0"/>
+        <w:jc w:val="both"/>
+        <w:rPr>
+          <w:rFonts w:ascii="Noto Sans" w:hAnsi="Noto Sans" w:eastAsia="Noto Sans"/>
+        </w:rPr>
+      </w:pPr>
+      <w:r>
+        <w:rPr>
+          <w:rFonts w:ascii="Noto Sans" w:hAnsi="Noto Sans" w:cs="等线" w:eastAsia="Noto Sans"/>
           <w:sz w:val="20"/>
           <w:szCs w:val="20"/>
           <w:lang w:val="en-US" w:eastAsia="zh-CN"/>
@@ -1596,6 +2070,79 @@
           <w:lang w:val="en-US" w:eastAsia="zh-CN"/>
         </w:rPr>
         <w:t>页面下选择你新增的模型了。</w:t>
+      </w:r>
+    </w:p>
+    <w:p>
+      <w:pPr>
+        <w:pStyle w:val="Normal"/>
+        <w:widowControl w:val="false"/>
+        <w:numPr>
+          <w:ilvl w:val="0"/>
+          <w:numId w:val="0"/>
+        </w:numPr>
+        <w:spacing w:lineRule="auto" w:line="240"/>
+        <w:ind w:hanging="0" w:left="0"/>
+        <w:jc w:val="both"/>
+        <w:rPr>
+          <w:rFonts w:ascii="Noto Sans" w:hAnsi="Noto Sans" w:eastAsia="Noto Sans"/>
+        </w:rPr>
+      </w:pPr>
+      <w:r>
+        <w:rPr>
+          <w:rFonts w:eastAsia="Noto Sans" w:ascii="Noto Sans" w:hAnsi="Noto Sans"/>
+        </w:rPr>
+      </w:r>
+    </w:p>
+    <w:p>
+      <w:pPr>
+        <w:pStyle w:val="PreformattedText"/>
+        <w:widowControl w:val="false"/>
+        <w:numPr>
+          <w:ilvl w:val="0"/>
+          <w:numId w:val="1"/>
+        </w:numPr>
+        <w:spacing w:lineRule="auto" w:line="240"/>
+        <w:ind w:hanging="0" w:left="0"/>
+        <w:jc w:val="both"/>
+        <w:rPr>
+          <w:rFonts w:ascii="Noto Sans" w:hAnsi="Noto Sans" w:eastAsia="Noto Sans"/>
+        </w:rPr>
+      </w:pPr>
+      <w:r>
+        <w:rPr>
+          <w:rFonts w:ascii="Noto Sans" w:hAnsi="Noto Sans" w:cs="等线" w:eastAsia="Noto Sans"/>
+          <w:b/>
+          <w:bCs/>
+          <w:color w:val="C9211E"/>
+          <w:sz w:val="20"/>
+          <w:szCs w:val="20"/>
+          <w:lang w:val="en-US" w:eastAsia="zh-CN"/>
+        </w:rPr>
+        <w:t>强烈提醒：总之模型要制定到具体的</w:t>
+      </w:r>
+      <w:r>
+        <w:rPr>
+          <w:rFonts w:eastAsia="Noto Sans" w:cs="等线" w:ascii="Noto Sans" w:hAnsi="Noto Sans"/>
+          <w:b/>
+          <w:bCs/>
+          <w:color w:val="C9211E"/>
+          <w:sz w:val="20"/>
+          <w:szCs w:val="20"/>
+          <w:lang w:val="en-US" w:eastAsia="zh-CN"/>
+        </w:rPr>
+        <w:t xml:space="preserve">: Qwen3-235B-A22B-GGUF/.../xxxx.gguf </w:t>
+      </w:r>
+      <w:r>
+        <w:rPr>
+          <w:rFonts w:ascii="Noto Sans" w:hAnsi="Noto Sans" w:cs="等线" w:eastAsia="Noto Sans"/>
+          <w:b/>
+          <w:bCs/>
+          <w:color w:val="C9211E"/>
+          <w:sz w:val="20"/>
+          <w:szCs w:val="20"/>
+          <w:lang w:val="en-US" w:eastAsia="zh-CN"/>
+        </w:rPr>
+        <w:t>文件为止。</w:t>
       </w:r>
       <w:r>
         <w:rPr>
@@ -1705,7 +2252,10 @@
       </w:pPr>
       <w:r>
         <w:rPr>
-          <w:rFonts w:eastAsia="Noto Sans" w:ascii="Noto Sans" w:hAnsi="Noto Sans"/>
+          <w:rFonts w:cs="等线"/>
+          <w:sz w:val="20"/>
+          <w:szCs w:val="20"/>
+          <w:lang w:val="en-US" w:eastAsia="zh-CN"/>
         </w:rPr>
       </w:r>
     </w:p>
@@ -1776,16 +2326,7 @@
           <w:szCs w:val="20"/>
           <w:lang w:val="en-US" w:eastAsia="zh-CN"/>
         </w:rPr>
-        <w:t>0.7</w:t>
-      </w:r>
-      <w:r>
-        <w:rPr>
-          <w:rFonts w:eastAsia="Noto Sans" w:cs="等线" w:ascii="Noto Sans" w:hAnsi="Noto Sans"/>
-          <w:sz w:val="20"/>
-          <w:szCs w:val="20"/>
-          <w:lang w:val="en-US" w:eastAsia="zh-CN"/>
-        </w:rPr>
-        <w:t>GB</w:t>
+        <w:t>0.7GB</w:t>
       </w:r>
       <w:r>
         <w:rPr>
@@ -1839,16 +2380,7 @@
           <w:szCs w:val="20"/>
           <w:lang w:val="en-US" w:eastAsia="zh-CN"/>
         </w:rPr>
-        <w:t>1.9</w:t>
-      </w:r>
-      <w:r>
-        <w:rPr>
-          <w:rFonts w:eastAsia="Noto Sans" w:cs="等线" w:ascii="Noto Sans" w:hAnsi="Noto Sans"/>
-          <w:sz w:val="20"/>
-          <w:szCs w:val="20"/>
-          <w:lang w:val="en-US" w:eastAsia="zh-CN"/>
-        </w:rPr>
-        <w:t>GB</w:t>
+        <w:t>1.9GB</w:t>
       </w:r>
       <w:r>
         <w:rPr>
@@ -2048,7 +2580,10 @@
       </w:pPr>
       <w:r>
         <w:rPr>
-          <w:rFonts w:eastAsia="Noto Sans" w:ascii="Noto Sans" w:hAnsi="Noto Sans"/>
+          <w:rFonts w:cs="等线"/>
+          <w:sz w:val="20"/>
+          <w:szCs w:val="20"/>
+          <w:lang w:val="en-US" w:eastAsia="zh-CN"/>
         </w:rPr>
       </w:r>
     </w:p>
@@ -2079,16 +2614,7 @@
           <w:szCs w:val="20"/>
           <w:lang w:val="en-US" w:eastAsia="zh-CN"/>
         </w:rPr>
-        <w:t>llama.</w:t>
-      </w:r>
-      <w:r>
-        <w:rPr>
-          <w:rFonts w:eastAsia="Noto Sans" w:cs="等线" w:ascii="Noto Sans" w:hAnsi="Noto Sans"/>
-          <w:sz w:val="20"/>
-          <w:szCs w:val="20"/>
-          <w:lang w:val="en-US" w:eastAsia="zh-CN"/>
-        </w:rPr>
-        <w:t xml:space="preserve">ccp </w:t>
+        <w:t xml:space="preserve">llama.ccp </w:t>
       </w:r>
       <w:r>
         <w:rPr>

</xml_diff>

<commit_message>
Add support for models with mmproj.
</commit_message>
<xml_diff>
--- a/asset/doc/waterchat_product_introduction_cn.docx
+++ b/asset/doc/waterchat_product_introduction_cn.docx
@@ -2026,6 +2026,664 @@
       <w:r>
         <w:rPr>
           <w:rFonts w:eastAsia="Noto Sans" w:ascii="Noto Sans" w:hAnsi="Noto Sans"/>
+        </w:rPr>
+      </w:r>
+    </w:p>
+    <w:p>
+      <w:pPr>
+        <w:pStyle w:val="Normal"/>
+        <w:widowControl w:val="false"/>
+        <w:numPr>
+          <w:ilvl w:val="0"/>
+          <w:numId w:val="1"/>
+        </w:numPr>
+        <w:spacing w:lineRule="auto" w:line="240"/>
+        <w:ind w:hanging="0" w:left="0"/>
+        <w:jc w:val="both"/>
+        <w:rPr>
+          <w:rFonts w:ascii="Noto Sans" w:hAnsi="Noto Sans" w:eastAsia="Noto Sans"/>
+          <w:sz w:val="20"/>
+          <w:szCs w:val="20"/>
+        </w:rPr>
+      </w:pPr>
+      <w:r>
+        <w:rPr>
+          <w:rFonts w:ascii="Noto Sans" w:hAnsi="Noto Sans" w:eastAsia="Noto Sans"/>
+          <w:sz w:val="20"/>
+          <w:szCs w:val="20"/>
+        </w:rPr>
+        <w:t>本步骤为</w:t>
+      </w:r>
+      <w:r>
+        <w:rPr>
+          <w:rFonts w:ascii="Noto Sans" w:hAnsi="Noto Sans" w:eastAsia="Noto Sans"/>
+          <w:b/>
+          <w:bCs/>
+          <w:sz w:val="20"/>
+          <w:szCs w:val="20"/>
+        </w:rPr>
+        <w:t>非必需步骤</w:t>
+      </w:r>
+      <w:r>
+        <w:rPr>
+          <w:rFonts w:ascii="Noto Sans" w:hAnsi="Noto Sans" w:eastAsia="Noto Sans"/>
+          <w:sz w:val="20"/>
+          <w:szCs w:val="20"/>
+        </w:rPr>
+        <w:t>。如果你的</w:t>
+      </w:r>
+      <w:r>
+        <w:rPr>
+          <w:rFonts w:eastAsia="Noto Sans" w:ascii="Noto Sans" w:hAnsi="Noto Sans"/>
+          <w:sz w:val="20"/>
+          <w:szCs w:val="20"/>
+        </w:rPr>
+        <w:t>AI</w:t>
+      </w:r>
+      <w:r>
+        <w:rPr>
+          <w:rFonts w:ascii="Noto Sans" w:hAnsi="Noto Sans" w:eastAsia="Noto Sans"/>
+          <w:sz w:val="20"/>
+          <w:szCs w:val="20"/>
+        </w:rPr>
+        <w:t>模型支持图片嵌入识别，那么在你的模型文件中应该会包含有</w:t>
+      </w:r>
+      <w:r>
+        <w:rPr>
+          <w:rFonts w:eastAsia="Noto Sans" w:ascii="Noto Sans" w:hAnsi="Noto Sans"/>
+          <w:b/>
+          <w:bCs/>
+          <w:sz w:val="20"/>
+          <w:szCs w:val="20"/>
+        </w:rPr>
+        <w:t>mmproj-XXXXXX.</w:t>
+      </w:r>
+      <w:r>
+        <w:rPr>
+          <w:rFonts w:eastAsia="Noto Sans" w:ascii="Noto Sans" w:hAnsi="Noto Sans"/>
+          <w:b/>
+          <w:bCs/>
+          <w:sz w:val="20"/>
+          <w:szCs w:val="20"/>
+        </w:rPr>
+        <w:t>gguf</w:t>
+      </w:r>
+      <w:r>
+        <w:rPr>
+          <w:rFonts w:ascii="Noto Sans" w:hAnsi="Noto Sans" w:eastAsia="Noto Sans"/>
+          <w:sz w:val="20"/>
+          <w:szCs w:val="20"/>
+        </w:rPr>
+        <w:t>名字的模型文件。例如</w:t>
+      </w:r>
+      <w:r>
+        <w:rPr>
+          <w:rFonts w:eastAsia="Noto Sans" w:ascii="Noto Sans" w:hAnsi="Noto Sans"/>
+          <w:sz w:val="20"/>
+          <w:szCs w:val="20"/>
+        </w:rPr>
+        <w:t xml:space="preserve">Qwen3-VL-2B-Instruct-GGUF </w:t>
+      </w:r>
+      <w:r>
+        <w:rPr>
+          <w:rFonts w:ascii="Noto Sans" w:hAnsi="Noto Sans" w:eastAsia="Noto Sans"/>
+          <w:sz w:val="20"/>
+          <w:szCs w:val="20"/>
+        </w:rPr>
+        <w:t>模型就是一个支持图片嵌入识别的模型，它的模型文件中就包含了</w:t>
+      </w:r>
+      <w:r>
+        <w:rPr>
+          <w:rFonts w:eastAsia="Noto Sans" w:ascii="Noto Sans" w:hAnsi="Noto Sans"/>
+          <w:sz w:val="20"/>
+          <w:szCs w:val="20"/>
+        </w:rPr>
+        <w:t xml:space="preserve">mmproj-Qwen3VL-2B-Instruct-F16.gguf </w:t>
+      </w:r>
+      <w:r>
+        <w:rPr>
+          <w:rFonts w:ascii="Noto Sans" w:hAnsi="Noto Sans" w:eastAsia="Noto Sans"/>
+          <w:sz w:val="20"/>
+          <w:szCs w:val="20"/>
+        </w:rPr>
+        <w:t xml:space="preserve">和 </w:t>
+      </w:r>
+      <w:r>
+        <w:rPr>
+          <w:rFonts w:eastAsia="Noto Sans" w:ascii="Noto Sans" w:hAnsi="Noto Sans"/>
+          <w:sz w:val="20"/>
+          <w:szCs w:val="20"/>
+        </w:rPr>
+        <w:t>mmproj-Qwen3VL-2B-Instruct-Q8_0.gguf</w:t>
+      </w:r>
+      <w:r>
+        <w:rPr>
+          <w:rFonts w:ascii="Noto Sans" w:hAnsi="Noto Sans" w:eastAsia="Noto Sans"/>
+          <w:sz w:val="20"/>
+          <w:szCs w:val="20"/>
+        </w:rPr>
+        <w:t>文件。如何你想要你的模型在你问问题时支持上传图片给</w:t>
+      </w:r>
+      <w:r>
+        <w:rPr>
+          <w:rFonts w:eastAsia="Noto Sans" w:ascii="Noto Sans" w:hAnsi="Noto Sans"/>
+          <w:sz w:val="20"/>
+          <w:szCs w:val="20"/>
+        </w:rPr>
+        <w:t>AI</w:t>
+      </w:r>
+      <w:r>
+        <w:rPr>
+          <w:rFonts w:ascii="Noto Sans" w:hAnsi="Noto Sans" w:eastAsia="Noto Sans"/>
+          <w:sz w:val="20"/>
+          <w:szCs w:val="20"/>
+        </w:rPr>
+        <w:t>识别，那么本步骤才是必须要配置的。</w:t>
+      </w:r>
+    </w:p>
+    <w:p>
+      <w:pPr>
+        <w:pStyle w:val="Normal"/>
+        <w:widowControl w:val="false"/>
+        <w:numPr>
+          <w:ilvl w:val="0"/>
+          <w:numId w:val="0"/>
+        </w:numPr>
+        <w:spacing w:lineRule="auto" w:line="240"/>
+        <w:ind w:hanging="0" w:left="0"/>
+        <w:jc w:val="both"/>
+        <w:rPr>
+          <w:rFonts w:ascii="Noto Sans" w:hAnsi="Noto Sans" w:eastAsia="Noto Sans"/>
+          <w:sz w:val="20"/>
+          <w:szCs w:val="20"/>
+        </w:rPr>
+      </w:pPr>
+      <w:r>
+        <w:rPr>
+          <w:rFonts w:eastAsia="Noto Sans" w:ascii="Noto Sans" w:hAnsi="Noto Sans"/>
+          <w:sz w:val="20"/>
+          <w:szCs w:val="20"/>
+        </w:rPr>
+      </w:r>
+    </w:p>
+    <w:p>
+      <w:pPr>
+        <w:pStyle w:val="Normal"/>
+        <w:widowControl w:val="false"/>
+        <w:numPr>
+          <w:ilvl w:val="0"/>
+          <w:numId w:val="0"/>
+        </w:numPr>
+        <w:spacing w:lineRule="auto" w:line="240"/>
+        <w:ind w:hanging="0" w:left="0"/>
+        <w:jc w:val="both"/>
+        <w:rPr>
+          <w:rFonts w:ascii="Noto Sans" w:hAnsi="Noto Sans" w:eastAsia="Noto Sans"/>
+          <w:sz w:val="20"/>
+          <w:szCs w:val="20"/>
+        </w:rPr>
+      </w:pPr>
+      <w:r>
+        <w:rPr>
+          <w:rFonts w:ascii="Noto Sans" w:hAnsi="Noto Sans" w:eastAsia="Noto Sans"/>
+          <w:sz w:val="20"/>
+          <w:szCs w:val="20"/>
+        </w:rPr>
+        <w:t xml:space="preserve">假如你要添加 </w:t>
+      </w:r>
+      <w:r>
+        <w:rPr>
+          <w:rFonts w:eastAsia="Noto Sans" w:ascii="Noto Sans" w:hAnsi="Noto Sans"/>
+          <w:sz w:val="20"/>
+          <w:szCs w:val="20"/>
+        </w:rPr>
+        <w:t xml:space="preserve">Qwen3-VL-2B-Instruct-GGUF/Qwen3VL-2B-Instruct-Q8_0.gguf </w:t>
+      </w:r>
+      <w:r>
+        <w:rPr>
+          <w:rFonts w:ascii="Noto Sans" w:hAnsi="Noto Sans" w:eastAsia="Noto Sans"/>
+          <w:sz w:val="20"/>
+          <w:szCs w:val="20"/>
+        </w:rPr>
+        <w:t xml:space="preserve">的图片嵌入识别功能，你除了需要按照步骤 </w:t>
+      </w:r>
+      <w:r>
+        <w:rPr>
+          <w:rFonts w:eastAsia="Noto Sans" w:ascii="Noto Sans" w:hAnsi="Noto Sans"/>
+          <w:sz w:val="20"/>
+          <w:szCs w:val="20"/>
+        </w:rPr>
+        <w:t>a</w:t>
+      </w:r>
+      <w:r>
+        <w:rPr>
+          <w:rFonts w:eastAsia="Noto Sans" w:ascii="Noto Sans" w:hAnsi="Noto Sans"/>
+          <w:sz w:val="20"/>
+          <w:szCs w:val="20"/>
+        </w:rPr>
+        <w:t xml:space="preserve">) → f) </w:t>
+      </w:r>
+      <w:r>
+        <w:rPr>
+          <w:rFonts w:ascii="Noto Sans" w:hAnsi="Noto Sans" w:eastAsia="Noto Sans"/>
+          <w:sz w:val="20"/>
+          <w:szCs w:val="20"/>
+        </w:rPr>
+        <w:t>逐步配置之外，现在还需要</w:t>
+      </w:r>
+      <w:r>
+        <w:rPr>
+          <w:rFonts w:ascii="Noto Sans" w:hAnsi="Noto Sans" w:cs="等线" w:eastAsia="Noto Sans"/>
+          <w:sz w:val="20"/>
+          <w:szCs w:val="20"/>
+          <w:lang w:val="en-US" w:eastAsia="zh-CN"/>
+        </w:rPr>
+        <w:t>在你的电脑资源管理器（</w:t>
+      </w:r>
+      <w:r>
+        <w:rPr>
+          <w:rFonts w:eastAsia="Noto Sans" w:cs="等线" w:ascii="Noto Sans" w:hAnsi="Noto Sans"/>
+          <w:sz w:val="20"/>
+          <w:szCs w:val="20"/>
+          <w:lang w:val="en-US" w:eastAsia="zh-CN"/>
+        </w:rPr>
+        <w:t>Mac</w:t>
+      </w:r>
+      <w:r>
+        <w:rPr>
+          <w:rFonts w:ascii="Noto Sans" w:hAnsi="Noto Sans" w:cs="等线" w:eastAsia="Noto Sans"/>
+          <w:sz w:val="20"/>
+          <w:szCs w:val="20"/>
+          <w:lang w:val="en-US" w:eastAsia="zh-CN"/>
+        </w:rPr>
+        <w:t>电脑叫做“访达”）中找到“下载”文件夹，在“下载”文件加当中应该会有“</w:t>
+      </w:r>
+      <w:r>
+        <w:rPr>
+          <w:rFonts w:eastAsia="Noto Sans" w:cs="等线" w:ascii="Noto Sans" w:hAnsi="Noto Sans"/>
+          <w:sz w:val="20"/>
+          <w:szCs w:val="20"/>
+          <w:lang w:val="en-US" w:eastAsia="zh-CN"/>
+        </w:rPr>
+        <w:t>waterchat”</w:t>
+      </w:r>
+      <w:r>
+        <w:rPr>
+          <w:rFonts w:ascii="Noto Sans" w:hAnsi="Noto Sans" w:cs="等线" w:eastAsia="Noto Sans"/>
+          <w:sz w:val="20"/>
+          <w:szCs w:val="20"/>
+          <w:lang w:val="en-US" w:eastAsia="zh-CN"/>
+        </w:rPr>
+        <w:t>，这时候依次打开以下文件夹“</w:t>
+      </w:r>
+      <w:r>
+        <w:rPr>
+          <w:rFonts w:eastAsia="Noto Sans" w:cs="等线" w:ascii="Noto Sans" w:hAnsi="Noto Sans"/>
+          <w:sz w:val="20"/>
+          <w:szCs w:val="20"/>
+          <w:lang w:val="en-US" w:eastAsia="zh-CN"/>
+        </w:rPr>
+        <w:t>waterchat/resources/config”</w:t>
+      </w:r>
+      <w:r>
+        <w:rPr>
+          <w:rFonts w:ascii="Noto Sans" w:hAnsi="Noto Sans" w:cs="等线" w:eastAsia="Noto Sans"/>
+          <w:sz w:val="20"/>
+          <w:szCs w:val="20"/>
+          <w:lang w:val="en-US" w:eastAsia="zh-CN"/>
+        </w:rPr>
+        <w:t>，此文件夹中应当有</w:t>
+      </w:r>
+      <w:r>
+        <w:rPr>
+          <w:rFonts w:eastAsia="Noto Sans" w:cs="等线" w:ascii="Noto Sans" w:hAnsi="Noto Sans"/>
+          <w:sz w:val="20"/>
+          <w:szCs w:val="20"/>
+          <w:lang w:val="en-US" w:eastAsia="zh-CN"/>
+        </w:rPr>
+        <w:t>config.txt</w:t>
+      </w:r>
+      <w:r>
+        <w:rPr>
+          <w:rFonts w:ascii="Noto Sans" w:hAnsi="Noto Sans" w:cs="等线" w:eastAsia="Noto Sans"/>
+          <w:sz w:val="20"/>
+          <w:szCs w:val="20"/>
+          <w:lang w:val="en-US" w:eastAsia="zh-CN"/>
+        </w:rPr>
+        <w:t>文件，打开这个文件，请单独增加一行，然后添加</w:t>
+      </w:r>
+      <w:r>
+        <w:rPr>
+          <w:rFonts w:eastAsia="Noto Sans" w:cs="等线" w:ascii="Noto Sans" w:hAnsi="Noto Sans"/>
+          <w:b/>
+          <w:bCs/>
+          <w:color w:val="000000"/>
+          <w:sz w:val="20"/>
+          <w:szCs w:val="20"/>
+          <w:lang w:val="en-US" w:eastAsia="zh-CN"/>
+        </w:rPr>
+        <w:t>Qwen3-VL-2B-Instruct-GGUF/Qwen3VL-2B-Instruct-Q8_0.gguf</w:t>
+      </w:r>
+      <w:r>
+        <w:rPr>
+          <w:rFonts w:eastAsia="Noto Sans" w:cs="等线" w:ascii="Noto Sans" w:hAnsi="Noto Sans"/>
+          <w:b/>
+          <w:bCs/>
+          <w:color w:val="C9211E"/>
+          <w:sz w:val="20"/>
+          <w:szCs w:val="20"/>
+          <w:lang w:val="en-US" w:eastAsia="zh-CN"/>
+        </w:rPr>
+        <w:t>:mmproj</w:t>
+      </w:r>
+      <w:r>
+        <w:rPr>
+          <w:rFonts w:eastAsia="Noto Sans" w:cs="等线" w:ascii="Noto Sans" w:hAnsi="Noto Sans"/>
+          <w:b/>
+          <w:bCs/>
+          <w:color w:val="000000"/>
+          <w:sz w:val="20"/>
+          <w:szCs w:val="20"/>
+          <w:lang w:val="en-US" w:eastAsia="zh-CN"/>
+        </w:rPr>
+        <w:t>=Qwen3-VL-2B-Instruct-GGUF/mmproj-Qwen3VL-2B-Instruct-Q8_0.gguf</w:t>
+      </w:r>
+      <w:r>
+        <w:rPr>
+          <w:rFonts w:eastAsia="Noto Sans" w:cs="等线" w:ascii="Noto Sans" w:hAnsi="Noto Sans"/>
+          <w:color w:val="C9211E"/>
+          <w:sz w:val="20"/>
+          <w:szCs w:val="20"/>
+          <w:lang w:val="en-US" w:eastAsia="zh-CN"/>
+        </w:rPr>
+        <w:t xml:space="preserve"> </w:t>
+      </w:r>
+      <w:r>
+        <w:rPr>
+          <w:rFonts w:ascii="Noto Sans" w:hAnsi="Noto Sans" w:cs="等线" w:eastAsia="Noto Sans"/>
+          <w:color w:val="000000"/>
+          <w:sz w:val="20"/>
+          <w:szCs w:val="20"/>
+          <w:lang w:val="en-US" w:eastAsia="zh-CN"/>
+        </w:rPr>
+        <w:t>或者</w:t>
+      </w:r>
+      <w:r>
+        <w:rPr>
+          <w:rFonts w:ascii="Noto Sans" w:hAnsi="Noto Sans" w:cs="等线" w:eastAsia="Noto Sans"/>
+          <w:color w:val="C9211E"/>
+          <w:sz w:val="20"/>
+          <w:szCs w:val="20"/>
+          <w:lang w:val="en-US" w:eastAsia="zh-CN"/>
+        </w:rPr>
+        <w:t xml:space="preserve"> </w:t>
+      </w:r>
+      <w:r>
+        <w:rPr>
+          <w:rFonts w:eastAsia="Noto Sans" w:cs="等线" w:ascii="Noto Sans" w:hAnsi="Noto Sans"/>
+          <w:b/>
+          <w:bCs/>
+          <w:color w:val="000000"/>
+          <w:sz w:val="20"/>
+          <w:szCs w:val="20"/>
+          <w:lang w:val="en-US" w:eastAsia="zh-CN"/>
+        </w:rPr>
+        <w:t>Qwen3-VL-2B-Instruct-GGUF/Qwen3VL-2B-Instruct-Q8_0.gguf</w:t>
+      </w:r>
+      <w:r>
+        <w:rPr>
+          <w:rFonts w:eastAsia="Noto Sans" w:cs="等线" w:ascii="Noto Sans" w:hAnsi="Noto Sans"/>
+          <w:b/>
+          <w:bCs/>
+          <w:color w:val="C9211E"/>
+          <w:sz w:val="20"/>
+          <w:szCs w:val="20"/>
+          <w:lang w:val="en-US" w:eastAsia="zh-CN"/>
+        </w:rPr>
+        <w:t>:mmproj</w:t>
+      </w:r>
+      <w:r>
+        <w:rPr>
+          <w:rFonts w:eastAsia="Noto Sans" w:cs="等线" w:ascii="Noto Sans" w:hAnsi="Noto Sans"/>
+          <w:b/>
+          <w:bCs/>
+          <w:color w:val="000000"/>
+          <w:sz w:val="20"/>
+          <w:szCs w:val="20"/>
+          <w:lang w:val="en-US" w:eastAsia="zh-CN"/>
+        </w:rPr>
+        <w:t>=Qwen3-VL-2B-Instruct-GGUF/mmproj-Qwen3VL-2B-Instruct-F16.gguf</w:t>
+      </w:r>
+      <w:r>
+        <w:rPr>
+          <w:rFonts w:eastAsia="Noto Sans" w:cs="等线" w:ascii="Noto Sans" w:hAnsi="Noto Sans"/>
+          <w:color w:val="000000"/>
+          <w:sz w:val="20"/>
+          <w:szCs w:val="20"/>
+          <w:lang w:val="en-US" w:eastAsia="zh-CN"/>
+        </w:rPr>
+        <w:t xml:space="preserve"> </w:t>
+      </w:r>
+      <w:r>
+        <w:rPr>
+          <w:rFonts w:ascii="Noto Sans" w:hAnsi="Noto Sans" w:cs="等线" w:eastAsia="Noto Sans"/>
+          <w:color w:val="000000"/>
+          <w:sz w:val="20"/>
+          <w:szCs w:val="20"/>
+          <w:lang w:val="en-US" w:eastAsia="zh-CN"/>
+        </w:rPr>
+        <w:t xml:space="preserve">，取决于你想要哪一种图片映射配置文件，是 </w:t>
+      </w:r>
+      <w:r>
+        <w:rPr>
+          <w:rFonts w:eastAsia="Noto Sans" w:cs="等线" w:ascii="Noto Sans" w:hAnsi="Noto Sans"/>
+          <w:color w:val="000000"/>
+          <w:sz w:val="20"/>
+          <w:szCs w:val="20"/>
+          <w:lang w:val="en-US" w:eastAsia="zh-CN"/>
+        </w:rPr>
+        <w:t>mmproj-Qwen3VL-2B-Instruct-Q8_0.gguf</w:t>
+      </w:r>
+      <w:r>
+        <w:rPr>
+          <w:rFonts w:ascii="Noto Sans" w:hAnsi="Noto Sans" w:cs="等线" w:eastAsia="Noto Sans"/>
+          <w:color w:val="000000"/>
+          <w:sz w:val="20"/>
+          <w:szCs w:val="20"/>
+          <w:lang w:val="en-US" w:eastAsia="zh-CN"/>
+        </w:rPr>
+        <w:t xml:space="preserve">还是 </w:t>
+      </w:r>
+      <w:r>
+        <w:rPr>
+          <w:rFonts w:eastAsia="Noto Sans" w:cs="等线" w:ascii="Noto Sans" w:hAnsi="Noto Sans"/>
+          <w:color w:val="000000"/>
+          <w:sz w:val="20"/>
+          <w:szCs w:val="20"/>
+          <w:lang w:val="en-US" w:eastAsia="zh-CN"/>
+        </w:rPr>
+        <w:t>mmproj-Qwen3VL-2B-Instruct-F16.gguf</w:t>
+      </w:r>
+      <w:r>
+        <w:rPr>
+          <w:rFonts w:ascii="Noto Sans" w:hAnsi="Noto Sans" w:cs="等线" w:eastAsia="Noto Sans"/>
+          <w:color w:val="000000"/>
+          <w:sz w:val="20"/>
+          <w:szCs w:val="20"/>
+          <w:lang w:val="en-US" w:eastAsia="zh-CN"/>
+        </w:rPr>
+        <w:t>。请特别注意红色部分的添加后缀名，请不要忘记这添加部分名字。</w:t>
+      </w:r>
+    </w:p>
+    <w:p>
+      <w:pPr>
+        <w:pStyle w:val="Normal"/>
+        <w:widowControl w:val="false"/>
+        <w:spacing w:lineRule="auto" w:line="240"/>
+        <w:ind w:hanging="0" w:left="0"/>
+        <w:jc w:val="both"/>
+        <w:rPr>
+          <w:rFonts w:ascii="Noto Sans" w:hAnsi="Noto Sans" w:eastAsia="Noto Sans"/>
+          <w:sz w:val="20"/>
+          <w:szCs w:val="20"/>
+        </w:rPr>
+      </w:pPr>
+      <w:r>
+        <w:rPr>
+          <w:rFonts w:eastAsia="Noto Sans" w:ascii="Noto Sans" w:hAnsi="Noto Sans"/>
+          <w:sz w:val="20"/>
+          <w:szCs w:val="20"/>
+        </w:rPr>
+      </w:r>
+    </w:p>
+    <w:p>
+      <w:pPr>
+        <w:pStyle w:val="Normal"/>
+        <w:widowControl w:val="false"/>
+        <w:spacing w:lineRule="auto" w:line="240"/>
+        <w:ind w:hanging="0" w:left="0"/>
+        <w:jc w:val="center"/>
+        <w:rPr>
+          <w:rFonts w:ascii="Noto Sans" w:hAnsi="Noto Sans" w:eastAsia="Noto Sans"/>
+          <w:sz w:val="16"/>
+          <w:szCs w:val="16"/>
+        </w:rPr>
+      </w:pPr>
+      <w:r>
+        <w:drawing>
+          <wp:anchor behindDoc="0" distT="0" distB="0" distL="0" distR="0" simplePos="0" locked="0" layoutInCell="0" allowOverlap="1" relativeHeight="5">
+            <wp:simplePos x="0" y="0"/>
+            <wp:positionH relativeFrom="column">
+              <wp:align>center</wp:align>
+            </wp:positionH>
+            <wp:positionV relativeFrom="paragraph">
+              <wp:posOffset>635</wp:posOffset>
+            </wp:positionV>
+            <wp:extent cx="5274310" cy="2037080"/>
+            <wp:effectExtent l="0" t="0" r="0" b="0"/>
+            <wp:wrapSquare wrapText="largest"/>
+            <wp:docPr id="4" name="Image4" descr=""/>
+            <wp:cNvGraphicFramePr>
+              <a:graphicFrameLocks xmlns:a="http://schemas.openxmlformats.org/drawingml/2006/main" noChangeAspect="1"/>
+            </wp:cNvGraphicFramePr>
+            <a:graphic xmlns:a="http://schemas.openxmlformats.org/drawingml/2006/main">
+              <a:graphicData uri="http://schemas.openxmlformats.org/drawingml/2006/picture">
+                <pic:pic xmlns:pic="http://schemas.openxmlformats.org/drawingml/2006/picture">
+                  <pic:nvPicPr>
+                    <pic:cNvPr id="4" name="Image4" descr=""/>
+                    <pic:cNvPicPr>
+                      <a:picLocks noChangeAspect="1" noChangeArrowheads="1"/>
+                    </pic:cNvPicPr>
+                  </pic:nvPicPr>
+                  <pic:blipFill>
+                    <a:blip r:embed="rId5"/>
+                    <a:stretch>
+                      <a:fillRect/>
+                    </a:stretch>
+                  </pic:blipFill>
+                  <pic:spPr bwMode="auto">
+                    <a:xfrm>
+                      <a:off x="0" y="0"/>
+                      <a:ext cx="5274310" cy="2037080"/>
+                    </a:xfrm>
+                    <a:prstGeom prst="rect">
+                      <a:avLst/>
+                    </a:prstGeom>
+                  </pic:spPr>
+                </pic:pic>
+              </a:graphicData>
+            </a:graphic>
+          </wp:anchor>
+        </w:drawing>
+      </w:r>
+      <w:r>
+        <w:rPr>
+          <w:rFonts w:ascii="Noto Sans" w:hAnsi="Noto Sans" w:eastAsia="Noto Sans"/>
+          <w:sz w:val="16"/>
+          <w:szCs w:val="16"/>
+        </w:rPr>
+        <w:t>上图：</w:t>
+      </w:r>
+      <w:r>
+        <w:rPr>
+          <w:rFonts w:eastAsia="Noto Sans" w:ascii="Noto Sans" w:hAnsi="Noto Sans"/>
+          <w:sz w:val="16"/>
+          <w:szCs w:val="16"/>
+        </w:rPr>
+        <w:t>g</w:t>
+      </w:r>
+      <w:r>
+        <w:rPr>
+          <w:rFonts w:eastAsia="Noto Sans" w:ascii="Noto Sans" w:hAnsi="Noto Sans"/>
+          <w:sz w:val="16"/>
+          <w:szCs w:val="16"/>
+        </w:rPr>
+        <w:t xml:space="preserve">) </w:t>
+      </w:r>
+      <w:r>
+        <w:rPr>
+          <w:rFonts w:ascii="Noto Sans" w:hAnsi="Noto Sans" w:eastAsia="Noto Sans"/>
+          <w:sz w:val="16"/>
+          <w:szCs w:val="16"/>
+        </w:rPr>
+        <w:t>步骤中补充的</w:t>
+      </w:r>
+      <w:r>
+        <w:rPr>
+          <w:rFonts w:eastAsia="Noto Sans" w:ascii="Noto Sans" w:hAnsi="Noto Sans"/>
+          <w:sz w:val="16"/>
+          <w:szCs w:val="16"/>
+        </w:rPr>
+        <w:t xml:space="preserve">Qwen3-VL-2B-Instruct-GGUF </w:t>
+      </w:r>
+      <w:r>
+        <w:rPr>
+          <w:rFonts w:ascii="Noto Sans" w:hAnsi="Noto Sans" w:eastAsia="Noto Sans"/>
+          <w:sz w:val="16"/>
+          <w:szCs w:val="16"/>
+        </w:rPr>
+        <w:t>模型文件图。</w:t>
+      </w:r>
+    </w:p>
+    <w:p>
+      <w:pPr>
+        <w:pStyle w:val="Normal"/>
+        <w:widowControl w:val="false"/>
+        <w:spacing w:lineRule="auto" w:line="240"/>
+        <w:ind w:hanging="0" w:left="0"/>
+        <w:jc w:val="both"/>
+        <w:rPr>
+          <w:rFonts w:ascii="Noto Sans" w:hAnsi="Noto Sans" w:eastAsia="Noto Sans"/>
+          <w:sz w:val="20"/>
+          <w:szCs w:val="20"/>
+        </w:rPr>
+      </w:pPr>
+      <w:r>
+        <w:rPr>
+          <w:rFonts w:eastAsia="Noto Sans" w:ascii="Noto Sans" w:hAnsi="Noto Sans"/>
+          <w:sz w:val="20"/>
+          <w:szCs w:val="20"/>
+        </w:rPr>
+      </w:r>
+    </w:p>
+    <w:p>
+      <w:pPr>
+        <w:pStyle w:val="Normal"/>
+        <w:widowControl w:val="false"/>
+        <w:spacing w:lineRule="auto" w:line="240"/>
+        <w:ind w:hanging="0" w:left="0"/>
+        <w:jc w:val="both"/>
+        <w:rPr>
+          <w:rFonts w:ascii="Noto Sans" w:hAnsi="Noto Sans" w:eastAsia="Noto Sans"/>
+          <w:sz w:val="20"/>
+          <w:szCs w:val="20"/>
+        </w:rPr>
+      </w:pPr>
+      <w:r>
+        <w:rPr>
+          <w:rFonts w:eastAsia="Noto Sans" w:ascii="Noto Sans" w:hAnsi="Noto Sans"/>
+          <w:sz w:val="20"/>
+          <w:szCs w:val="20"/>
         </w:rPr>
       </w:r>
     </w:p>

</xml_diff>

<commit_message>
Update the product documentation.
</commit_message>
<xml_diff>
--- a/asset/doc/waterchat_product_introduction_cn.docx
+++ b/asset/doc/waterchat_product_introduction_cn.docx
@@ -350,7 +350,8 @@
         <w:spacing w:lineRule="auto" w:line="240"/>
         <w:ind w:hanging="0" w:left="0"/>
         <w:rPr>
-          <w:rFonts w:ascii="Noto Sans" w:hAnsi="Noto Sans" w:eastAsia="Noto Sans"/>
+          <w:b/>
+          <w:bCs/>
         </w:rPr>
       </w:pPr>
       <w:r>
@@ -363,7 +364,7 @@
           <w:szCs w:val="21"/>
           <w:lang w:val="en-US" w:eastAsia="zh-CN"/>
         </w:rPr>
-        <w:t>三．自行增加</w:t>
+        <w:t>三</w:t>
       </w:r>
       <w:r>
         <w:rPr>
@@ -375,7 +376,7 @@
           <w:szCs w:val="21"/>
           <w:lang w:val="en-US" w:eastAsia="zh-CN"/>
         </w:rPr>
-        <w:t>AI</w:t>
+        <w:t xml:space="preserve">. </w:t>
       </w:r>
       <w:r>
         <w:rPr>
@@ -387,7 +388,731 @@
           <w:szCs w:val="21"/>
           <w:lang w:val="en-US" w:eastAsia="zh-CN"/>
         </w:rPr>
+        <w:t>通过</w:t>
+      </w:r>
+      <w:r>
+        <w:rPr>
+          <w:rFonts w:eastAsia="Noto Sans" w:cs="等线" w:ascii="Noto Sans" w:hAnsi="Noto Sans"/>
+          <w:b/>
+          <w:bCs/>
+          <w:color w:val="C9211E"/>
+          <w:sz w:val="21"/>
+          <w:szCs w:val="21"/>
+          <w:lang w:val="en-US" w:eastAsia="zh-CN"/>
+        </w:rPr>
+        <w:t>UI</w:t>
+      </w:r>
+      <w:r>
+        <w:rPr>
+          <w:rFonts w:ascii="Noto Sans" w:hAnsi="Noto Sans" w:cs="等线" w:eastAsia="Noto Sans"/>
+          <w:b/>
+          <w:bCs/>
+          <w:color w:val="C9211E"/>
+          <w:sz w:val="21"/>
+          <w:szCs w:val="21"/>
+          <w:lang w:val="en-US" w:eastAsia="zh-CN"/>
+        </w:rPr>
+        <w:t>界面新增</w:t>
+      </w:r>
+      <w:r>
+        <w:rPr>
+          <w:rFonts w:eastAsia="Noto Sans" w:cs="等线" w:ascii="Noto Sans" w:hAnsi="Noto Sans"/>
+          <w:b/>
+          <w:bCs/>
+          <w:color w:val="C9211E"/>
+          <w:sz w:val="21"/>
+          <w:szCs w:val="21"/>
+          <w:lang w:val="en-US" w:eastAsia="zh-CN"/>
+        </w:rPr>
+        <w:t>AI</w:t>
+      </w:r>
+      <w:r>
+        <w:rPr>
+          <w:rFonts w:ascii="Noto Sans" w:hAnsi="Noto Sans" w:cs="等线" w:eastAsia="Noto Sans"/>
+          <w:b/>
+          <w:bCs/>
+          <w:color w:val="C9211E"/>
+          <w:sz w:val="21"/>
+          <w:szCs w:val="21"/>
+          <w:lang w:val="en-US" w:eastAsia="zh-CN"/>
+        </w:rPr>
         <w:t>模型</w:t>
+      </w:r>
+    </w:p>
+    <w:p>
+      <w:pPr>
+        <w:pStyle w:val="Normal"/>
+        <w:numPr>
+          <w:ilvl w:val="0"/>
+          <w:numId w:val="0"/>
+        </w:numPr>
+        <w:bidi w:val="0"/>
+        <w:spacing w:lineRule="auto" w:line="240"/>
+        <w:ind w:hanging="0" w:left="0"/>
+        <w:rPr>
+          <w:rFonts w:ascii="Noto Sans" w:hAnsi="Noto Sans" w:eastAsia="Noto Sans"/>
+          <w:b/>
+          <w:bCs/>
+          <w:sz w:val="16"/>
+          <w:szCs w:val="16"/>
+        </w:rPr>
+      </w:pPr>
+      <w:r>
+        <w:rPr>
+          <w:rFonts w:ascii="Noto Sans" w:hAnsi="Noto Sans" w:eastAsia="Noto Sans"/>
+          <w:b/>
+          <w:bCs/>
+          <w:sz w:val="16"/>
+          <w:szCs w:val="16"/>
+        </w:rPr>
+        <w:t xml:space="preserve">注意：只能够支持 </w:t>
+      </w:r>
+      <w:r>
+        <w:rPr>
+          <w:rFonts w:eastAsia="Noto Sans" w:ascii="Noto Sans" w:hAnsi="Noto Sans"/>
+          <w:b/>
+          <w:bCs/>
+          <w:sz w:val="16"/>
+          <w:szCs w:val="16"/>
+        </w:rPr>
+        <w:t>GGUF</w:t>
+      </w:r>
+      <w:r>
+        <w:rPr>
+          <w:rFonts w:ascii="Noto Sans" w:hAnsi="Noto Sans" w:eastAsia="Noto Sans"/>
+          <w:b/>
+          <w:bCs/>
+          <w:sz w:val="16"/>
+          <w:szCs w:val="16"/>
+        </w:rPr>
+        <w:t>类型的</w:t>
+      </w:r>
+      <w:r>
+        <w:rPr>
+          <w:rFonts w:eastAsia="Noto Sans" w:ascii="Noto Sans" w:hAnsi="Noto Sans"/>
+          <w:b/>
+          <w:bCs/>
+          <w:sz w:val="16"/>
+          <w:szCs w:val="16"/>
+        </w:rPr>
+        <w:t>AI</w:t>
+      </w:r>
+      <w:r>
+        <w:rPr>
+          <w:rFonts w:ascii="Noto Sans" w:hAnsi="Noto Sans" w:eastAsia="Noto Sans"/>
+          <w:b/>
+          <w:bCs/>
+          <w:sz w:val="16"/>
+          <w:szCs w:val="16"/>
+        </w:rPr>
+        <w:t>模型。</w:t>
+      </w:r>
+    </w:p>
+    <w:p>
+      <w:pPr>
+        <w:pStyle w:val="Normal"/>
+        <w:numPr>
+          <w:ilvl w:val="0"/>
+          <w:numId w:val="0"/>
+        </w:numPr>
+        <w:bidi w:val="0"/>
+        <w:spacing w:lineRule="auto" w:line="240"/>
+        <w:ind w:hanging="0" w:left="0"/>
+        <w:rPr>
+          <w:rFonts w:eastAsia="Noto Sans"/>
+        </w:rPr>
+      </w:pPr>
+      <w:r>
+        <w:rPr>
+          <w:rFonts w:eastAsia="Noto Sans"/>
+        </w:rPr>
+      </w:r>
+    </w:p>
+    <w:p>
+      <w:pPr>
+        <w:pStyle w:val="BodyText"/>
+        <w:rPr>
+          <w:rFonts w:ascii="Noto Sans" w:hAnsi="Noto Sans" w:eastAsia="Noto Sans"/>
+        </w:rPr>
+      </w:pPr>
+      <w:r>
+        <w:rPr>
+          <w:rFonts w:eastAsia="Noto Sans" w:ascii="Noto Sans" w:hAnsi="Noto Sans"/>
+        </w:rPr>
+        <w:t xml:space="preserve">1. </w:t>
+      </w:r>
+      <w:r>
+        <w:rPr>
+          <w:rFonts w:ascii="Noto Sans" w:hAnsi="Noto Sans" w:eastAsia="Noto Sans"/>
+        </w:rPr>
+        <w:t>假设你需要添加的</w:t>
+      </w:r>
+      <w:r>
+        <w:rPr>
+          <w:rFonts w:eastAsia="Noto Sans" w:ascii="Noto Sans" w:hAnsi="Noto Sans"/>
+        </w:rPr>
+        <w:t>AI</w:t>
+      </w:r>
+      <w:r>
+        <w:rPr>
+          <w:rFonts w:ascii="Noto Sans" w:hAnsi="Noto Sans" w:eastAsia="Noto Sans"/>
+        </w:rPr>
+        <w:t>模型为</w:t>
+      </w:r>
+      <w:r>
+        <w:rPr>
+          <w:rFonts w:eastAsia="Noto Sans" w:ascii="Noto Sans" w:hAnsi="Noto Sans"/>
+        </w:rPr>
+        <w:t>Qwen3.5-2B-GGUF</w:t>
+      </w:r>
+      <w:r>
+        <w:rPr>
+          <w:rFonts w:ascii="Noto Sans" w:hAnsi="Noto Sans" w:eastAsia="Noto Sans"/>
+        </w:rPr>
+        <w:t>，那么请在的电脑本地新建文件夹并命名为：</w:t>
+      </w:r>
+      <w:r>
+        <w:rPr>
+          <w:rFonts w:eastAsia="Noto Sans" w:ascii="Noto Sans" w:hAnsi="Noto Sans"/>
+        </w:rPr>
+        <w:t>Qwen3.5-2B-GGUF</w:t>
+      </w:r>
+      <w:r>
+        <w:rPr>
+          <w:rFonts w:ascii="Noto Sans" w:hAnsi="Noto Sans" w:eastAsia="Noto Sans"/>
+        </w:rPr>
+        <w:t>。然后到</w:t>
+      </w:r>
+      <w:r>
+        <w:rPr>
+          <w:rFonts w:eastAsia="Noto Sans" w:ascii="Noto Sans" w:hAnsi="Noto Sans"/>
+        </w:rPr>
+        <w:t>huggingface</w:t>
+      </w:r>
+      <w:r>
+        <w:rPr>
+          <w:rFonts w:ascii="Noto Sans" w:hAnsi="Noto Sans" w:eastAsia="Noto Sans"/>
+        </w:rPr>
+        <w:t xml:space="preserve">等网站将 </w:t>
+      </w:r>
+      <w:r>
+        <w:rPr>
+          <w:rFonts w:eastAsia="Noto Sans" w:ascii="Noto Sans" w:hAnsi="Noto Sans"/>
+        </w:rPr>
+        <w:t>Qwen3.5-2B-GGUF</w:t>
+      </w:r>
+      <w:r>
+        <w:rPr>
+          <w:rFonts w:ascii="Noto Sans" w:hAnsi="Noto Sans" w:eastAsia="Noto Sans"/>
+        </w:rPr>
+        <w:t>的全部模型文件下载并且放到刚刚新建的文件夹当中。</w:t>
+      </w:r>
+    </w:p>
+    <w:p>
+      <w:pPr>
+        <w:pStyle w:val="BodyText"/>
+        <w:rPr>
+          <w:rFonts w:ascii="Noto Sans" w:hAnsi="Noto Sans" w:eastAsia="Noto Sans"/>
+        </w:rPr>
+      </w:pPr>
+      <w:r>
+        <w:rPr>
+          <w:rFonts w:eastAsia="Noto Sans" w:ascii="Noto Sans" w:hAnsi="Noto Sans"/>
+        </w:rPr>
+        <w:t xml:space="preserve">2. </w:t>
+      </w:r>
+      <w:r>
+        <w:rPr>
+          <w:rFonts w:ascii="Noto Sans" w:hAnsi="Noto Sans" w:eastAsia="Noto Sans"/>
+        </w:rPr>
+        <w:t>打开应用，来到帮助页面。点击“增加</w:t>
+      </w:r>
+      <w:r>
+        <w:rPr>
+          <w:rFonts w:eastAsia="Noto Sans" w:ascii="Noto Sans" w:hAnsi="Noto Sans"/>
+        </w:rPr>
+        <w:t>AI</w:t>
+      </w:r>
+      <w:r>
+        <w:rPr>
+          <w:rFonts w:ascii="Noto Sans" w:hAnsi="Noto Sans" w:eastAsia="Noto Sans"/>
+        </w:rPr>
+        <w:t>模型”按钮。</w:t>
+      </w:r>
+    </w:p>
+    <w:p>
+      <w:pPr>
+        <w:pStyle w:val="BodyText"/>
+        <w:rPr>
+          <w:rFonts w:ascii="Noto Sans" w:hAnsi="Noto Sans" w:eastAsia="Noto Sans"/>
+        </w:rPr>
+      </w:pPr>
+      <w:r>
+        <w:drawing>
+          <wp:anchor behindDoc="0" distT="0" distB="0" distL="0" distR="0" simplePos="0" locked="0" layoutInCell="0" allowOverlap="1" relativeHeight="6">
+            <wp:simplePos x="0" y="0"/>
+            <wp:positionH relativeFrom="column">
+              <wp:align>center</wp:align>
+            </wp:positionH>
+            <wp:positionV relativeFrom="paragraph">
+              <wp:posOffset>635</wp:posOffset>
+            </wp:positionV>
+            <wp:extent cx="3393440" cy="2471420"/>
+            <wp:effectExtent l="0" t="0" r="0" b="0"/>
+            <wp:wrapTopAndBottom/>
+            <wp:docPr id="1" name="Image5" descr=""/>
+            <wp:cNvGraphicFramePr>
+              <a:graphicFrameLocks xmlns:a="http://schemas.openxmlformats.org/drawingml/2006/main" noChangeAspect="1"/>
+            </wp:cNvGraphicFramePr>
+            <a:graphic xmlns:a="http://schemas.openxmlformats.org/drawingml/2006/main">
+              <a:graphicData uri="http://schemas.openxmlformats.org/drawingml/2006/picture">
+                <pic:pic xmlns:pic="http://schemas.openxmlformats.org/drawingml/2006/picture">
+                  <pic:nvPicPr>
+                    <pic:cNvPr id="1" name="Image5" descr=""/>
+                    <pic:cNvPicPr>
+                      <a:picLocks noChangeAspect="1" noChangeArrowheads="1"/>
+                    </pic:cNvPicPr>
+                  </pic:nvPicPr>
+                  <pic:blipFill>
+                    <a:blip r:embed="rId2"/>
+                    <a:stretch>
+                      <a:fillRect/>
+                    </a:stretch>
+                  </pic:blipFill>
+                  <pic:spPr bwMode="auto">
+                    <a:xfrm>
+                      <a:off x="0" y="0"/>
+                      <a:ext cx="3393440" cy="2471420"/>
+                    </a:xfrm>
+                    <a:prstGeom prst="rect">
+                      <a:avLst/>
+                    </a:prstGeom>
+                  </pic:spPr>
+                </pic:pic>
+              </a:graphicData>
+            </a:graphic>
+          </wp:anchor>
+        </w:drawing>
+      </w:r>
+      <w:r>
+        <w:rPr>
+          <w:rFonts w:eastAsia="Noto Sans" w:ascii="Noto Sans" w:hAnsi="Noto Sans"/>
+        </w:rPr>
+        <w:t xml:space="preserve">3. </w:t>
+      </w:r>
+      <w:r>
+        <w:rPr>
+          <w:rFonts w:ascii="Noto Sans" w:hAnsi="Noto Sans" w:eastAsia="Noto Sans"/>
+        </w:rPr>
+        <w:t>应用打开弹窗。点击“选择主文件（</w:t>
+      </w:r>
+      <w:r>
+        <w:rPr>
+          <w:rFonts w:eastAsia="Noto Sans" w:ascii="Noto Sans" w:hAnsi="Noto Sans"/>
+        </w:rPr>
+        <w:t>GGUF</w:t>
+      </w:r>
+      <w:r>
+        <w:rPr>
+          <w:rFonts w:ascii="Noto Sans" w:hAnsi="Noto Sans" w:eastAsia="Noto Sans"/>
+        </w:rPr>
+        <w:t>）”按钮。</w:t>
+      </w:r>
+    </w:p>
+    <w:p>
+      <w:pPr>
+        <w:pStyle w:val="BodyText"/>
+        <w:rPr/>
+      </w:pPr>
+      <w:r>
+        <w:rPr/>
+        <w:drawing>
+          <wp:anchor behindDoc="0" distT="0" distB="0" distL="0" distR="0" simplePos="0" locked="0" layoutInCell="0" allowOverlap="1" relativeHeight="7">
+            <wp:simplePos x="0" y="0"/>
+            <wp:positionH relativeFrom="column">
+              <wp:align>center</wp:align>
+            </wp:positionH>
+            <wp:positionV relativeFrom="paragraph">
+              <wp:posOffset>635</wp:posOffset>
+            </wp:positionV>
+            <wp:extent cx="3561715" cy="2545715"/>
+            <wp:effectExtent l="0" t="0" r="0" b="0"/>
+            <wp:wrapTopAndBottom/>
+            <wp:docPr id="2" name="Image6" descr=""/>
+            <wp:cNvGraphicFramePr>
+              <a:graphicFrameLocks xmlns:a="http://schemas.openxmlformats.org/drawingml/2006/main" noChangeAspect="1"/>
+            </wp:cNvGraphicFramePr>
+            <a:graphic xmlns:a="http://schemas.openxmlformats.org/drawingml/2006/main">
+              <a:graphicData uri="http://schemas.openxmlformats.org/drawingml/2006/picture">
+                <pic:pic xmlns:pic="http://schemas.openxmlformats.org/drawingml/2006/picture">
+                  <pic:nvPicPr>
+                    <pic:cNvPr id="2" name="Image6" descr=""/>
+                    <pic:cNvPicPr>
+                      <a:picLocks noChangeAspect="1" noChangeArrowheads="1"/>
+                    </pic:cNvPicPr>
+                  </pic:nvPicPr>
+                  <pic:blipFill>
+                    <a:blip r:embed="rId3"/>
+                    <a:stretch>
+                      <a:fillRect/>
+                    </a:stretch>
+                  </pic:blipFill>
+                  <pic:spPr bwMode="auto">
+                    <a:xfrm>
+                      <a:off x="0" y="0"/>
+                      <a:ext cx="3561715" cy="2545715"/>
+                    </a:xfrm>
+                    <a:prstGeom prst="rect">
+                      <a:avLst/>
+                    </a:prstGeom>
+                  </pic:spPr>
+                </pic:pic>
+              </a:graphicData>
+            </a:graphic>
+          </wp:anchor>
+        </w:drawing>
+      </w:r>
+    </w:p>
+    <w:p>
+      <w:pPr>
+        <w:pStyle w:val="BodyText"/>
+        <w:rPr>
+          <w:rFonts w:ascii="Noto Sans" w:hAnsi="Noto Sans" w:eastAsia="Noto Sans"/>
+        </w:rPr>
+      </w:pPr>
+      <w:r>
+        <w:rPr>
+          <w:rFonts w:eastAsia="Noto Sans" w:ascii="Noto Sans" w:hAnsi="Noto Sans"/>
+        </w:rPr>
+        <w:t xml:space="preserve">4. </w:t>
+      </w:r>
+      <w:r>
+        <w:rPr>
+          <w:rFonts w:ascii="Noto Sans" w:hAnsi="Noto Sans" w:eastAsia="Noto Sans"/>
+        </w:rPr>
+        <w:t>选择你的</w:t>
+      </w:r>
+      <w:r>
+        <w:rPr>
+          <w:rFonts w:eastAsia="Noto Sans" w:ascii="Noto Sans" w:hAnsi="Noto Sans"/>
+        </w:rPr>
+        <w:t>AI</w:t>
+      </w:r>
+      <w:r>
+        <w:rPr>
+          <w:rFonts w:ascii="Noto Sans" w:hAnsi="Noto Sans" w:eastAsia="Noto Sans"/>
+        </w:rPr>
+        <w:t>模型的</w:t>
+      </w:r>
+      <w:r>
+        <w:rPr>
+          <w:rFonts w:eastAsia="Noto Sans" w:ascii="Noto Sans" w:hAnsi="Noto Sans"/>
+        </w:rPr>
+        <w:t xml:space="preserve">XXXX.gguf </w:t>
+      </w:r>
+      <w:r>
+        <w:rPr>
+          <w:rFonts w:ascii="Noto Sans" w:hAnsi="Noto Sans" w:eastAsia="Noto Sans"/>
+        </w:rPr>
+        <w:t>主文件。</w:t>
+      </w:r>
+    </w:p>
+    <w:p>
+      <w:pPr>
+        <w:pStyle w:val="BodyText"/>
+        <w:rPr/>
+      </w:pPr>
+      <w:r>
+        <w:rPr/>
+        <w:drawing>
+          <wp:anchor behindDoc="0" distT="0" distB="0" distL="0" distR="0" simplePos="0" locked="0" layoutInCell="0" allowOverlap="1" relativeHeight="8">
+            <wp:simplePos x="0" y="0"/>
+            <wp:positionH relativeFrom="column">
+              <wp:align>center</wp:align>
+            </wp:positionH>
+            <wp:positionV relativeFrom="paragraph">
+              <wp:posOffset>635</wp:posOffset>
+            </wp:positionV>
+            <wp:extent cx="3635375" cy="2949575"/>
+            <wp:effectExtent l="0" t="0" r="0" b="0"/>
+            <wp:wrapTopAndBottom/>
+            <wp:docPr id="3" name="Image7" descr=""/>
+            <wp:cNvGraphicFramePr>
+              <a:graphicFrameLocks xmlns:a="http://schemas.openxmlformats.org/drawingml/2006/main" noChangeAspect="1"/>
+            </wp:cNvGraphicFramePr>
+            <a:graphic xmlns:a="http://schemas.openxmlformats.org/drawingml/2006/main">
+              <a:graphicData uri="http://schemas.openxmlformats.org/drawingml/2006/picture">
+                <pic:pic xmlns:pic="http://schemas.openxmlformats.org/drawingml/2006/picture">
+                  <pic:nvPicPr>
+                    <pic:cNvPr id="3" name="Image7" descr=""/>
+                    <pic:cNvPicPr>
+                      <a:picLocks noChangeAspect="1" noChangeArrowheads="1"/>
+                    </pic:cNvPicPr>
+                  </pic:nvPicPr>
+                  <pic:blipFill>
+                    <a:blip r:embed="rId4"/>
+                    <a:stretch>
+                      <a:fillRect/>
+                    </a:stretch>
+                  </pic:blipFill>
+                  <pic:spPr bwMode="auto">
+                    <a:xfrm>
+                      <a:off x="0" y="0"/>
+                      <a:ext cx="3635375" cy="2949575"/>
+                    </a:xfrm>
+                    <a:prstGeom prst="rect">
+                      <a:avLst/>
+                    </a:prstGeom>
+                  </pic:spPr>
+                </pic:pic>
+              </a:graphicData>
+            </a:graphic>
+          </wp:anchor>
+        </w:drawing>
+      </w:r>
+    </w:p>
+    <w:p>
+      <w:pPr>
+        <w:pStyle w:val="BodyText"/>
+        <w:rPr>
+          <w:rFonts w:ascii="Noto Sans" w:hAnsi="Noto Sans" w:eastAsia="Noto Sans"/>
+        </w:rPr>
+      </w:pPr>
+      <w:r>
+        <w:rPr>
+          <w:rFonts w:eastAsia="Noto Sans" w:ascii="Noto Sans" w:hAnsi="Noto Sans"/>
+        </w:rPr>
+        <w:t>5.</w:t>
+      </w:r>
+      <w:r>
+        <w:rPr>
+          <w:rFonts w:ascii="Noto Sans" w:hAnsi="Noto Sans" w:eastAsia="Noto Sans"/>
+        </w:rPr>
+        <w:t>确认信息无误之后，点击“确认增加”按钮。</w:t>
+      </w:r>
+    </w:p>
+    <w:p>
+      <w:pPr>
+        <w:pStyle w:val="BodyText"/>
+        <w:rPr/>
+      </w:pPr>
+      <w:r>
+        <w:rPr/>
+        <w:drawing>
+          <wp:anchor behindDoc="0" distT="0" distB="0" distL="0" distR="0" simplePos="0" locked="0" layoutInCell="0" allowOverlap="1" relativeHeight="10">
+            <wp:simplePos x="0" y="0"/>
+            <wp:positionH relativeFrom="column">
+              <wp:align>center</wp:align>
+            </wp:positionH>
+            <wp:positionV relativeFrom="paragraph">
+              <wp:posOffset>635</wp:posOffset>
+            </wp:positionV>
+            <wp:extent cx="4351655" cy="3168650"/>
+            <wp:effectExtent l="0" t="0" r="0" b="0"/>
+            <wp:wrapTopAndBottom/>
+            <wp:docPr id="4" name="Image8" descr=""/>
+            <wp:cNvGraphicFramePr>
+              <a:graphicFrameLocks xmlns:a="http://schemas.openxmlformats.org/drawingml/2006/main" noChangeAspect="1"/>
+            </wp:cNvGraphicFramePr>
+            <a:graphic xmlns:a="http://schemas.openxmlformats.org/drawingml/2006/main">
+              <a:graphicData uri="http://schemas.openxmlformats.org/drawingml/2006/picture">
+                <pic:pic xmlns:pic="http://schemas.openxmlformats.org/drawingml/2006/picture">
+                  <pic:nvPicPr>
+                    <pic:cNvPr id="4" name="Image8" descr=""/>
+                    <pic:cNvPicPr>
+                      <a:picLocks noChangeAspect="1" noChangeArrowheads="1"/>
+                    </pic:cNvPicPr>
+                  </pic:nvPicPr>
+                  <pic:blipFill>
+                    <a:blip r:embed="rId5"/>
+                    <a:stretch>
+                      <a:fillRect/>
+                    </a:stretch>
+                  </pic:blipFill>
+                  <pic:spPr bwMode="auto">
+                    <a:xfrm>
+                      <a:off x="0" y="0"/>
+                      <a:ext cx="4351655" cy="3168650"/>
+                    </a:xfrm>
+                    <a:prstGeom prst="rect">
+                      <a:avLst/>
+                    </a:prstGeom>
+                  </pic:spPr>
+                </pic:pic>
+              </a:graphicData>
+            </a:graphic>
+          </wp:anchor>
+        </w:drawing>
+      </w:r>
+    </w:p>
+    <w:p>
+      <w:pPr>
+        <w:pStyle w:val="BodyText"/>
+        <w:rPr/>
+      </w:pPr>
+      <w:r>
+        <w:rPr/>
+      </w:r>
+    </w:p>
+    <w:p>
+      <w:pPr>
+        <w:pStyle w:val="BodyText"/>
+        <w:rPr>
+          <w:rFonts w:ascii="Noto Sans" w:hAnsi="Noto Sans" w:eastAsia="Noto Sans"/>
+        </w:rPr>
+      </w:pPr>
+      <w:r>
+        <w:rPr>
+          <w:rFonts w:eastAsia="Noto Sans" w:ascii="Noto Sans" w:hAnsi="Noto Sans"/>
+        </w:rPr>
+        <w:t xml:space="preserve">6. </w:t>
+      </w:r>
+      <w:r>
+        <w:rPr>
+          <w:rFonts w:ascii="Noto Sans" w:hAnsi="Noto Sans" w:eastAsia="Noto Sans"/>
+        </w:rPr>
+        <w:t>添加信息弹窗弹出，添加</w:t>
+      </w:r>
+      <w:r>
+        <w:rPr>
+          <w:rFonts w:eastAsia="Noto Sans" w:ascii="Noto Sans" w:hAnsi="Noto Sans"/>
+        </w:rPr>
+        <w:t>AI</w:t>
+      </w:r>
+      <w:r>
+        <w:rPr>
+          <w:rFonts w:ascii="Noto Sans" w:hAnsi="Noto Sans" w:eastAsia="Noto Sans"/>
+        </w:rPr>
+        <w:t>模型完毕。请退出应用再次打开即可。</w:t>
+      </w:r>
+    </w:p>
+    <w:p>
+      <w:pPr>
+        <w:pStyle w:val="BodyText"/>
+        <w:rPr/>
+      </w:pPr>
+      <w:r>
+        <w:rPr/>
+        <w:drawing>
+          <wp:anchor behindDoc="0" distT="0" distB="0" distL="0" distR="0" simplePos="0" locked="0" layoutInCell="0" allowOverlap="1" relativeHeight="9">
+            <wp:simplePos x="0" y="0"/>
+            <wp:positionH relativeFrom="column">
+              <wp:align>center</wp:align>
+            </wp:positionH>
+            <wp:positionV relativeFrom="paragraph">
+              <wp:posOffset>635</wp:posOffset>
+            </wp:positionV>
+            <wp:extent cx="3964940" cy="2887345"/>
+            <wp:effectExtent l="0" t="0" r="0" b="0"/>
+            <wp:wrapTopAndBottom/>
+            <wp:docPr id="5" name="Image9" descr=""/>
+            <wp:cNvGraphicFramePr>
+              <a:graphicFrameLocks xmlns:a="http://schemas.openxmlformats.org/drawingml/2006/main" noChangeAspect="1"/>
+            </wp:cNvGraphicFramePr>
+            <a:graphic xmlns:a="http://schemas.openxmlformats.org/drawingml/2006/main">
+              <a:graphicData uri="http://schemas.openxmlformats.org/drawingml/2006/picture">
+                <pic:pic xmlns:pic="http://schemas.openxmlformats.org/drawingml/2006/picture">
+                  <pic:nvPicPr>
+                    <pic:cNvPr id="5" name="Image9" descr=""/>
+                    <pic:cNvPicPr>
+                      <a:picLocks noChangeAspect="1" noChangeArrowheads="1"/>
+                    </pic:cNvPicPr>
+                  </pic:nvPicPr>
+                  <pic:blipFill>
+                    <a:blip r:embed="rId6"/>
+                    <a:stretch>
+                      <a:fillRect/>
+                    </a:stretch>
+                  </pic:blipFill>
+                  <pic:spPr bwMode="auto">
+                    <a:xfrm>
+                      <a:off x="0" y="0"/>
+                      <a:ext cx="3964940" cy="2887345"/>
+                    </a:xfrm>
+                    <a:prstGeom prst="rect">
+                      <a:avLst/>
+                    </a:prstGeom>
+                  </pic:spPr>
+                </pic:pic>
+              </a:graphicData>
+            </a:graphic>
+          </wp:anchor>
+        </w:drawing>
+      </w:r>
+    </w:p>
+    <w:p>
+      <w:pPr>
+        <w:pStyle w:val="Heading2"/>
+        <w:numPr>
+          <w:ilvl w:val="0"/>
+          <w:numId w:val="0"/>
+        </w:numPr>
+        <w:bidi w:val="0"/>
+        <w:spacing w:lineRule="auto" w:line="240"/>
+        <w:ind w:hanging="0" w:left="0"/>
+        <w:rPr>
+          <w:rFonts w:ascii="Noto Sans" w:hAnsi="Noto Sans" w:eastAsia="Noto Sans"/>
+        </w:rPr>
+      </w:pPr>
+      <w:r>
+        <w:rPr>
+          <w:rFonts w:ascii="Noto Sans" w:hAnsi="Noto Sans" w:cs="等线" w:eastAsia="Noto Sans"/>
+          <w:b/>
+          <w:bCs/>
+          <w:color w:val="C9211E"/>
+          <w:sz w:val="21"/>
+          <w:szCs w:val="21"/>
+          <w:lang w:val="en-US" w:eastAsia="zh-CN"/>
+        </w:rPr>
+        <w:t>四</w:t>
+      </w:r>
+      <w:r>
+        <w:rPr>
+          <w:rFonts w:eastAsia="Noto Sans" w:cs="等线" w:ascii="Noto Sans" w:hAnsi="Noto Sans"/>
+          <w:b/>
+          <w:bCs/>
+          <w:color w:val="C9211E"/>
+          <w:sz w:val="21"/>
+          <w:szCs w:val="21"/>
+          <w:lang w:val="en-US" w:eastAsia="zh-CN"/>
+        </w:rPr>
+        <w:t xml:space="preserve">. </w:t>
+      </w:r>
+      <w:r>
+        <w:rPr>
+          <w:rFonts w:ascii="Noto Sans" w:hAnsi="Noto Sans" w:cs="等线" w:eastAsia="Noto Sans"/>
+          <w:b/>
+          <w:bCs/>
+          <w:color w:val="C9211E"/>
+          <w:sz w:val="21"/>
+          <w:szCs w:val="21"/>
+          <w:lang w:val="en-US" w:eastAsia="zh-CN"/>
+        </w:rPr>
+        <w:t>自行增加</w:t>
+      </w:r>
+      <w:r>
+        <w:rPr>
+          <w:rFonts w:eastAsia="Noto Sans" w:cs="等线" w:ascii="Noto Sans" w:hAnsi="Noto Sans"/>
+          <w:b/>
+          <w:bCs/>
+          <w:color w:val="C9211E"/>
+          <w:sz w:val="21"/>
+          <w:szCs w:val="21"/>
+          <w:lang w:val="en-US" w:eastAsia="zh-CN"/>
+        </w:rPr>
+        <w:t>AI</w:t>
+      </w:r>
+      <w:r>
+        <w:rPr>
+          <w:rFonts w:ascii="Noto Sans" w:hAnsi="Noto Sans" w:cs="等线" w:eastAsia="Noto Sans"/>
+          <w:b/>
+          <w:bCs/>
+          <w:color w:val="C9211E"/>
+          <w:sz w:val="21"/>
+          <w:szCs w:val="21"/>
+          <w:lang w:val="en-US" w:eastAsia="zh-CN"/>
+        </w:rPr>
+        <w:t>模型（手动）</w:t>
       </w:r>
     </w:p>
     <w:p>
@@ -771,7 +1496,7 @@
             <wp:extent cx="5274310" cy="2670810"/>
             <wp:effectExtent l="0" t="0" r="0" b="0"/>
             <wp:wrapSquare wrapText="bothSides"/>
-            <wp:docPr id="1" name="Image1" descr=""/>
+            <wp:docPr id="6" name="Image1" descr=""/>
             <wp:cNvGraphicFramePr>
               <a:graphicFrameLocks xmlns:a="http://schemas.openxmlformats.org/drawingml/2006/main" noChangeAspect="1"/>
             </wp:cNvGraphicFramePr>
@@ -779,13 +1504,13 @@
               <a:graphicData uri="http://schemas.openxmlformats.org/drawingml/2006/picture">
                 <pic:pic xmlns:pic="http://schemas.openxmlformats.org/drawingml/2006/picture">
                   <pic:nvPicPr>
-                    <pic:cNvPr id="1" name="Image1" descr=""/>
+                    <pic:cNvPr id="6" name="Image1" descr=""/>
                     <pic:cNvPicPr>
                       <a:picLocks noChangeAspect="1" noChangeArrowheads="1"/>
                     </pic:cNvPicPr>
                   </pic:nvPicPr>
                   <pic:blipFill>
-                    <a:blip r:embed="rId2"/>
+                    <a:blip r:embed="rId7"/>
                     <a:stretch>
                       <a:fillRect/>
                     </a:stretch>
@@ -877,7 +1602,7 @@
             <wp:extent cx="5274310" cy="3913505"/>
             <wp:effectExtent l="0" t="0" r="0" b="0"/>
             <wp:wrapSquare wrapText="largest"/>
-            <wp:docPr id="2" name="Image3" descr=""/>
+            <wp:docPr id="7" name="Image3" descr=""/>
             <wp:cNvGraphicFramePr>
               <a:graphicFrameLocks xmlns:a="http://schemas.openxmlformats.org/drawingml/2006/main" noChangeAspect="1"/>
             </wp:cNvGraphicFramePr>
@@ -885,13 +1610,13 @@
               <a:graphicData uri="http://schemas.openxmlformats.org/drawingml/2006/picture">
                 <pic:pic xmlns:pic="http://schemas.openxmlformats.org/drawingml/2006/picture">
                   <pic:nvPicPr>
-                    <pic:cNvPr id="2" name="Image3" descr=""/>
+                    <pic:cNvPr id="7" name="Image3" descr=""/>
                     <pic:cNvPicPr>
                       <a:picLocks noChangeAspect="1" noChangeArrowheads="1"/>
                     </pic:cNvPicPr>
                   </pic:nvPicPr>
                   <pic:blipFill>
-                    <a:blip r:embed="rId3"/>
+                    <a:blip r:embed="rId8"/>
                     <a:stretch>
                       <a:fillRect/>
                     </a:stretch>
@@ -1160,7 +1885,7 @@
             <wp:extent cx="5274310" cy="2471420"/>
             <wp:effectExtent l="0" t="0" r="0" b="0"/>
             <wp:wrapSquare wrapText="largest"/>
-            <wp:docPr id="3" name="Image2" descr=""/>
+            <wp:docPr id="8" name="Image2" descr=""/>
             <wp:cNvGraphicFramePr>
               <a:graphicFrameLocks xmlns:a="http://schemas.openxmlformats.org/drawingml/2006/main" noChangeAspect="1"/>
             </wp:cNvGraphicFramePr>
@@ -1168,13 +1893,13 @@
               <a:graphicData uri="http://schemas.openxmlformats.org/drawingml/2006/picture">
                 <pic:pic xmlns:pic="http://schemas.openxmlformats.org/drawingml/2006/picture">
                   <pic:nvPicPr>
-                    <pic:cNvPr id="3" name="Image2" descr=""/>
+                    <pic:cNvPr id="8" name="Image2" descr=""/>
                     <pic:cNvPicPr>
                       <a:picLocks noChangeAspect="1" noChangeArrowheads="1"/>
                     </pic:cNvPicPr>
                   </pic:nvPicPr>
                   <pic:blipFill>
-                    <a:blip r:embed="rId4"/>
+                    <a:blip r:embed="rId9"/>
                     <a:stretch>
                       <a:fillRect/>
                     </a:stretch>
@@ -2096,17 +2821,7 @@
           <w:sz w:val="20"/>
           <w:szCs w:val="20"/>
         </w:rPr>
-        <w:t>mmproj-XXXXXX.</w:t>
-      </w:r>
-      <w:r>
-        <w:rPr>
-          <w:rFonts w:eastAsia="Noto Sans" w:ascii="Noto Sans" w:hAnsi="Noto Sans"/>
-          <w:b/>
-          <w:bCs/>
-          <w:sz w:val="20"/>
-          <w:szCs w:val="20"/>
-        </w:rPr>
-        <w:t>gguf</w:t>
+        <w:t>mmproj-XXXXXX.gguf</w:t>
       </w:r>
       <w:r>
         <w:rPr>
@@ -2253,15 +2968,7 @@
           <w:sz w:val="20"/>
           <w:szCs w:val="20"/>
         </w:rPr>
-        <w:t>a</w:t>
-      </w:r>
-      <w:r>
-        <w:rPr>
-          <w:rFonts w:eastAsia="Noto Sans" w:ascii="Noto Sans" w:hAnsi="Noto Sans"/>
-          <w:sz w:val="20"/>
-          <w:szCs w:val="20"/>
-        </w:rPr>
-        <w:t xml:space="preserve">) → f) </w:t>
+        <w:t xml:space="preserve">a) → f) </w:t>
       </w:r>
       <w:r>
         <w:rPr>
@@ -2562,7 +3269,7 @@
             <wp:extent cx="5274310" cy="2037080"/>
             <wp:effectExtent l="0" t="0" r="0" b="0"/>
             <wp:wrapSquare wrapText="largest"/>
-            <wp:docPr id="4" name="Image4" descr=""/>
+            <wp:docPr id="9" name="Image4" descr=""/>
             <wp:cNvGraphicFramePr>
               <a:graphicFrameLocks xmlns:a="http://schemas.openxmlformats.org/drawingml/2006/main" noChangeAspect="1"/>
             </wp:cNvGraphicFramePr>
@@ -2570,13 +3277,13 @@
               <a:graphicData uri="http://schemas.openxmlformats.org/drawingml/2006/picture">
                 <pic:pic xmlns:pic="http://schemas.openxmlformats.org/drawingml/2006/picture">
                   <pic:nvPicPr>
-                    <pic:cNvPr id="4" name="Image4" descr=""/>
+                    <pic:cNvPr id="9" name="Image4" descr=""/>
                     <pic:cNvPicPr>
                       <a:picLocks noChangeAspect="1" noChangeArrowheads="1"/>
                     </pic:cNvPicPr>
                   </pic:nvPicPr>
                   <pic:blipFill>
-                    <a:blip r:embed="rId5"/>
+                    <a:blip r:embed="rId10"/>
                     <a:stretch>
                       <a:fillRect/>
                     </a:stretch>
@@ -2610,15 +3317,7 @@
           <w:sz w:val="16"/>
           <w:szCs w:val="16"/>
         </w:rPr>
-        <w:t>g</w:t>
-      </w:r>
-      <w:r>
-        <w:rPr>
-          <w:rFonts w:eastAsia="Noto Sans" w:ascii="Noto Sans" w:hAnsi="Noto Sans"/>
-          <w:sz w:val="16"/>
-          <w:szCs w:val="16"/>
-        </w:rPr>
-        <w:t xml:space="preserve">) </w:t>
+        <w:t xml:space="preserve">g) </w:t>
       </w:r>
       <w:r>
         <w:rPr>
@@ -2835,7 +3534,7 @@
           <w:szCs w:val="21"/>
           <w:lang w:val="en-US" w:eastAsia="zh-CN"/>
         </w:rPr>
-        <w:t>四．问题解答</w:t>
+        <w:t>五．问题解答</w:t>
       </w:r>
     </w:p>
     <w:p>

</xml_diff>